<commit_message>
Data Modelling: Creating Dim_Patient - Hetal
</commit_message>
<xml_diff>
--- a/2_Documented_modelling.docx
+++ b/2_Documented_modelling.docx
@@ -72,25 +72,286 @@
           <w:bCs/>
           <w:lang w:val="en-US"/>
         </w:rPr>
-        <w:t>Fact Table Creation (</w:t>
-      </w:r>
-      <w:proofErr w:type="spellStart"/>
+        <w:t>Fact Table Creation (Fact_Encounter):</w:t>
+      </w:r>
+    </w:p>
+    <w:p>
+      <w:pPr>
+        <w:rPr>
+          <w:lang w:val="en-US"/>
+        </w:rPr>
+      </w:pPr>
+      <w:r>
+        <w:rPr>
+          <w:lang w:val="en-US"/>
+        </w:rPr>
+        <w:t>‘</w:t>
+      </w:r>
       <w:r>
         <w:rPr>
           <w:b/>
           <w:bCs/>
           <w:lang w:val="en-US"/>
         </w:rPr>
-        <w:t>Fact_Encounter</w:t>
-      </w:r>
-      <w:proofErr w:type="spellEnd"/>
-      <w:r>
-        <w:rPr>
-          <w:b/>
-          <w:bCs/>
-          <w:lang w:val="en-US"/>
-        </w:rPr>
-        <w:t>):</w:t>
+        <w:t xml:space="preserve">Fact_Encounter’ columns: </w:t>
+      </w:r>
+      <w:r>
+        <w:rPr>
+          <w:lang w:val="en-US"/>
+        </w:rPr>
+        <w:t>‘</w:t>
+      </w:r>
+      <w:r>
+        <w:rPr>
+          <w:i/>
+          <w:iCs/>
+          <w:lang w:val="en-US"/>
+        </w:rPr>
+        <w:t>encounter_id</w:t>
+      </w:r>
+      <w:r>
+        <w:rPr>
+          <w:i/>
+          <w:iCs/>
+          <w:lang w:val="en-US"/>
+        </w:rPr>
+        <w:t xml:space="preserve"> (PK)</w:t>
+      </w:r>
+      <w:r>
+        <w:rPr>
+          <w:lang w:val="en-US"/>
+        </w:rPr>
+        <w:t>’, ‘</w:t>
+      </w:r>
+      <w:r>
+        <w:rPr>
+          <w:i/>
+          <w:iCs/>
+          <w:lang w:val="en-US"/>
+        </w:rPr>
+        <w:t>patient_nbr</w:t>
+      </w:r>
+      <w:r>
+        <w:rPr>
+          <w:lang w:val="en-US"/>
+        </w:rPr>
+        <w:t>’, ‘</w:t>
+      </w:r>
+      <w:r>
+        <w:rPr>
+          <w:i/>
+          <w:iCs/>
+          <w:lang w:val="en-US"/>
+        </w:rPr>
+        <w:t>admission_type_id</w:t>
+      </w:r>
+      <w:r>
+        <w:rPr>
+          <w:lang w:val="en-US"/>
+        </w:rPr>
+        <w:t>’, ‘</w:t>
+      </w:r>
+      <w:r>
+        <w:rPr>
+          <w:i/>
+          <w:iCs/>
+          <w:lang w:val="en-US"/>
+        </w:rPr>
+        <w:t>admission_source_id</w:t>
+      </w:r>
+      <w:r>
+        <w:rPr>
+          <w:lang w:val="en-US"/>
+        </w:rPr>
+        <w:t>’, ‘</w:t>
+      </w:r>
+      <w:r>
+        <w:rPr>
+          <w:i/>
+          <w:iCs/>
+          <w:lang w:val="en-US"/>
+        </w:rPr>
+        <w:t>discharge_disposition_id</w:t>
+      </w:r>
+      <w:r>
+        <w:rPr>
+          <w:lang w:val="en-US"/>
+        </w:rPr>
+        <w:t>’, ‘</w:t>
+      </w:r>
+      <w:r>
+        <w:rPr>
+          <w:i/>
+          <w:iCs/>
+          <w:lang w:val="en-US"/>
+        </w:rPr>
+        <w:t>diag_1</w:t>
+      </w:r>
+      <w:r>
+        <w:rPr>
+          <w:lang w:val="en-US"/>
+        </w:rPr>
+        <w:t>’ ‘</w:t>
+      </w:r>
+      <w:r>
+        <w:rPr>
+          <w:i/>
+          <w:iCs/>
+          <w:lang w:val="en-US"/>
+        </w:rPr>
+        <w:t>diag_2</w:t>
+      </w:r>
+      <w:r>
+        <w:rPr>
+          <w:lang w:val="en-US"/>
+        </w:rPr>
+        <w:t>’, ‘</w:t>
+      </w:r>
+      <w:r>
+        <w:rPr>
+          <w:i/>
+          <w:iCs/>
+          <w:lang w:val="en-US"/>
+        </w:rPr>
+        <w:t>diag_3</w:t>
+      </w:r>
+      <w:r>
+        <w:rPr>
+          <w:lang w:val="en-US"/>
+        </w:rPr>
+        <w:t>’, ‘</w:t>
+      </w:r>
+      <w:r>
+        <w:rPr>
+          <w:i/>
+          <w:iCs/>
+          <w:lang w:val="en-US"/>
+        </w:rPr>
+        <w:t>time_in_hospital</w:t>
+      </w:r>
+      <w:r>
+        <w:rPr>
+          <w:lang w:val="en-US"/>
+        </w:rPr>
+        <w:t>’, ‘</w:t>
+      </w:r>
+      <w:r>
+        <w:rPr>
+          <w:i/>
+          <w:iCs/>
+          <w:lang w:val="en-US"/>
+        </w:rPr>
+        <w:t>num_lab_procedures</w:t>
+      </w:r>
+      <w:r>
+        <w:rPr>
+          <w:lang w:val="en-US"/>
+        </w:rPr>
+        <w:t>’, ‘</w:t>
+      </w:r>
+      <w:r>
+        <w:rPr>
+          <w:i/>
+          <w:iCs/>
+          <w:lang w:val="en-US"/>
+        </w:rPr>
+        <w:t>num_procedures</w:t>
+      </w:r>
+      <w:r>
+        <w:rPr>
+          <w:lang w:val="en-US"/>
+        </w:rPr>
+        <w:t>’, ‘</w:t>
+      </w:r>
+      <w:r>
+        <w:rPr>
+          <w:i/>
+          <w:iCs/>
+          <w:lang w:val="en-US"/>
+        </w:rPr>
+        <w:t>num_medications</w:t>
+      </w:r>
+      <w:r>
+        <w:rPr>
+          <w:lang w:val="en-US"/>
+        </w:rPr>
+        <w:t>’, ‘</w:t>
+      </w:r>
+      <w:r>
+        <w:rPr>
+          <w:i/>
+          <w:iCs/>
+          <w:lang w:val="en-US"/>
+        </w:rPr>
+        <w:t>number_outpatient</w:t>
+      </w:r>
+      <w:r>
+        <w:rPr>
+          <w:lang w:val="en-US"/>
+        </w:rPr>
+        <w:t>’, ‘</w:t>
+      </w:r>
+      <w:r>
+        <w:rPr>
+          <w:i/>
+          <w:iCs/>
+          <w:lang w:val="en-US"/>
+        </w:rPr>
+        <w:t>number_emergency</w:t>
+      </w:r>
+      <w:r>
+        <w:rPr>
+          <w:lang w:val="en-US"/>
+        </w:rPr>
+        <w:t>’, ‘</w:t>
+      </w:r>
+      <w:r>
+        <w:rPr>
+          <w:i/>
+          <w:iCs/>
+          <w:lang w:val="en-US"/>
+        </w:rPr>
+        <w:t>number_inpatient</w:t>
+      </w:r>
+      <w:r>
+        <w:rPr>
+          <w:lang w:val="en-US"/>
+        </w:rPr>
+        <w:t>’, ‘</w:t>
+      </w:r>
+      <w:r>
+        <w:rPr>
+          <w:i/>
+          <w:iCs/>
+          <w:lang w:val="en-US"/>
+        </w:rPr>
+        <w:t>number_diagnoses</w:t>
+      </w:r>
+      <w:r>
+        <w:rPr>
+          <w:lang w:val="en-US"/>
+        </w:rPr>
+        <w:t>’</w:t>
+      </w:r>
+      <w:r>
+        <w:rPr>
+          <w:lang w:val="en-US"/>
+        </w:rPr>
+        <w:t>, ‘</w:t>
+      </w:r>
+      <w:r>
+        <w:rPr>
+          <w:i/>
+          <w:iCs/>
+          <w:lang w:val="en-US"/>
+        </w:rPr>
+        <w:t>readmitted</w:t>
+      </w:r>
+      <w:r>
+        <w:rPr>
+          <w:lang w:val="en-US"/>
+        </w:rPr>
+        <w:t>’</w:t>
       </w:r>
     </w:p>
     <w:p>
@@ -172,25 +433,7 @@
                                 <w:iCs/>
                                 <w:lang w:val="en-US"/>
                               </w:rPr>
-                              <w:t xml:space="preserve"> the ‘</w:t>
-                            </w:r>
-                            <w:proofErr w:type="spellStart"/>
-                            <w:r>
-                              <w:rPr>
-                                <w:i/>
-                                <w:iCs/>
-                                <w:lang w:val="en-US"/>
-                              </w:rPr>
-                              <w:t>Fact_Encounter</w:t>
-                            </w:r>
-                            <w:proofErr w:type="spellEnd"/>
-                            <w:r>
-                              <w:rPr>
-                                <w:i/>
-                                <w:iCs/>
-                                <w:lang w:val="en-US"/>
-                              </w:rPr>
-                              <w:t>’ table</w:t>
+                              <w:t xml:space="preserve"> the ‘Fact_Encounter’ table</w:t>
                             </w:r>
                             <w:r>
                               <w:rPr>
@@ -260,25 +503,7 @@
                           <w:iCs/>
                           <w:lang w:val="en-US"/>
                         </w:rPr>
-                        <w:t xml:space="preserve"> the ‘</w:t>
-                      </w:r>
-                      <w:proofErr w:type="spellStart"/>
-                      <w:r>
-                        <w:rPr>
-                          <w:i/>
-                          <w:iCs/>
-                          <w:lang w:val="en-US"/>
-                        </w:rPr>
-                        <w:t>Fact_Encounter</w:t>
-                      </w:r>
-                      <w:proofErr w:type="spellEnd"/>
-                      <w:r>
-                        <w:rPr>
-                          <w:i/>
-                          <w:iCs/>
-                          <w:lang w:val="en-US"/>
-                        </w:rPr>
-                        <w:t>’ table</w:t>
+                        <w:t xml:space="preserve"> the ‘Fact_Encounter’ table</w:t>
                       </w:r>
                       <w:r>
                         <w:rPr>
@@ -300,21 +525,7 @@
         <w:rPr>
           <w:lang w:val="en-US"/>
         </w:rPr>
-        <w:t>Below is a screenshot of choosing the appropriate columns for ‘</w:t>
-      </w:r>
-      <w:proofErr w:type="spellStart"/>
-      <w:r>
-        <w:rPr>
-          <w:lang w:val="en-US"/>
-        </w:rPr>
-        <w:t>Fact_Encounter</w:t>
-      </w:r>
-      <w:proofErr w:type="spellEnd"/>
-      <w:r>
-        <w:rPr>
-          <w:lang w:val="en-US"/>
-        </w:rPr>
-        <w:t>’ table. I kept numeric/measurable attributes and removed descriptive attributes.</w:t>
+        <w:t>Below is a screenshot of choosing the appropriate columns for ‘Fact_Encounter’ table. I kept numeric/measurable attributes and removed descriptive attributes.</w:t>
       </w:r>
     </w:p>
     <w:p>
@@ -544,6 +755,643 @@
                     <a:xfrm>
                       <a:off x="0" y="0"/>
                       <a:ext cx="4122420" cy="2476500"/>
+                    </a:xfrm>
+                    <a:prstGeom prst="rect">
+                      <a:avLst/>
+                    </a:prstGeom>
+                    <a:ln>
+                      <a:noFill/>
+                    </a:ln>
+                    <a:extLst>
+                      <a:ext uri="{53640926-AAD7-44D8-BBD7-CCE9431645EC}">
+                        <a14:shadowObscured xmlns:a14="http://schemas.microsoft.com/office/drawing/2010/main"/>
+                      </a:ext>
+                    </a:extLst>
+                  </pic:spPr>
+                </pic:pic>
+              </a:graphicData>
+            </a:graphic>
+          </wp:inline>
+        </w:drawing>
+      </w:r>
+    </w:p>
+    <w:p>
+      <w:pPr>
+        <w:rPr>
+          <w:lang w:val="en-US"/>
+        </w:rPr>
+      </w:pPr>
+    </w:p>
+    <w:p>
+      <w:pPr>
+        <w:rPr>
+          <w:lang w:val="en-US"/>
+        </w:rPr>
+      </w:pPr>
+    </w:p>
+    <w:p>
+      <w:pPr>
+        <w:rPr>
+          <w:lang w:val="en-US"/>
+        </w:rPr>
+      </w:pPr>
+    </w:p>
+    <w:p>
+      <w:pPr>
+        <w:rPr>
+          <w:lang w:val="en-US"/>
+        </w:rPr>
+      </w:pPr>
+    </w:p>
+    <w:p>
+      <w:pPr>
+        <w:rPr>
+          <w:lang w:val="en-US"/>
+        </w:rPr>
+      </w:pPr>
+    </w:p>
+    <w:p>
+      <w:pPr>
+        <w:rPr>
+          <w:lang w:val="en-US"/>
+        </w:rPr>
+      </w:pPr>
+    </w:p>
+    <w:p>
+      <w:pPr>
+        <w:rPr>
+          <w:lang w:val="en-US"/>
+        </w:rPr>
+      </w:pPr>
+    </w:p>
+    <w:p>
+      <w:pPr>
+        <w:rPr>
+          <w:lang w:val="en-US"/>
+        </w:rPr>
+      </w:pPr>
+    </w:p>
+    <w:p>
+      <w:pPr>
+        <w:rPr>
+          <w:lang w:val="en-US"/>
+        </w:rPr>
+      </w:pPr>
+    </w:p>
+    <w:p>
+      <w:pPr>
+        <w:rPr>
+          <w:lang w:val="en-US"/>
+        </w:rPr>
+      </w:pPr>
+    </w:p>
+    <w:p>
+      <w:pPr>
+        <w:rPr>
+          <w:lang w:val="en-US"/>
+        </w:rPr>
+      </w:pPr>
+    </w:p>
+    <w:p>
+      <w:pPr>
+        <w:rPr>
+          <w:lang w:val="en-US"/>
+        </w:rPr>
+      </w:pPr>
+    </w:p>
+    <w:p>
+      <w:pPr>
+        <w:rPr>
+          <w:b/>
+          <w:bCs/>
+          <w:lang w:val="en-US"/>
+        </w:rPr>
+      </w:pPr>
+      <w:r>
+        <w:rPr>
+          <w:b/>
+          <w:bCs/>
+          <w:lang w:val="en-US"/>
+        </w:rPr>
+        <w:lastRenderedPageBreak/>
+        <w:t>Building ‘Dim_Patient’:</w:t>
+      </w:r>
+    </w:p>
+    <w:p>
+      <w:pPr>
+        <w:rPr>
+          <w:lang w:val="en-US"/>
+        </w:rPr>
+      </w:pPr>
+      <w:r>
+        <w:rPr>
+          <w:lang w:val="en-US"/>
+        </w:rPr>
+        <w:t>This table contains only patient demographic attributes which include: ‘</w:t>
+      </w:r>
+      <w:r>
+        <w:rPr>
+          <w:i/>
+          <w:iCs/>
+          <w:lang w:val="en-US"/>
+        </w:rPr>
+        <w:t>patient_nbr (PK)</w:t>
+      </w:r>
+      <w:r>
+        <w:rPr>
+          <w:lang w:val="en-US"/>
+        </w:rPr>
+        <w:t>’, ‘</w:t>
+      </w:r>
+      <w:r>
+        <w:rPr>
+          <w:i/>
+          <w:iCs/>
+          <w:lang w:val="en-US"/>
+        </w:rPr>
+        <w:t>race</w:t>
+      </w:r>
+      <w:r>
+        <w:rPr>
+          <w:lang w:val="en-US"/>
+        </w:rPr>
+        <w:t>’, ‘</w:t>
+      </w:r>
+      <w:r>
+        <w:rPr>
+          <w:i/>
+          <w:iCs/>
+          <w:lang w:val="en-US"/>
+        </w:rPr>
+        <w:t>gender</w:t>
+      </w:r>
+      <w:r>
+        <w:rPr>
+          <w:lang w:val="en-US"/>
+        </w:rPr>
+        <w:t>’, ‘</w:t>
+      </w:r>
+      <w:r>
+        <w:rPr>
+          <w:i/>
+          <w:iCs/>
+          <w:lang w:val="en-US"/>
+        </w:rPr>
+        <w:t>A</w:t>
+      </w:r>
+      <w:r>
+        <w:rPr>
+          <w:i/>
+          <w:iCs/>
+          <w:lang w:val="en-US"/>
+        </w:rPr>
+        <w:t>ge_</w:t>
+      </w:r>
+      <w:r>
+        <w:rPr>
+          <w:i/>
+          <w:iCs/>
+          <w:lang w:val="en-US"/>
+        </w:rPr>
+        <w:t>M</w:t>
+      </w:r>
+      <w:r>
+        <w:rPr>
+          <w:i/>
+          <w:iCs/>
+          <w:lang w:val="en-US"/>
+        </w:rPr>
+        <w:t>idpoint</w:t>
+      </w:r>
+      <w:r>
+        <w:rPr>
+          <w:lang w:val="en-US"/>
+        </w:rPr>
+        <w:t>’, ‘</w:t>
+      </w:r>
+      <w:r>
+        <w:rPr>
+          <w:i/>
+          <w:iCs/>
+          <w:lang w:val="en-US"/>
+        </w:rPr>
+        <w:t>payer_code</w:t>
+      </w:r>
+      <w:r>
+        <w:rPr>
+          <w:lang w:val="en-US"/>
+        </w:rPr>
+        <w:t>’.</w:t>
+      </w:r>
+    </w:p>
+    <w:p>
+      <w:pPr>
+        <w:rPr>
+          <w:lang w:val="en-US"/>
+        </w:rPr>
+      </w:pPr>
+      <w:r>
+        <w:rPr>
+          <w:lang w:val="en-US"/>
+        </w:rPr>
+        <w:t>Below is a screenshot of choosing the appropriate columns for ‘</w:t>
+      </w:r>
+      <w:r>
+        <w:rPr>
+          <w:lang w:val="en-US"/>
+        </w:rPr>
+        <w:t>Dim_Patient’ dimension</w:t>
+      </w:r>
+      <w:r>
+        <w:rPr>
+          <w:lang w:val="en-US"/>
+        </w:rPr>
+        <w:t xml:space="preserve"> table. </w:t>
+      </w:r>
+      <w:r>
+        <w:rPr>
+          <w:lang w:val="en-US"/>
+        </w:rPr>
+        <w:t>Thereafter, I removed duplicate rows to ensure each patient appears once, all demographics are consistent, fact table can safely reference patient_nbr, and there are no broken relationships.</w:t>
+      </w:r>
+    </w:p>
+    <w:p>
+      <w:pPr>
+        <w:tabs>
+          <w:tab w:val="left" w:pos="3204"/>
+        </w:tabs>
+        <w:rPr>
+          <w:lang w:val="en-US"/>
+        </w:rPr>
+      </w:pPr>
+      <w:r>
+        <w:rPr>
+          <w:noProof/>
+        </w:rPr>
+        <mc:AlternateContent>
+          <mc:Choice Requires="wps">
+            <w:drawing>
+              <wp:anchor distT="0" distB="0" distL="114300" distR="114300" simplePos="0" relativeHeight="251664384" behindDoc="0" locked="0" layoutInCell="1" allowOverlap="1" wp14:anchorId="1DD20DEA" wp14:editId="762E002C">
+                <wp:simplePos x="0" y="0"/>
+                <wp:positionH relativeFrom="column">
+                  <wp:posOffset>2247900</wp:posOffset>
+                </wp:positionH>
+                <wp:positionV relativeFrom="paragraph">
+                  <wp:posOffset>6985</wp:posOffset>
+                </wp:positionV>
+                <wp:extent cx="2651760" cy="533400"/>
+                <wp:effectExtent l="0" t="0" r="15240" b="19050"/>
+                <wp:wrapNone/>
+                <wp:docPr id="668838628" name="Text Box 2"/>
+                <wp:cNvGraphicFramePr/>
+                <a:graphic xmlns:a="http://schemas.openxmlformats.org/drawingml/2006/main">
+                  <a:graphicData uri="http://schemas.microsoft.com/office/word/2010/wordprocessingShape">
+                    <wps:wsp>
+                      <wps:cNvSpPr txBox="1"/>
+                      <wps:spPr>
+                        <a:xfrm>
+                          <a:off x="0" y="0"/>
+                          <a:ext cx="2651760" cy="533400"/>
+                        </a:xfrm>
+                        <a:prstGeom prst="rect">
+                          <a:avLst/>
+                        </a:prstGeom>
+                        <a:solidFill>
+                          <a:schemeClr val="lt1"/>
+                        </a:solidFill>
+                        <a:ln w="6350">
+                          <a:solidFill>
+                            <a:prstClr val="black"/>
+                          </a:solidFill>
+                        </a:ln>
+                      </wps:spPr>
+                      <wps:txbx>
+                        <w:txbxContent>
+                          <w:p>
+                            <w:pPr>
+                              <w:rPr>
+                                <w:i/>
+                                <w:iCs/>
+                                <w:lang w:val="en-US"/>
+                              </w:rPr>
+                            </w:pPr>
+                            <w:r>
+                              <w:rPr>
+                                <w:i/>
+                                <w:iCs/>
+                                <w:lang w:val="en-US"/>
+                              </w:rPr>
+                              <w:t>Screenshot the ‘</w:t>
+                            </w:r>
+                            <w:r>
+                              <w:rPr>
+                                <w:i/>
+                                <w:iCs/>
+                                <w:lang w:val="en-US"/>
+                              </w:rPr>
+                              <w:t>Dim_Patient</w:t>
+                            </w:r>
+                            <w:r>
+                              <w:rPr>
+                                <w:i/>
+                                <w:iCs/>
+                                <w:lang w:val="en-US"/>
+                              </w:rPr>
+                              <w:t>’ table after creating it:</w:t>
+                            </w:r>
+                          </w:p>
+                        </w:txbxContent>
+                      </wps:txbx>
+                      <wps:bodyPr rot="0" spcFirstLastPara="0" vertOverflow="overflow" horzOverflow="overflow" vert="horz" wrap="square" lIns="91440" tIns="45720" rIns="91440" bIns="45720" numCol="1" spcCol="0" rtlCol="0" fromWordArt="0" anchor="t" anchorCtr="0" forceAA="0" compatLnSpc="1">
+                        <a:prstTxWarp prst="textNoShape">
+                          <a:avLst/>
+                        </a:prstTxWarp>
+                        <a:noAutofit/>
+                      </wps:bodyPr>
+                    </wps:wsp>
+                  </a:graphicData>
+                </a:graphic>
+                <wp14:sizeRelH relativeFrom="margin">
+                  <wp14:pctWidth>0</wp14:pctWidth>
+                </wp14:sizeRelH>
+                <wp14:sizeRelV relativeFrom="margin">
+                  <wp14:pctHeight>0</wp14:pctHeight>
+                </wp14:sizeRelV>
+              </wp:anchor>
+            </w:drawing>
+          </mc:Choice>
+          <mc:Fallback>
+            <w:pict>
+              <v:shape w14:anchorId="1DD20DEA" id="_x0000_s1028" type="#_x0000_t202" style="position:absolute;margin-left:177pt;margin-top:.55pt;width:208.8pt;height:42pt;z-index:251664384;visibility:visible;mso-wrap-style:square;mso-width-percent:0;mso-height-percent:0;mso-wrap-distance-left:9pt;mso-wrap-distance-top:0;mso-wrap-distance-right:9pt;mso-wrap-distance-bottom:0;mso-position-horizontal:absolute;mso-position-horizontal-relative:text;mso-position-vertical:absolute;mso-position-vertical-relative:text;mso-width-percent:0;mso-height-percent:0;mso-width-relative:margin;mso-height-relative:margin;v-text-anchor:top" o:gfxdata="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" fillcolor="white [3201]" strokeweight=".5pt">
+                <v:textbox>
+                  <w:txbxContent>
+                    <w:p>
+                      <w:pPr>
+                        <w:rPr>
+                          <w:i/>
+                          <w:iCs/>
+                          <w:lang w:val="en-US"/>
+                        </w:rPr>
+                      </w:pPr>
+                      <w:r>
+                        <w:rPr>
+                          <w:i/>
+                          <w:iCs/>
+                          <w:lang w:val="en-US"/>
+                        </w:rPr>
+                        <w:t>Screenshot the ‘</w:t>
+                      </w:r>
+                      <w:r>
+                        <w:rPr>
+                          <w:i/>
+                          <w:iCs/>
+                          <w:lang w:val="en-US"/>
+                        </w:rPr>
+                        <w:t>Dim_Patient</w:t>
+                      </w:r>
+                      <w:r>
+                        <w:rPr>
+                          <w:i/>
+                          <w:iCs/>
+                          <w:lang w:val="en-US"/>
+                        </w:rPr>
+                        <w:t>’ table after creating it:</w:t>
+                      </w:r>
+                    </w:p>
+                  </w:txbxContent>
+                </v:textbox>
+              </v:shape>
+            </w:pict>
+          </mc:Fallback>
+        </mc:AlternateContent>
+      </w:r>
+      <w:r>
+        <w:rPr>
+          <w:noProof/>
+        </w:rPr>
+        <mc:AlternateContent>
+          <mc:Choice Requires="wps">
+            <w:drawing>
+              <wp:anchor distT="0" distB="0" distL="114300" distR="114300" simplePos="0" relativeHeight="251662336" behindDoc="0" locked="0" layoutInCell="1" allowOverlap="1" wp14:anchorId="5170467A" wp14:editId="36725F1A">
+                <wp:simplePos x="0" y="0"/>
+                <wp:positionH relativeFrom="margin">
+                  <wp:align>left</wp:align>
+                </wp:positionH>
+                <wp:positionV relativeFrom="paragraph">
+                  <wp:posOffset>33655</wp:posOffset>
+                </wp:positionV>
+                <wp:extent cx="1501140" cy="480060"/>
+                <wp:effectExtent l="0" t="0" r="22860" b="15240"/>
+                <wp:wrapNone/>
+                <wp:docPr id="986723934" name="Text Box 1"/>
+                <wp:cNvGraphicFramePr/>
+                <a:graphic xmlns:a="http://schemas.openxmlformats.org/drawingml/2006/main">
+                  <a:graphicData uri="http://schemas.microsoft.com/office/word/2010/wordprocessingShape">
+                    <wps:wsp>
+                      <wps:cNvSpPr txBox="1"/>
+                      <wps:spPr>
+                        <a:xfrm>
+                          <a:off x="0" y="0"/>
+                          <a:ext cx="1501140" cy="480060"/>
+                        </a:xfrm>
+                        <a:prstGeom prst="rect">
+                          <a:avLst/>
+                        </a:prstGeom>
+                        <a:solidFill>
+                          <a:schemeClr val="lt1"/>
+                        </a:solidFill>
+                        <a:ln w="3175">
+                          <a:solidFill>
+                            <a:prstClr val="black"/>
+                          </a:solidFill>
+                        </a:ln>
+                      </wps:spPr>
+                      <wps:txbx>
+                        <w:txbxContent>
+                          <w:p>
+                            <w:pPr>
+                              <w:rPr>
+                                <w:i/>
+                                <w:iCs/>
+                                <w:lang w:val="en-US"/>
+                              </w:rPr>
+                            </w:pPr>
+                            <w:r>
+                              <w:rPr>
+                                <w:i/>
+                                <w:iCs/>
+                                <w:lang w:val="en-US"/>
+                              </w:rPr>
+                              <w:t>Choosing appropriate columns</w:t>
+                            </w:r>
+                            <w:r>
+                              <w:rPr>
+                                <w:i/>
+                                <w:iCs/>
+                                <w:lang w:val="en-US"/>
+                              </w:rPr>
+                              <w:t>:</w:t>
+                            </w:r>
+                          </w:p>
+                        </w:txbxContent>
+                      </wps:txbx>
+                      <wps:bodyPr rot="0" spcFirstLastPara="0" vertOverflow="overflow" horzOverflow="overflow" vert="horz" wrap="square" lIns="91440" tIns="45720" rIns="91440" bIns="45720" numCol="1" spcCol="0" rtlCol="0" fromWordArt="0" anchor="t" anchorCtr="0" forceAA="0" compatLnSpc="1">
+                        <a:prstTxWarp prst="textNoShape">
+                          <a:avLst/>
+                        </a:prstTxWarp>
+                        <a:noAutofit/>
+                      </wps:bodyPr>
+                    </wps:wsp>
+                  </a:graphicData>
+                </a:graphic>
+                <wp14:sizeRelH relativeFrom="margin">
+                  <wp14:pctWidth>0</wp14:pctWidth>
+                </wp14:sizeRelH>
+                <wp14:sizeRelV relativeFrom="margin">
+                  <wp14:pctHeight>0</wp14:pctHeight>
+                </wp14:sizeRelV>
+              </wp:anchor>
+            </w:drawing>
+          </mc:Choice>
+          <mc:Fallback>
+            <w:pict>
+              <v:shape w14:anchorId="5170467A" id="_x0000_s1029" type="#_x0000_t202" style="position:absolute;margin-left:0;margin-top:2.65pt;width:118.2pt;height:37.8pt;z-index:251662336;visibility:visible;mso-wrap-style:square;mso-width-percent:0;mso-height-percent:0;mso-wrap-distance-left:9pt;mso-wrap-distance-top:0;mso-wrap-distance-right:9pt;mso-wrap-distance-bottom:0;mso-position-horizontal:left;mso-position-horizontal-relative:margin;mso-position-vertical:absolute;mso-position-vertical-relative:text;mso-width-percent:0;mso-height-percent:0;mso-width-relative:margin;mso-height-relative:margin;v-text-anchor:top" o:gfxdata="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" fillcolor="white [3201]" strokeweight=".25pt">
+                <v:textbox>
+                  <w:txbxContent>
+                    <w:p>
+                      <w:pPr>
+                        <w:rPr>
+                          <w:i/>
+                          <w:iCs/>
+                          <w:lang w:val="en-US"/>
+                        </w:rPr>
+                      </w:pPr>
+                      <w:r>
+                        <w:rPr>
+                          <w:i/>
+                          <w:iCs/>
+                          <w:lang w:val="en-US"/>
+                        </w:rPr>
+                        <w:t>Choosing appropriate columns</w:t>
+                      </w:r>
+                      <w:r>
+                        <w:rPr>
+                          <w:i/>
+                          <w:iCs/>
+                          <w:lang w:val="en-US"/>
+                        </w:rPr>
+                        <w:t>:</w:t>
+                      </w:r>
+                    </w:p>
+                  </w:txbxContent>
+                </v:textbox>
+                <w10:wrap anchorx="margin"/>
+              </v:shape>
+            </w:pict>
+          </mc:Fallback>
+        </mc:AlternateContent>
+      </w:r>
+      <w:r>
+        <w:rPr>
+          <w:lang w:val="en-US"/>
+        </w:rPr>
+        <w:tab/>
+      </w:r>
+    </w:p>
+    <w:p>
+      <w:pPr>
+        <w:rPr>
+          <w:lang w:val="en-US"/>
+        </w:rPr>
+      </w:pPr>
+    </w:p>
+    <w:p>
+      <w:pPr>
+        <w:rPr>
+          <w:lang w:val="en-US"/>
+        </w:rPr>
+      </w:pPr>
+      <w:r>
+        <w:rPr>
+          <w:noProof/>
+        </w:rPr>
+        <w:drawing>
+          <wp:inline distT="0" distB="0" distL="0" distR="0" wp14:anchorId="5B7A1EA1" wp14:editId="594B00BD">
+            <wp:extent cx="1386840" cy="2362200"/>
+            <wp:effectExtent l="0" t="0" r="3810" b="0"/>
+            <wp:docPr id="995207123" name="Picture 1"/>
+            <wp:cNvGraphicFramePr>
+              <a:graphicFrameLocks xmlns:a="http://schemas.openxmlformats.org/drawingml/2006/main" noChangeAspect="1"/>
+            </wp:cNvGraphicFramePr>
+            <a:graphic xmlns:a="http://schemas.openxmlformats.org/drawingml/2006/main">
+              <a:graphicData uri="http://schemas.openxmlformats.org/drawingml/2006/picture">
+                <pic:pic xmlns:pic="http://schemas.openxmlformats.org/drawingml/2006/picture">
+                  <pic:nvPicPr>
+                    <pic:cNvPr id="995207123" name=""/>
+                    <pic:cNvPicPr/>
+                  </pic:nvPicPr>
+                  <pic:blipFill rotWithShape="1">
+                    <a:blip r:embed="rId6"/>
+                    <a:srcRect l="38156" t="11109" r="37647" b="15619"/>
+                    <a:stretch/>
+                  </pic:blipFill>
+                  <pic:spPr bwMode="auto">
+                    <a:xfrm>
+                      <a:off x="0" y="0"/>
+                      <a:ext cx="1386840" cy="2362200"/>
+                    </a:xfrm>
+                    <a:prstGeom prst="rect">
+                      <a:avLst/>
+                    </a:prstGeom>
+                    <a:ln>
+                      <a:noFill/>
+                    </a:ln>
+                    <a:extLst>
+                      <a:ext uri="{53640926-AAD7-44D8-BBD7-CCE9431645EC}">
+                        <a14:shadowObscured xmlns:a14="http://schemas.microsoft.com/office/drawing/2010/main"/>
+                      </a:ext>
+                    </a:extLst>
+                  </pic:spPr>
+                </pic:pic>
+              </a:graphicData>
+            </a:graphic>
+          </wp:inline>
+        </w:drawing>
+      </w:r>
+      <w:r>
+        <w:rPr>
+          <w:noProof/>
+        </w:rPr>
+        <w:t xml:space="preserve">                      </w:t>
+      </w:r>
+      <w:r>
+        <w:rPr>
+          <w:noProof/>
+        </w:rPr>
+        <w:drawing>
+          <wp:inline distT="0" distB="0" distL="0" distR="0" wp14:anchorId="75E96773" wp14:editId="16329513">
+            <wp:extent cx="3053709" cy="2301240"/>
+            <wp:effectExtent l="0" t="0" r="0" b="3810"/>
+            <wp:docPr id="1802905047" name="Picture 1"/>
+            <wp:cNvGraphicFramePr>
+              <a:graphicFrameLocks xmlns:a="http://schemas.openxmlformats.org/drawingml/2006/main" noChangeAspect="1"/>
+            </wp:cNvGraphicFramePr>
+            <a:graphic xmlns:a="http://schemas.openxmlformats.org/drawingml/2006/main">
+              <a:graphicData uri="http://schemas.openxmlformats.org/drawingml/2006/picture">
+                <pic:pic xmlns:pic="http://schemas.openxmlformats.org/drawingml/2006/picture">
+                  <pic:nvPicPr>
+                    <pic:cNvPr id="1802905047" name=""/>
+                    <pic:cNvPicPr/>
+                  </pic:nvPicPr>
+                  <pic:blipFill rotWithShape="1">
+                    <a:blip r:embed="rId7"/>
+                    <a:srcRect l="11434" t="18436" r="32994" b="7110"/>
+                    <a:stretch/>
+                  </pic:blipFill>
+                  <pic:spPr bwMode="auto">
+                    <a:xfrm>
+                      <a:off x="0" y="0"/>
+                      <a:ext cx="3054384" cy="2301749"/>
                     </a:xfrm>
                     <a:prstGeom prst="rect">
                       <a:avLst/>

</xml_diff>

<commit_message>
Data Modelling: Creating Dim_Admission - Hetal
</commit_message>
<xml_diff>
--- a/2_Documented_modelling.docx
+++ b/2_Documented_modelling.docx
@@ -1411,6 +1411,575 @@
           </wp:inline>
         </w:drawing>
       </w:r>
+    </w:p>
+    <w:p>
+      <w:pPr>
+        <w:rPr>
+          <w:b/>
+          <w:bCs/>
+          <w:lang w:val="en-US"/>
+        </w:rPr>
+      </w:pPr>
+      <w:r>
+        <w:rPr>
+          <w:b/>
+          <w:bCs/>
+          <w:lang w:val="en-US"/>
+        </w:rPr>
+        <w:t>Building ‘Dim_</w:t>
+      </w:r>
+      <w:r>
+        <w:rPr>
+          <w:b/>
+          <w:bCs/>
+          <w:lang w:val="en-US"/>
+        </w:rPr>
+        <w:t>Admission</w:t>
+      </w:r>
+      <w:r>
+        <w:rPr>
+          <w:b/>
+          <w:bCs/>
+          <w:lang w:val="en-US"/>
+        </w:rPr>
+        <w:t>’:</w:t>
+      </w:r>
+    </w:p>
+    <w:p>
+      <w:pPr>
+        <w:rPr>
+          <w:lang w:val="en-US"/>
+        </w:rPr>
+      </w:pPr>
+      <w:r>
+        <w:rPr>
+          <w:lang w:val="en-US"/>
+        </w:rPr>
+        <w:t xml:space="preserve"> This table categorizes how the patient entered and exited the hospital. Attributes include: ‘</w:t>
+      </w:r>
+      <w:r>
+        <w:rPr>
+          <w:i/>
+          <w:iCs/>
+          <w:lang w:val="en-US"/>
+        </w:rPr>
+        <w:t>admission_type_id</w:t>
+      </w:r>
+      <w:r>
+        <w:rPr>
+          <w:lang w:val="en-US"/>
+        </w:rPr>
+        <w:t>’, ‘</w:t>
+      </w:r>
+      <w:r>
+        <w:rPr>
+          <w:i/>
+          <w:iCs/>
+          <w:lang w:val="en-US"/>
+        </w:rPr>
+        <w:t>admission_source_id</w:t>
+      </w:r>
+      <w:r>
+        <w:rPr>
+          <w:lang w:val="en-US"/>
+        </w:rPr>
+        <w:t>’, ‘</w:t>
+      </w:r>
+      <w:r>
+        <w:rPr>
+          <w:i/>
+          <w:iCs/>
+          <w:lang w:val="en-US"/>
+        </w:rPr>
+        <w:t>discharge_disposition_id</w:t>
+      </w:r>
+      <w:r>
+        <w:rPr>
+          <w:lang w:val="en-US"/>
+        </w:rPr>
+        <w:t>’, ‘</w:t>
+      </w:r>
+      <w:r>
+        <w:rPr>
+          <w:i/>
+          <w:iCs/>
+          <w:lang w:val="en-US"/>
+        </w:rPr>
+        <w:t>Admission_ID</w:t>
+      </w:r>
+      <w:r>
+        <w:rPr>
+          <w:lang w:val="en-US"/>
+        </w:rPr>
+        <w:t>’.</w:t>
+      </w:r>
+    </w:p>
+    <w:p>
+      <w:pPr>
+        <w:rPr>
+          <w:lang w:val="en-US"/>
+        </w:rPr>
+      </w:pPr>
+      <w:r>
+        <w:rPr>
+          <w:noProof/>
+        </w:rPr>
+        <mc:AlternateContent>
+          <mc:Choice Requires="wps">
+            <w:drawing>
+              <wp:anchor distT="0" distB="0" distL="114300" distR="114300" simplePos="0" relativeHeight="251668480" behindDoc="0" locked="0" layoutInCell="1" allowOverlap="1" wp14:anchorId="5C570E18" wp14:editId="538ECD2B">
+                <wp:simplePos x="0" y="0"/>
+                <wp:positionH relativeFrom="column">
+                  <wp:posOffset>2042160</wp:posOffset>
+                </wp:positionH>
+                <wp:positionV relativeFrom="paragraph">
+                  <wp:posOffset>593725</wp:posOffset>
+                </wp:positionV>
+                <wp:extent cx="3406140" cy="342900"/>
+                <wp:effectExtent l="0" t="0" r="22860" b="19050"/>
+                <wp:wrapNone/>
+                <wp:docPr id="406606877" name="Text Box 2"/>
+                <wp:cNvGraphicFramePr/>
+                <a:graphic xmlns:a="http://schemas.openxmlformats.org/drawingml/2006/main">
+                  <a:graphicData uri="http://schemas.microsoft.com/office/word/2010/wordprocessingShape">
+                    <wps:wsp>
+                      <wps:cNvSpPr txBox="1"/>
+                      <wps:spPr>
+                        <a:xfrm>
+                          <a:off x="0" y="0"/>
+                          <a:ext cx="3406140" cy="342900"/>
+                        </a:xfrm>
+                        <a:prstGeom prst="rect">
+                          <a:avLst/>
+                        </a:prstGeom>
+                        <a:solidFill>
+                          <a:schemeClr val="lt1"/>
+                        </a:solidFill>
+                        <a:ln w="6350">
+                          <a:solidFill>
+                            <a:prstClr val="black"/>
+                          </a:solidFill>
+                        </a:ln>
+                      </wps:spPr>
+                      <wps:txbx>
+                        <w:txbxContent>
+                          <w:p>
+                            <w:pPr>
+                              <w:rPr>
+                                <w:i/>
+                                <w:iCs/>
+                                <w:lang w:val="en-US"/>
+                              </w:rPr>
+                            </w:pPr>
+                            <w:r>
+                              <w:rPr>
+                                <w:i/>
+                                <w:iCs/>
+                                <w:lang w:val="en-US"/>
+                              </w:rPr>
+                              <w:t>Screenshot the ‘</w:t>
+                            </w:r>
+                            <w:r>
+                              <w:rPr>
+                                <w:i/>
+                                <w:iCs/>
+                                <w:lang w:val="en-US"/>
+                              </w:rPr>
+                              <w:t>Dim_</w:t>
+                            </w:r>
+                            <w:r>
+                              <w:rPr>
+                                <w:i/>
+                                <w:iCs/>
+                                <w:lang w:val="en-US"/>
+                              </w:rPr>
+                              <w:t>Admission</w:t>
+                            </w:r>
+                            <w:r>
+                              <w:rPr>
+                                <w:i/>
+                                <w:iCs/>
+                                <w:lang w:val="en-US"/>
+                              </w:rPr>
+                              <w:t>’ table after creating it:</w:t>
+                            </w:r>
+                          </w:p>
+                        </w:txbxContent>
+                      </wps:txbx>
+                      <wps:bodyPr rot="0" spcFirstLastPara="0" vertOverflow="overflow" horzOverflow="overflow" vert="horz" wrap="square" lIns="91440" tIns="45720" rIns="91440" bIns="45720" numCol="1" spcCol="0" rtlCol="0" fromWordArt="0" anchor="t" anchorCtr="0" forceAA="0" compatLnSpc="1">
+                        <a:prstTxWarp prst="textNoShape">
+                          <a:avLst/>
+                        </a:prstTxWarp>
+                        <a:noAutofit/>
+                      </wps:bodyPr>
+                    </wps:wsp>
+                  </a:graphicData>
+                </a:graphic>
+                <wp14:sizeRelH relativeFrom="margin">
+                  <wp14:pctWidth>0</wp14:pctWidth>
+                </wp14:sizeRelH>
+                <wp14:sizeRelV relativeFrom="margin">
+                  <wp14:pctHeight>0</wp14:pctHeight>
+                </wp14:sizeRelV>
+              </wp:anchor>
+            </w:drawing>
+          </mc:Choice>
+          <mc:Fallback>
+            <w:pict>
+              <v:shape w14:anchorId="5C570E18" id="_x0000_s1030" type="#_x0000_t202" style="position:absolute;margin-left:160.8pt;margin-top:46.75pt;width:268.2pt;height:27pt;z-index:251668480;visibility:visible;mso-wrap-style:square;mso-width-percent:0;mso-height-percent:0;mso-wrap-distance-left:9pt;mso-wrap-distance-top:0;mso-wrap-distance-right:9pt;mso-wrap-distance-bottom:0;mso-position-horizontal:absolute;mso-position-horizontal-relative:text;mso-position-vertical:absolute;mso-position-vertical-relative:text;mso-width-percent:0;mso-height-percent:0;mso-width-relative:margin;mso-height-relative:margin;v-text-anchor:top" o:gfxdata="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" fillcolor="white [3201]" strokeweight=".5pt">
+                <v:textbox>
+                  <w:txbxContent>
+                    <w:p>
+                      <w:pPr>
+                        <w:rPr>
+                          <w:i/>
+                          <w:iCs/>
+                          <w:lang w:val="en-US"/>
+                        </w:rPr>
+                      </w:pPr>
+                      <w:r>
+                        <w:rPr>
+                          <w:i/>
+                          <w:iCs/>
+                          <w:lang w:val="en-US"/>
+                        </w:rPr>
+                        <w:t>Screenshot the ‘</w:t>
+                      </w:r>
+                      <w:r>
+                        <w:rPr>
+                          <w:i/>
+                          <w:iCs/>
+                          <w:lang w:val="en-US"/>
+                        </w:rPr>
+                        <w:t>Dim_</w:t>
+                      </w:r>
+                      <w:r>
+                        <w:rPr>
+                          <w:i/>
+                          <w:iCs/>
+                          <w:lang w:val="en-US"/>
+                        </w:rPr>
+                        <w:t>Admission</w:t>
+                      </w:r>
+                      <w:r>
+                        <w:rPr>
+                          <w:i/>
+                          <w:iCs/>
+                          <w:lang w:val="en-US"/>
+                        </w:rPr>
+                        <w:t>’ table after creating it:</w:t>
+                      </w:r>
+                    </w:p>
+                  </w:txbxContent>
+                </v:textbox>
+              </v:shape>
+            </w:pict>
+          </mc:Fallback>
+        </mc:AlternateContent>
+      </w:r>
+      <w:r>
+        <w:rPr>
+          <w:noProof/>
+        </w:rPr>
+        <mc:AlternateContent>
+          <mc:Choice Requires="wps">
+            <w:drawing>
+              <wp:anchor distT="0" distB="0" distL="114300" distR="114300" simplePos="0" relativeHeight="251666432" behindDoc="0" locked="0" layoutInCell="1" allowOverlap="1" wp14:anchorId="54B00759" wp14:editId="2B99FA10">
+                <wp:simplePos x="0" y="0"/>
+                <wp:positionH relativeFrom="margin">
+                  <wp:align>left</wp:align>
+                </wp:positionH>
+                <wp:positionV relativeFrom="paragraph">
+                  <wp:posOffset>584835</wp:posOffset>
+                </wp:positionV>
+                <wp:extent cx="1501140" cy="480060"/>
+                <wp:effectExtent l="0" t="0" r="22860" b="15240"/>
+                <wp:wrapNone/>
+                <wp:docPr id="1002869855" name="Text Box 1"/>
+                <wp:cNvGraphicFramePr/>
+                <a:graphic xmlns:a="http://schemas.openxmlformats.org/drawingml/2006/main">
+                  <a:graphicData uri="http://schemas.microsoft.com/office/word/2010/wordprocessingShape">
+                    <wps:wsp>
+                      <wps:cNvSpPr txBox="1"/>
+                      <wps:spPr>
+                        <a:xfrm>
+                          <a:off x="0" y="0"/>
+                          <a:ext cx="1501140" cy="480060"/>
+                        </a:xfrm>
+                        <a:prstGeom prst="rect">
+                          <a:avLst/>
+                        </a:prstGeom>
+                        <a:solidFill>
+                          <a:schemeClr val="lt1"/>
+                        </a:solidFill>
+                        <a:ln w="3175">
+                          <a:solidFill>
+                            <a:prstClr val="black"/>
+                          </a:solidFill>
+                        </a:ln>
+                      </wps:spPr>
+                      <wps:txbx>
+                        <w:txbxContent>
+                          <w:p>
+                            <w:pPr>
+                              <w:rPr>
+                                <w:i/>
+                                <w:iCs/>
+                                <w:lang w:val="en-US"/>
+                              </w:rPr>
+                            </w:pPr>
+                            <w:r>
+                              <w:rPr>
+                                <w:i/>
+                                <w:iCs/>
+                                <w:lang w:val="en-US"/>
+                              </w:rPr>
+                              <w:t>Choosing appropriate columns</w:t>
+                            </w:r>
+                            <w:r>
+                              <w:rPr>
+                                <w:i/>
+                                <w:iCs/>
+                                <w:lang w:val="en-US"/>
+                              </w:rPr>
+                              <w:t>:</w:t>
+                            </w:r>
+                          </w:p>
+                        </w:txbxContent>
+                      </wps:txbx>
+                      <wps:bodyPr rot="0" spcFirstLastPara="0" vertOverflow="overflow" horzOverflow="overflow" vert="horz" wrap="square" lIns="91440" tIns="45720" rIns="91440" bIns="45720" numCol="1" spcCol="0" rtlCol="0" fromWordArt="0" anchor="t" anchorCtr="0" forceAA="0" compatLnSpc="1">
+                        <a:prstTxWarp prst="textNoShape">
+                          <a:avLst/>
+                        </a:prstTxWarp>
+                        <a:noAutofit/>
+                      </wps:bodyPr>
+                    </wps:wsp>
+                  </a:graphicData>
+                </a:graphic>
+                <wp14:sizeRelH relativeFrom="margin">
+                  <wp14:pctWidth>0</wp14:pctWidth>
+                </wp14:sizeRelH>
+                <wp14:sizeRelV relativeFrom="margin">
+                  <wp14:pctHeight>0</wp14:pctHeight>
+                </wp14:sizeRelV>
+              </wp:anchor>
+            </w:drawing>
+          </mc:Choice>
+          <mc:Fallback>
+            <w:pict>
+              <v:shape w14:anchorId="54B00759" id="_x0000_s1031" type="#_x0000_t202" style="position:absolute;margin-left:0;margin-top:46.05pt;width:118.2pt;height:37.8pt;z-index:251666432;visibility:visible;mso-wrap-style:square;mso-width-percent:0;mso-height-percent:0;mso-wrap-distance-left:9pt;mso-wrap-distance-top:0;mso-wrap-distance-right:9pt;mso-wrap-distance-bottom:0;mso-position-horizontal:left;mso-position-horizontal-relative:margin;mso-position-vertical:absolute;mso-position-vertical-relative:text;mso-width-percent:0;mso-height-percent:0;mso-width-relative:margin;mso-height-relative:margin;v-text-anchor:top" o:gfxdata="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" fillcolor="white [3201]" strokeweight=".25pt">
+                <v:textbox>
+                  <w:txbxContent>
+                    <w:p>
+                      <w:pPr>
+                        <w:rPr>
+                          <w:i/>
+                          <w:iCs/>
+                          <w:lang w:val="en-US"/>
+                        </w:rPr>
+                      </w:pPr>
+                      <w:r>
+                        <w:rPr>
+                          <w:i/>
+                          <w:iCs/>
+                          <w:lang w:val="en-US"/>
+                        </w:rPr>
+                        <w:t>Choosing appropriate columns</w:t>
+                      </w:r>
+                      <w:r>
+                        <w:rPr>
+                          <w:i/>
+                          <w:iCs/>
+                          <w:lang w:val="en-US"/>
+                        </w:rPr>
+                        <w:t>:</w:t>
+                      </w:r>
+                    </w:p>
+                  </w:txbxContent>
+                </v:textbox>
+                <w10:wrap anchorx="margin"/>
+              </v:shape>
+            </w:pict>
+          </mc:Fallback>
+        </mc:AlternateContent>
+      </w:r>
+      <w:r>
+        <w:rPr>
+          <w:lang w:val="en-US"/>
+        </w:rPr>
+        <w:t>Below is a screenshot of choosing the appropriate columns for ‘Dim_</w:t>
+      </w:r>
+      <w:r>
+        <w:rPr>
+          <w:lang w:val="en-US"/>
+        </w:rPr>
+        <w:t>Admission</w:t>
+      </w:r>
+      <w:r>
+        <w:rPr>
+          <w:lang w:val="en-US"/>
+        </w:rPr>
+        <w:t>’ dimension table. Thereafter, I removed duplicate rows</w:t>
+      </w:r>
+      <w:r>
+        <w:rPr>
+          <w:lang w:val="en-US"/>
+        </w:rPr>
+        <w:t xml:space="preserve"> and </w:t>
+      </w:r>
+      <w:r>
+        <w:rPr>
+          <w:lang w:val="en-US"/>
+        </w:rPr>
+        <w:t>created a surrogate key to aid while creating a relationship between Fact_Encounter and Dim_Admission.</w:t>
+      </w:r>
+      <w:r>
+        <w:rPr>
+          <w:lang w:val="en-US"/>
+        </w:rPr>
+        <w:t xml:space="preserve"> </w:t>
+      </w:r>
+    </w:p>
+    <w:p>
+      <w:pPr>
+        <w:rPr>
+          <w:lang w:val="en-US"/>
+        </w:rPr>
+      </w:pPr>
+    </w:p>
+    <w:p>
+      <w:pPr>
+        <w:rPr>
+          <w:lang w:val="en-US"/>
+        </w:rPr>
+      </w:pPr>
+      <w:r>
+        <w:rPr>
+          <w:noProof/>
+        </w:rPr>
+        <w:t xml:space="preserve"> </w:t>
+      </w:r>
+      <w:r>
+        <w:rPr>
+          <w:noProof/>
+        </w:rPr>
+        <w:drawing>
+          <wp:inline distT="0" distB="0" distL="0" distR="0" wp14:anchorId="6F75FEFC" wp14:editId="311FC1EC">
+            <wp:extent cx="1325880" cy="2392680"/>
+            <wp:effectExtent l="0" t="0" r="7620" b="7620"/>
+            <wp:docPr id="1636714163" name="Picture 1"/>
+            <wp:cNvGraphicFramePr>
+              <a:graphicFrameLocks xmlns:a="http://schemas.openxmlformats.org/drawingml/2006/main" noChangeAspect="1"/>
+            </wp:cNvGraphicFramePr>
+            <a:graphic xmlns:a="http://schemas.openxmlformats.org/drawingml/2006/main">
+              <a:graphicData uri="http://schemas.openxmlformats.org/drawingml/2006/picture">
+                <pic:pic xmlns:pic="http://schemas.openxmlformats.org/drawingml/2006/picture">
+                  <pic:nvPicPr>
+                    <pic:cNvPr id="1636714163" name=""/>
+                    <pic:cNvPicPr/>
+                  </pic:nvPicPr>
+                  <pic:blipFill rotWithShape="1">
+                    <a:blip r:embed="rId8"/>
+                    <a:srcRect l="38156" t="10165" r="38710" b="15618"/>
+                    <a:stretch/>
+                  </pic:blipFill>
+                  <pic:spPr bwMode="auto">
+                    <a:xfrm>
+                      <a:off x="0" y="0"/>
+                      <a:ext cx="1325880" cy="2392680"/>
+                    </a:xfrm>
+                    <a:prstGeom prst="rect">
+                      <a:avLst/>
+                    </a:prstGeom>
+                    <a:ln>
+                      <a:noFill/>
+                    </a:ln>
+                    <a:extLst>
+                      <a:ext uri="{53640926-AAD7-44D8-BBD7-CCE9431645EC}">
+                        <a14:shadowObscured xmlns:a14="http://schemas.microsoft.com/office/drawing/2010/main"/>
+                      </a:ext>
+                    </a:extLst>
+                  </pic:spPr>
+                </pic:pic>
+              </a:graphicData>
+            </a:graphic>
+          </wp:inline>
+        </w:drawing>
+      </w:r>
+      <w:r>
+        <w:rPr>
+          <w:noProof/>
+        </w:rPr>
+        <w:t xml:space="preserve">                                   </w:t>
+      </w:r>
+      <w:r>
+        <w:rPr>
+          <w:noProof/>
+        </w:rPr>
+        <w:drawing>
+          <wp:inline distT="0" distB="0" distL="0" distR="0" wp14:anchorId="64B500D3" wp14:editId="0EED89F4">
+            <wp:extent cx="2811780" cy="2522220"/>
+            <wp:effectExtent l="0" t="0" r="7620" b="0"/>
+            <wp:docPr id="536979437" name="Picture 1"/>
+            <wp:cNvGraphicFramePr>
+              <a:graphicFrameLocks xmlns:a="http://schemas.openxmlformats.org/drawingml/2006/main" noChangeAspect="1"/>
+            </wp:cNvGraphicFramePr>
+            <a:graphic xmlns:a="http://schemas.openxmlformats.org/drawingml/2006/main">
+              <a:graphicData uri="http://schemas.openxmlformats.org/drawingml/2006/picture">
+                <pic:pic xmlns:pic="http://schemas.openxmlformats.org/drawingml/2006/picture">
+                  <pic:nvPicPr>
+                    <pic:cNvPr id="536979437" name=""/>
+                    <pic:cNvPicPr/>
+                  </pic:nvPicPr>
+                  <pic:blipFill rotWithShape="1">
+                    <a:blip r:embed="rId9"/>
+                    <a:srcRect l="10769" t="16781" r="40173" b="4984"/>
+                    <a:stretch/>
+                  </pic:blipFill>
+                  <pic:spPr bwMode="auto">
+                    <a:xfrm>
+                      <a:off x="0" y="0"/>
+                      <a:ext cx="2811780" cy="2522220"/>
+                    </a:xfrm>
+                    <a:prstGeom prst="rect">
+                      <a:avLst/>
+                    </a:prstGeom>
+                    <a:ln>
+                      <a:noFill/>
+                    </a:ln>
+                    <a:extLst>
+                      <a:ext uri="{53640926-AAD7-44D8-BBD7-CCE9431645EC}">
+                        <a14:shadowObscured xmlns:a14="http://schemas.microsoft.com/office/drawing/2010/main"/>
+                      </a:ext>
+                    </a:extLst>
+                  </pic:spPr>
+                </pic:pic>
+              </a:graphicData>
+            </a:graphic>
+          </wp:inline>
+        </w:drawing>
+      </w:r>
+    </w:p>
+    <w:p>
+      <w:pPr>
+        <w:rPr>
+          <w:lang w:val="en-US"/>
+        </w:rPr>
+      </w:pPr>
+    </w:p>
+    <w:p>
+      <w:pPr>
+        <w:rPr>
+          <w:lang w:val="en-US"/>
+        </w:rPr>
+      </w:pPr>
+    </w:p>
+    <w:p>
+      <w:pPr>
+        <w:rPr>
+          <w:lang w:val="en-US"/>
+        </w:rPr>
+      </w:pPr>
     </w:p>
     <w:p>
       <w:pPr>

</xml_diff>

<commit_message>
Data Modelling: Creating Dim_Diagnosis - Hetal
</commit_message>
<xml_diff>
--- a/2_Documented_modelling.docx
+++ b/2_Documented_modelling.docx
@@ -72,35 +72,64 @@
           <w:bCs/>
           <w:lang w:val="en-US"/>
         </w:rPr>
-        <w:t>Fact Table Creation (Fact_Encounter):</w:t>
-      </w:r>
-    </w:p>
-    <w:p>
-      <w:pPr>
-        <w:rPr>
-          <w:lang w:val="en-US"/>
-        </w:rPr>
-      </w:pPr>
-      <w:r>
-        <w:rPr>
-          <w:lang w:val="en-US"/>
-        </w:rPr>
-        <w:t>‘</w:t>
-      </w:r>
+        <w:t>Fact Table Creation (</w:t>
+      </w:r>
+      <w:proofErr w:type="spellStart"/>
       <w:r>
         <w:rPr>
           <w:b/>
           <w:bCs/>
           <w:lang w:val="en-US"/>
         </w:rPr>
-        <w:t xml:space="preserve">Fact_Encounter’ columns: </w:t>
-      </w:r>
+        <w:t>Fact_Encounter</w:t>
+      </w:r>
+      <w:proofErr w:type="spellEnd"/>
+      <w:r>
+        <w:rPr>
+          <w:b/>
+          <w:bCs/>
+          <w:lang w:val="en-US"/>
+        </w:rPr>
+        <w:t>):</w:t>
+      </w:r>
+    </w:p>
+    <w:p>
+      <w:pPr>
+        <w:rPr>
+          <w:lang w:val="en-US"/>
+        </w:rPr>
+      </w:pPr>
       <w:r>
         <w:rPr>
           <w:lang w:val="en-US"/>
         </w:rPr>
         <w:t>‘</w:t>
       </w:r>
+      <w:proofErr w:type="spellStart"/>
+      <w:r>
+        <w:rPr>
+          <w:b/>
+          <w:bCs/>
+          <w:lang w:val="en-US"/>
+        </w:rPr>
+        <w:t>Fact_Encounter</w:t>
+      </w:r>
+      <w:proofErr w:type="spellEnd"/>
+      <w:r>
+        <w:rPr>
+          <w:b/>
+          <w:bCs/>
+          <w:lang w:val="en-US"/>
+        </w:rPr>
+        <w:t xml:space="preserve">’ columns: </w:t>
+      </w:r>
+      <w:r>
+        <w:rPr>
+          <w:lang w:val="en-US"/>
+        </w:rPr>
+        <w:t>‘</w:t>
+      </w:r>
+      <w:proofErr w:type="spellStart"/>
       <w:r>
         <w:rPr>
           <w:i/>
@@ -109,6 +138,7 @@
         </w:rPr>
         <w:t>encounter_id</w:t>
       </w:r>
+      <w:proofErr w:type="spellEnd"/>
       <w:r>
         <w:rPr>
           <w:i/>
@@ -123,6 +153,7 @@
         </w:rPr>
         <w:t>’, ‘</w:t>
       </w:r>
+      <w:proofErr w:type="spellStart"/>
       <w:r>
         <w:rPr>
           <w:i/>
@@ -131,12 +162,14 @@
         </w:rPr>
         <w:t>patient_nbr</w:t>
       </w:r>
+      <w:proofErr w:type="spellEnd"/>
       <w:r>
         <w:rPr>
           <w:lang w:val="en-US"/>
         </w:rPr>
         <w:t>’, ‘</w:t>
       </w:r>
+      <w:proofErr w:type="spellStart"/>
       <w:r>
         <w:rPr>
           <w:i/>
@@ -145,12 +178,14 @@
         </w:rPr>
         <w:t>admission_type_id</w:t>
       </w:r>
+      <w:proofErr w:type="spellEnd"/>
       <w:r>
         <w:rPr>
           <w:lang w:val="en-US"/>
         </w:rPr>
         <w:t>’, ‘</w:t>
       </w:r>
+      <w:proofErr w:type="spellStart"/>
       <w:r>
         <w:rPr>
           <w:i/>
@@ -159,12 +194,14 @@
         </w:rPr>
         <w:t>admission_source_id</w:t>
       </w:r>
+      <w:proofErr w:type="spellEnd"/>
       <w:r>
         <w:rPr>
           <w:lang w:val="en-US"/>
         </w:rPr>
         <w:t>’, ‘</w:t>
       </w:r>
+      <w:proofErr w:type="spellStart"/>
       <w:r>
         <w:rPr>
           <w:i/>
@@ -173,6 +210,7 @@
         </w:rPr>
         <w:t>discharge_disposition_id</w:t>
       </w:r>
+      <w:proofErr w:type="spellEnd"/>
       <w:r>
         <w:rPr>
           <w:lang w:val="en-US"/>
@@ -221,6 +259,7 @@
         </w:rPr>
         <w:t>’, ‘</w:t>
       </w:r>
+      <w:proofErr w:type="spellStart"/>
       <w:r>
         <w:rPr>
           <w:i/>
@@ -229,12 +268,14 @@
         </w:rPr>
         <w:t>time_in_hospital</w:t>
       </w:r>
+      <w:proofErr w:type="spellEnd"/>
       <w:r>
         <w:rPr>
           <w:lang w:val="en-US"/>
         </w:rPr>
         <w:t>’, ‘</w:t>
       </w:r>
+      <w:proofErr w:type="spellStart"/>
       <w:r>
         <w:rPr>
           <w:i/>
@@ -243,12 +284,14 @@
         </w:rPr>
         <w:t>num_lab_procedures</w:t>
       </w:r>
+      <w:proofErr w:type="spellEnd"/>
       <w:r>
         <w:rPr>
           <w:lang w:val="en-US"/>
         </w:rPr>
         <w:t>’, ‘</w:t>
       </w:r>
+      <w:proofErr w:type="spellStart"/>
       <w:r>
         <w:rPr>
           <w:i/>
@@ -257,12 +300,14 @@
         </w:rPr>
         <w:t>num_procedures</w:t>
       </w:r>
+      <w:proofErr w:type="spellEnd"/>
       <w:r>
         <w:rPr>
           <w:lang w:val="en-US"/>
         </w:rPr>
         <w:t>’, ‘</w:t>
       </w:r>
+      <w:proofErr w:type="spellStart"/>
       <w:r>
         <w:rPr>
           <w:i/>
@@ -271,12 +316,14 @@
         </w:rPr>
         <w:t>num_medications</w:t>
       </w:r>
+      <w:proofErr w:type="spellEnd"/>
       <w:r>
         <w:rPr>
           <w:lang w:val="en-US"/>
         </w:rPr>
         <w:t>’, ‘</w:t>
       </w:r>
+      <w:proofErr w:type="spellStart"/>
       <w:r>
         <w:rPr>
           <w:i/>
@@ -285,12 +332,14 @@
         </w:rPr>
         <w:t>number_outpatient</w:t>
       </w:r>
+      <w:proofErr w:type="spellEnd"/>
       <w:r>
         <w:rPr>
           <w:lang w:val="en-US"/>
         </w:rPr>
         <w:t>’, ‘</w:t>
       </w:r>
+      <w:proofErr w:type="spellStart"/>
       <w:r>
         <w:rPr>
           <w:i/>
@@ -299,12 +348,14 @@
         </w:rPr>
         <w:t>number_emergency</w:t>
       </w:r>
+      <w:proofErr w:type="spellEnd"/>
       <w:r>
         <w:rPr>
           <w:lang w:val="en-US"/>
         </w:rPr>
         <w:t>’, ‘</w:t>
       </w:r>
+      <w:proofErr w:type="spellStart"/>
       <w:r>
         <w:rPr>
           <w:i/>
@@ -313,12 +364,14 @@
         </w:rPr>
         <w:t>number_inpatient</w:t>
       </w:r>
+      <w:proofErr w:type="spellEnd"/>
       <w:r>
         <w:rPr>
           <w:lang w:val="en-US"/>
         </w:rPr>
         <w:t>’, ‘</w:t>
       </w:r>
+      <w:proofErr w:type="spellStart"/>
       <w:r>
         <w:rPr>
           <w:i/>
@@ -327,6 +380,7 @@
         </w:rPr>
         <w:t>number_diagnoses</w:t>
       </w:r>
+      <w:proofErr w:type="spellEnd"/>
       <w:r>
         <w:rPr>
           <w:lang w:val="en-US"/>
@@ -433,7 +487,25 @@
                                 <w:iCs/>
                                 <w:lang w:val="en-US"/>
                               </w:rPr>
-                              <w:t xml:space="preserve"> the ‘Fact_Encounter’ table</w:t>
+                              <w:t xml:space="preserve"> the ‘</w:t>
+                            </w:r>
+                            <w:proofErr w:type="spellStart"/>
+                            <w:r>
+                              <w:rPr>
+                                <w:i/>
+                                <w:iCs/>
+                                <w:lang w:val="en-US"/>
+                              </w:rPr>
+                              <w:t>Fact_Encounter</w:t>
+                            </w:r>
+                            <w:proofErr w:type="spellEnd"/>
+                            <w:r>
+                              <w:rPr>
+                                <w:i/>
+                                <w:iCs/>
+                                <w:lang w:val="en-US"/>
+                              </w:rPr>
+                              <w:t>’ table</w:t>
                             </w:r>
                             <w:r>
                               <w:rPr>
@@ -503,7 +575,25 @@
                           <w:iCs/>
                           <w:lang w:val="en-US"/>
                         </w:rPr>
-                        <w:t xml:space="preserve"> the ‘Fact_Encounter’ table</w:t>
+                        <w:t xml:space="preserve"> the ‘</w:t>
+                      </w:r>
+                      <w:proofErr w:type="spellStart"/>
+                      <w:r>
+                        <w:rPr>
+                          <w:i/>
+                          <w:iCs/>
+                          <w:lang w:val="en-US"/>
+                        </w:rPr>
+                        <w:t>Fact_Encounter</w:t>
+                      </w:r>
+                      <w:proofErr w:type="spellEnd"/>
+                      <w:r>
+                        <w:rPr>
+                          <w:i/>
+                          <w:iCs/>
+                          <w:lang w:val="en-US"/>
+                        </w:rPr>
+                        <w:t>’ table</w:t>
                       </w:r>
                       <w:r>
                         <w:rPr>
@@ -525,7 +615,21 @@
         <w:rPr>
           <w:lang w:val="en-US"/>
         </w:rPr>
-        <w:t>Below is a screenshot of choosing the appropriate columns for ‘Fact_Encounter’ table. I kept numeric/measurable attributes and removed descriptive attributes.</w:t>
+        <w:t>Below is a screenshot of choosing the appropriate columns for ‘</w:t>
+      </w:r>
+      <w:proofErr w:type="spellStart"/>
+      <w:r>
+        <w:rPr>
+          <w:lang w:val="en-US"/>
+        </w:rPr>
+        <w:t>Fact_Encounter</w:t>
+      </w:r>
+      <w:proofErr w:type="spellEnd"/>
+      <w:r>
+        <w:rPr>
+          <w:lang w:val="en-US"/>
+        </w:rPr>
+        <w:t>’ table. I kept numeric/measurable attributes and removed descriptive attributes.</w:t>
       </w:r>
     </w:p>
     <w:p>
@@ -874,7 +978,25 @@
           <w:lang w:val="en-US"/>
         </w:rPr>
         <w:lastRenderedPageBreak/>
-        <w:t>Building ‘Dim_Patient’:</w:t>
+        <w:t>Building ‘</w:t>
+      </w:r>
+      <w:proofErr w:type="spellStart"/>
+      <w:r>
+        <w:rPr>
+          <w:b/>
+          <w:bCs/>
+          <w:lang w:val="en-US"/>
+        </w:rPr>
+        <w:t>Dim_Patient</w:t>
+      </w:r>
+      <w:proofErr w:type="spellEnd"/>
+      <w:r>
+        <w:rPr>
+          <w:b/>
+          <w:bCs/>
+          <w:lang w:val="en-US"/>
+        </w:rPr>
+        <w:t>’:</w:t>
       </w:r>
     </w:p>
     <w:p>
@@ -889,27 +1011,23 @@
         </w:rPr>
         <w:t>This table contains only patient demographic attributes which include: ‘</w:t>
       </w:r>
+      <w:proofErr w:type="spellStart"/>
       <w:r>
         <w:rPr>
           <w:i/>
           <w:iCs/>
           <w:lang w:val="en-US"/>
         </w:rPr>
-        <w:t>patient_nbr (PK)</w:t>
-      </w:r>
-      <w:r>
-        <w:rPr>
-          <w:lang w:val="en-US"/>
-        </w:rPr>
-        <w:t>’, ‘</w:t>
-      </w:r>
+        <w:t>patient_nbr</w:t>
+      </w:r>
+      <w:proofErr w:type="spellEnd"/>
       <w:r>
         <w:rPr>
           <w:i/>
           <w:iCs/>
           <w:lang w:val="en-US"/>
         </w:rPr>
-        <w:t>race</w:t>
+        <w:t xml:space="preserve"> (PK)</w:t>
       </w:r>
       <w:r>
         <w:rPr>
@@ -923,7 +1041,7 @@
           <w:iCs/>
           <w:lang w:val="en-US"/>
         </w:rPr>
-        <w:t>gender</w:t>
+        <w:t>race</w:t>
       </w:r>
       <w:r>
         <w:rPr>
@@ -937,15 +1055,22 @@
           <w:iCs/>
           <w:lang w:val="en-US"/>
         </w:rPr>
-        <w:t>A</w:t>
-      </w:r>
+        <w:t>gender</w:t>
+      </w:r>
+      <w:r>
+        <w:rPr>
+          <w:lang w:val="en-US"/>
+        </w:rPr>
+        <w:t>’, ‘</w:t>
+      </w:r>
+      <w:proofErr w:type="spellStart"/>
       <w:r>
         <w:rPr>
           <w:i/>
           <w:iCs/>
           <w:lang w:val="en-US"/>
         </w:rPr>
-        <w:t>ge_</w:t>
+        <w:t>A</w:t>
       </w:r>
       <w:r>
         <w:rPr>
@@ -953,7 +1078,7 @@
           <w:iCs/>
           <w:lang w:val="en-US"/>
         </w:rPr>
-        <w:t>M</w:t>
+        <w:t>ge_</w:t>
       </w:r>
       <w:r>
         <w:rPr>
@@ -961,13 +1086,7 @@
           <w:iCs/>
           <w:lang w:val="en-US"/>
         </w:rPr>
-        <w:t>idpoint</w:t>
-      </w:r>
-      <w:r>
-        <w:rPr>
-          <w:lang w:val="en-US"/>
-        </w:rPr>
-        <w:t>’, ‘</w:t>
+        <w:t>M</w:t>
       </w:r>
       <w:r>
         <w:rPr>
@@ -975,8 +1094,25 @@
           <w:iCs/>
           <w:lang w:val="en-US"/>
         </w:rPr>
+        <w:t>idpoint</w:t>
+      </w:r>
+      <w:proofErr w:type="spellEnd"/>
+      <w:r>
+        <w:rPr>
+          <w:lang w:val="en-US"/>
+        </w:rPr>
+        <w:t>’, ‘</w:t>
+      </w:r>
+      <w:proofErr w:type="spellStart"/>
+      <w:r>
+        <w:rPr>
+          <w:i/>
+          <w:iCs/>
+          <w:lang w:val="en-US"/>
+        </w:rPr>
         <w:t>payer_code</w:t>
       </w:r>
+      <w:proofErr w:type="spellEnd"/>
       <w:r>
         <w:rPr>
           <w:lang w:val="en-US"/>
@@ -996,11 +1132,19 @@
         </w:rPr>
         <w:t>Below is a screenshot of choosing the appropriate columns for ‘</w:t>
       </w:r>
-      <w:r>
-        <w:rPr>
-          <w:lang w:val="en-US"/>
-        </w:rPr>
-        <w:t>Dim_Patient’ dimension</w:t>
+      <w:proofErr w:type="spellStart"/>
+      <w:r>
+        <w:rPr>
+          <w:lang w:val="en-US"/>
+        </w:rPr>
+        <w:t>Dim_Patient</w:t>
+      </w:r>
+      <w:proofErr w:type="spellEnd"/>
+      <w:r>
+        <w:rPr>
+          <w:lang w:val="en-US"/>
+        </w:rPr>
+        <w:t>’ dimension</w:t>
       </w:r>
       <w:r>
         <w:rPr>
@@ -1012,7 +1156,21 @@
         <w:rPr>
           <w:lang w:val="en-US"/>
         </w:rPr>
-        <w:t>Thereafter, I removed duplicate rows to ensure each patient appears once, all demographics are consistent, fact table can safely reference patient_nbr, and there are no broken relationships.</w:t>
+        <w:t xml:space="preserve">Thereafter, I removed duplicate rows to ensure each patient appears once, all demographics are consistent, fact table can safely reference </w:t>
+      </w:r>
+      <w:proofErr w:type="spellStart"/>
+      <w:r>
+        <w:rPr>
+          <w:lang w:val="en-US"/>
+        </w:rPr>
+        <w:t>patient_nbr</w:t>
+      </w:r>
+      <w:proofErr w:type="spellEnd"/>
+      <w:r>
+        <w:rPr>
+          <w:lang w:val="en-US"/>
+        </w:rPr>
+        <w:t>, and there are no broken relationships.</w:t>
       </w:r>
     </w:p>
     <w:p>
@@ -1083,6 +1241,7 @@
                               </w:rPr>
                               <w:t>Screenshot the ‘</w:t>
                             </w:r>
+                            <w:proofErr w:type="spellStart"/>
                             <w:r>
                               <w:rPr>
                                 <w:i/>
@@ -1091,6 +1250,7 @@
                               </w:rPr>
                               <w:t>Dim_Patient</w:t>
                             </w:r>
+                            <w:proofErr w:type="spellEnd"/>
                             <w:r>
                               <w:rPr>
                                 <w:i/>
@@ -1141,6 +1301,7 @@
                         </w:rPr>
                         <w:t>Screenshot the ‘</w:t>
                       </w:r>
+                      <w:proofErr w:type="spellStart"/>
                       <w:r>
                         <w:rPr>
                           <w:i/>
@@ -1149,6 +1310,7 @@
                         </w:rPr>
                         <w:t>Dim_Patient</w:t>
                       </w:r>
+                      <w:proofErr w:type="spellEnd"/>
                       <w:r>
                         <w:rPr>
                           <w:i/>
@@ -1426,15 +1588,16 @@
           <w:bCs/>
           <w:lang w:val="en-US"/>
         </w:rPr>
-        <w:t>Building ‘Dim_</w:t>
-      </w:r>
+        <w:t>Building ‘</w:t>
+      </w:r>
+      <w:proofErr w:type="spellStart"/>
       <w:r>
         <w:rPr>
           <w:b/>
           <w:bCs/>
           <w:lang w:val="en-US"/>
         </w:rPr>
-        <w:t>Admission</w:t>
+        <w:t>Dim_</w:t>
       </w:r>
       <w:r>
         <w:rPr>
@@ -1442,6 +1605,15 @@
           <w:bCs/>
           <w:lang w:val="en-US"/>
         </w:rPr>
+        <w:t>Admission</w:t>
+      </w:r>
+      <w:proofErr w:type="spellEnd"/>
+      <w:r>
+        <w:rPr>
+          <w:b/>
+          <w:bCs/>
+          <w:lang w:val="en-US"/>
+        </w:rPr>
         <w:t>’:</w:t>
       </w:r>
     </w:p>
@@ -1457,6 +1629,7 @@
         </w:rPr>
         <w:t xml:space="preserve"> This table categorizes how the patient entered and exited the hospital. Attributes include: ‘</w:t>
       </w:r>
+      <w:proofErr w:type="spellStart"/>
       <w:r>
         <w:rPr>
           <w:i/>
@@ -1465,12 +1638,14 @@
         </w:rPr>
         <w:t>admission_type_id</w:t>
       </w:r>
+      <w:proofErr w:type="spellEnd"/>
       <w:r>
         <w:rPr>
           <w:lang w:val="en-US"/>
         </w:rPr>
         <w:t>’, ‘</w:t>
       </w:r>
+      <w:proofErr w:type="spellStart"/>
       <w:r>
         <w:rPr>
           <w:i/>
@@ -1479,12 +1654,14 @@
         </w:rPr>
         <w:t>admission_source_id</w:t>
       </w:r>
+      <w:proofErr w:type="spellEnd"/>
       <w:r>
         <w:rPr>
           <w:lang w:val="en-US"/>
         </w:rPr>
         <w:t>’, ‘</w:t>
       </w:r>
+      <w:proofErr w:type="spellStart"/>
       <w:r>
         <w:rPr>
           <w:i/>
@@ -1493,12 +1670,14 @@
         </w:rPr>
         <w:t>discharge_disposition_id</w:t>
       </w:r>
+      <w:proofErr w:type="spellEnd"/>
       <w:r>
         <w:rPr>
           <w:lang w:val="en-US"/>
         </w:rPr>
         <w:t>’, ‘</w:t>
       </w:r>
+      <w:proofErr w:type="spellStart"/>
       <w:r>
         <w:rPr>
           <w:i/>
@@ -1507,6 +1686,7 @@
         </w:rPr>
         <w:t>Admission_ID</w:t>
       </w:r>
+      <w:proofErr w:type="spellEnd"/>
       <w:r>
         <w:rPr>
           <w:lang w:val="en-US"/>
@@ -1527,16 +1707,16 @@
         <mc:AlternateContent>
           <mc:Choice Requires="wps">
             <w:drawing>
-              <wp:anchor distT="0" distB="0" distL="114300" distR="114300" simplePos="0" relativeHeight="251668480" behindDoc="0" locked="0" layoutInCell="1" allowOverlap="1" wp14:anchorId="5C570E18" wp14:editId="538ECD2B">
+              <wp:anchor distT="0" distB="0" distL="114300" distR="114300" simplePos="0" relativeHeight="251668480" behindDoc="0" locked="0" layoutInCell="1" allowOverlap="1" wp14:anchorId="5C570E18" wp14:editId="4938EEFE">
                 <wp:simplePos x="0" y="0"/>
                 <wp:positionH relativeFrom="column">
-                  <wp:posOffset>2042160</wp:posOffset>
+                  <wp:posOffset>1935480</wp:posOffset>
                 </wp:positionH>
                 <wp:positionV relativeFrom="paragraph">
                   <wp:posOffset>593725</wp:posOffset>
                 </wp:positionV>
-                <wp:extent cx="3406140" cy="342900"/>
-                <wp:effectExtent l="0" t="0" r="22860" b="19050"/>
+                <wp:extent cx="3512820" cy="342900"/>
+                <wp:effectExtent l="0" t="0" r="11430" b="19050"/>
                 <wp:wrapNone/>
                 <wp:docPr id="406606877" name="Text Box 2"/>
                 <wp:cNvGraphicFramePr/>
@@ -1547,7 +1727,7 @@
                       <wps:spPr>
                         <a:xfrm>
                           <a:off x="0" y="0"/>
-                          <a:ext cx="3406140" cy="342900"/>
+                          <a:ext cx="3512820" cy="342900"/>
                         </a:xfrm>
                         <a:prstGeom prst="rect">
                           <a:avLst/>
@@ -1577,8 +1757,25 @@
                                 <w:iCs/>
                                 <w:lang w:val="en-US"/>
                               </w:rPr>
-                              <w:t>Screenshot the ‘</w:t>
+                              <w:t>Screenshot</w:t>
                             </w:r>
+                            <w:r>
+                              <w:rPr>
+                                <w:i/>
+                                <w:iCs/>
+                                <w:lang w:val="en-US"/>
+                              </w:rPr>
+                              <w:t xml:space="preserve"> of</w:t>
+                            </w:r>
+                            <w:r>
+                              <w:rPr>
+                                <w:i/>
+                                <w:iCs/>
+                                <w:lang w:val="en-US"/>
+                              </w:rPr>
+                              <w:t xml:space="preserve"> the ‘</w:t>
+                            </w:r>
+                            <w:proofErr w:type="spellStart"/>
                             <w:r>
                               <w:rPr>
                                 <w:i/>
@@ -1595,6 +1792,7 @@
                               </w:rPr>
                               <w:t>Admission</w:t>
                             </w:r>
+                            <w:proofErr w:type="spellEnd"/>
                             <w:r>
                               <w:rPr>
                                 <w:i/>
@@ -1626,7 +1824,7 @@
           </mc:Choice>
           <mc:Fallback>
             <w:pict>
-              <v:shape w14:anchorId="5C570E18" id="_x0000_s1030" type="#_x0000_t202" style="position:absolute;margin-left:160.8pt;margin-top:46.75pt;width:268.2pt;height:27pt;z-index:251668480;visibility:visible;mso-wrap-style:square;mso-width-percent:0;mso-height-percent:0;mso-wrap-distance-left:9pt;mso-wrap-distance-top:0;mso-wrap-distance-right:9pt;mso-wrap-distance-bottom:0;mso-position-horizontal:absolute;mso-position-horizontal-relative:text;mso-position-vertical:absolute;mso-position-vertical-relative:text;mso-width-percent:0;mso-height-percent:0;mso-width-relative:margin;mso-height-relative:margin;v-text-anchor:top" o:gfxdata="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" fillcolor="white [3201]" strokeweight=".5pt">
+              <v:shape w14:anchorId="5C570E18" id="_x0000_s1030" type="#_x0000_t202" style="position:absolute;margin-left:152.4pt;margin-top:46.75pt;width:276.6pt;height:27pt;z-index:251668480;visibility:visible;mso-wrap-style:square;mso-width-percent:0;mso-height-percent:0;mso-wrap-distance-left:9pt;mso-wrap-distance-top:0;mso-wrap-distance-right:9pt;mso-wrap-distance-bottom:0;mso-position-horizontal:absolute;mso-position-horizontal-relative:text;mso-position-vertical:absolute;mso-position-vertical-relative:text;mso-width-percent:0;mso-height-percent:0;mso-width-relative:margin;mso-height-relative:margin;v-text-anchor:top" o:gfxdata="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" fillcolor="white [3201]" strokeweight=".5pt">
                 <v:textbox>
                   <w:txbxContent>
                     <w:p>
@@ -1643,8 +1841,25 @@
                           <w:iCs/>
                           <w:lang w:val="en-US"/>
                         </w:rPr>
-                        <w:t>Screenshot the ‘</w:t>
+                        <w:t>Screenshot</w:t>
                       </w:r>
+                      <w:r>
+                        <w:rPr>
+                          <w:i/>
+                          <w:iCs/>
+                          <w:lang w:val="en-US"/>
+                        </w:rPr>
+                        <w:t xml:space="preserve"> of</w:t>
+                      </w:r>
+                      <w:r>
+                        <w:rPr>
+                          <w:i/>
+                          <w:iCs/>
+                          <w:lang w:val="en-US"/>
+                        </w:rPr>
+                        <w:t xml:space="preserve"> the ‘</w:t>
+                      </w:r>
+                      <w:proofErr w:type="spellStart"/>
                       <w:r>
                         <w:rPr>
                           <w:i/>
@@ -1661,6 +1876,7 @@
                         </w:rPr>
                         <w:t>Admission</w:t>
                       </w:r>
+                      <w:proofErr w:type="spellEnd"/>
                       <w:r>
                         <w:rPr>
                           <w:i/>
@@ -1807,7 +2023,14 @@
         <w:rPr>
           <w:lang w:val="en-US"/>
         </w:rPr>
-        <w:t>Below is a screenshot of choosing the appropriate columns for ‘Dim_</w:t>
+        <w:t>Below is a screenshot of choosing the appropriate columns for ‘</w:t>
+      </w:r>
+      <w:proofErr w:type="spellStart"/>
+      <w:r>
+        <w:rPr>
+          <w:lang w:val="en-US"/>
+        </w:rPr>
+        <w:t>Dim_</w:t>
       </w:r>
       <w:r>
         <w:rPr>
@@ -1815,6 +2038,7 @@
         </w:rPr>
         <w:t>Admission</w:t>
       </w:r>
+      <w:proofErr w:type="spellEnd"/>
       <w:r>
         <w:rPr>
           <w:lang w:val="en-US"/>
@@ -1831,7 +2055,35 @@
         <w:rPr>
           <w:lang w:val="en-US"/>
         </w:rPr>
-        <w:t>created a surrogate key to aid while creating a relationship between Fact_Encounter and Dim_Admission.</w:t>
+        <w:t xml:space="preserve">created a surrogate key to aid while creating a relationship between </w:t>
+      </w:r>
+      <w:proofErr w:type="spellStart"/>
+      <w:r>
+        <w:rPr>
+          <w:lang w:val="en-US"/>
+        </w:rPr>
+        <w:t>Fact_Encounter</w:t>
+      </w:r>
+      <w:proofErr w:type="spellEnd"/>
+      <w:r>
+        <w:rPr>
+          <w:lang w:val="en-US"/>
+        </w:rPr>
+        <w:t xml:space="preserve"> and </w:t>
+      </w:r>
+      <w:proofErr w:type="spellStart"/>
+      <w:r>
+        <w:rPr>
+          <w:lang w:val="en-US"/>
+        </w:rPr>
+        <w:t>Dim_Admission</w:t>
+      </w:r>
+      <w:proofErr w:type="spellEnd"/>
+      <w:r>
+        <w:rPr>
+          <w:lang w:val="en-US"/>
+        </w:rPr>
+        <w:t>.</w:t>
       </w:r>
       <w:r>
         <w:rPr>
@@ -1959,6 +2211,713 @@
           </wp:inline>
         </w:drawing>
       </w:r>
+    </w:p>
+    <w:p>
+      <w:pPr>
+        <w:rPr>
+          <w:b/>
+          <w:bCs/>
+          <w:lang w:val="en-US"/>
+        </w:rPr>
+      </w:pPr>
+      <w:r>
+        <w:rPr>
+          <w:b/>
+          <w:bCs/>
+          <w:lang w:val="en-US"/>
+        </w:rPr>
+        <w:lastRenderedPageBreak/>
+        <w:t>Building ‘</w:t>
+      </w:r>
+      <w:proofErr w:type="spellStart"/>
+      <w:r>
+        <w:rPr>
+          <w:b/>
+          <w:bCs/>
+          <w:lang w:val="en-US"/>
+        </w:rPr>
+        <w:t>Dim_</w:t>
+      </w:r>
+      <w:r>
+        <w:rPr>
+          <w:b/>
+          <w:bCs/>
+          <w:lang w:val="en-US"/>
+        </w:rPr>
+        <w:t>Diagnosis</w:t>
+      </w:r>
+      <w:proofErr w:type="spellEnd"/>
+      <w:r>
+        <w:rPr>
+          <w:b/>
+          <w:bCs/>
+          <w:lang w:val="en-US"/>
+        </w:rPr>
+        <w:t>’:</w:t>
+      </w:r>
+    </w:p>
+    <w:p>
+      <w:pPr>
+        <w:rPr>
+          <w:lang w:val="en-US"/>
+        </w:rPr>
+      </w:pPr>
+      <w:r>
+        <w:rPr>
+          <w:lang w:val="en-US"/>
+        </w:rPr>
+        <w:t xml:space="preserve"> This table</w:t>
+      </w:r>
+      <w:r>
+        <w:rPr>
+          <w:lang w:val="en-US"/>
+        </w:rPr>
+        <w:t xml:space="preserve"> </w:t>
+      </w:r>
+      <w:r>
+        <w:rPr>
+          <w:lang w:val="en-US"/>
+        </w:rPr>
+        <w:t>has categorical diagnostic labels</w:t>
+      </w:r>
+      <w:r>
+        <w:rPr>
+          <w:lang w:val="en-US"/>
+        </w:rPr>
+        <w:t>. Attributes include:</w:t>
+      </w:r>
+      <w:r>
+        <w:rPr>
+          <w:lang w:val="en-US"/>
+        </w:rPr>
+        <w:t xml:space="preserve"> ‘</w:t>
+      </w:r>
+      <w:r>
+        <w:rPr>
+          <w:i/>
+          <w:iCs/>
+          <w:lang w:val="en-US"/>
+        </w:rPr>
+        <w:t>diag_1</w:t>
+      </w:r>
+      <w:r>
+        <w:rPr>
+          <w:lang w:val="en-US"/>
+        </w:rPr>
+        <w:t>’, ‘</w:t>
+      </w:r>
+      <w:r>
+        <w:rPr>
+          <w:i/>
+          <w:iCs/>
+          <w:lang w:val="en-US"/>
+        </w:rPr>
+        <w:t>diag_2</w:t>
+      </w:r>
+      <w:r>
+        <w:rPr>
+          <w:lang w:val="en-US"/>
+        </w:rPr>
+        <w:t>’, ‘</w:t>
+      </w:r>
+      <w:r>
+        <w:rPr>
+          <w:i/>
+          <w:iCs/>
+          <w:lang w:val="en-US"/>
+        </w:rPr>
+        <w:t>diag_3</w:t>
+      </w:r>
+      <w:r>
+        <w:rPr>
+          <w:lang w:val="en-US"/>
+        </w:rPr>
+        <w:t>’, ‘</w:t>
+      </w:r>
+      <w:proofErr w:type="spellStart"/>
+      <w:r>
+        <w:rPr>
+          <w:i/>
+          <w:iCs/>
+          <w:lang w:val="en-US"/>
+        </w:rPr>
+        <w:t>Diagnosis_ID</w:t>
+      </w:r>
+      <w:proofErr w:type="spellEnd"/>
+      <w:r>
+        <w:rPr>
+          <w:lang w:val="en-US"/>
+        </w:rPr>
+        <w:t>’</w:t>
+      </w:r>
+      <w:r>
+        <w:rPr>
+          <w:lang w:val="en-US"/>
+        </w:rPr>
+        <w:t>.</w:t>
+      </w:r>
+    </w:p>
+    <w:p>
+      <w:pPr>
+        <w:rPr>
+          <w:lang w:val="en-US"/>
+        </w:rPr>
+      </w:pPr>
+      <w:r>
+        <w:rPr>
+          <w:lang w:val="en-US"/>
+        </w:rPr>
+        <w:t>B</w:t>
+      </w:r>
+      <w:r>
+        <w:rPr>
+          <w:lang w:val="en-US"/>
+        </w:rPr>
+        <w:t>elow is a screenshot of choosing the appropriate columns for ‘</w:t>
+      </w:r>
+      <w:proofErr w:type="spellStart"/>
+      <w:r>
+        <w:rPr>
+          <w:lang w:val="en-US"/>
+        </w:rPr>
+        <w:t>Dim_</w:t>
+      </w:r>
+      <w:r>
+        <w:rPr>
+          <w:lang w:val="en-US"/>
+        </w:rPr>
+        <w:t>Diagnosis</w:t>
+      </w:r>
+      <w:proofErr w:type="spellEnd"/>
+      <w:r>
+        <w:rPr>
+          <w:lang w:val="en-US"/>
+        </w:rPr>
+        <w:t xml:space="preserve">’ dimension table. Thereafter, I removed duplicate rows and created a surrogate key to aid while creating a relationship between </w:t>
+      </w:r>
+      <w:proofErr w:type="spellStart"/>
+      <w:r>
+        <w:rPr>
+          <w:lang w:val="en-US"/>
+        </w:rPr>
+        <w:t>Fact_Encounter</w:t>
+      </w:r>
+      <w:proofErr w:type="spellEnd"/>
+      <w:r>
+        <w:rPr>
+          <w:lang w:val="en-US"/>
+        </w:rPr>
+        <w:t xml:space="preserve"> and </w:t>
+      </w:r>
+      <w:proofErr w:type="spellStart"/>
+      <w:r>
+        <w:rPr>
+          <w:lang w:val="en-US"/>
+        </w:rPr>
+        <w:t>Dim_</w:t>
+      </w:r>
+      <w:r>
+        <w:rPr>
+          <w:lang w:val="en-US"/>
+        </w:rPr>
+        <w:t>Diagnosis</w:t>
+      </w:r>
+      <w:proofErr w:type="spellEnd"/>
+      <w:r>
+        <w:rPr>
+          <w:lang w:val="en-US"/>
+        </w:rPr>
+        <w:t xml:space="preserve">. </w:t>
+      </w:r>
+    </w:p>
+    <w:p>
+      <w:pPr>
+        <w:rPr>
+          <w:lang w:val="en-US"/>
+        </w:rPr>
+      </w:pPr>
+      <w:r>
+        <w:rPr>
+          <w:noProof/>
+        </w:rPr>
+        <mc:AlternateContent>
+          <mc:Choice Requires="wps">
+            <w:drawing>
+              <wp:anchor distT="0" distB="0" distL="114300" distR="114300" simplePos="0" relativeHeight="251672576" behindDoc="0" locked="0" layoutInCell="1" allowOverlap="1" wp14:anchorId="15931BD9" wp14:editId="024ED871">
+                <wp:simplePos x="0" y="0"/>
+                <wp:positionH relativeFrom="column">
+                  <wp:posOffset>1783080</wp:posOffset>
+                </wp:positionH>
+                <wp:positionV relativeFrom="paragraph">
+                  <wp:posOffset>6985</wp:posOffset>
+                </wp:positionV>
+                <wp:extent cx="3512820" cy="342900"/>
+                <wp:effectExtent l="0" t="0" r="11430" b="19050"/>
+                <wp:wrapNone/>
+                <wp:docPr id="1067158044" name="Text Box 2"/>
+                <wp:cNvGraphicFramePr/>
+                <a:graphic xmlns:a="http://schemas.openxmlformats.org/drawingml/2006/main">
+                  <a:graphicData uri="http://schemas.microsoft.com/office/word/2010/wordprocessingShape">
+                    <wps:wsp>
+                      <wps:cNvSpPr txBox="1"/>
+                      <wps:spPr>
+                        <a:xfrm>
+                          <a:off x="0" y="0"/>
+                          <a:ext cx="3512820" cy="342900"/>
+                        </a:xfrm>
+                        <a:prstGeom prst="rect">
+                          <a:avLst/>
+                        </a:prstGeom>
+                        <a:solidFill>
+                          <a:schemeClr val="lt1"/>
+                        </a:solidFill>
+                        <a:ln w="6350">
+                          <a:solidFill>
+                            <a:prstClr val="black"/>
+                          </a:solidFill>
+                        </a:ln>
+                      </wps:spPr>
+                      <wps:txbx>
+                        <w:txbxContent>
+                          <w:p>
+                            <w:pPr>
+                              <w:rPr>
+                                <w:i/>
+                                <w:iCs/>
+                                <w:lang w:val="en-US"/>
+                              </w:rPr>
+                            </w:pPr>
+                            <w:r>
+                              <w:rPr>
+                                <w:i/>
+                                <w:iCs/>
+                                <w:lang w:val="en-US"/>
+                              </w:rPr>
+                              <w:t>Screenshot</w:t>
+                            </w:r>
+                            <w:r>
+                              <w:rPr>
+                                <w:i/>
+                                <w:iCs/>
+                                <w:lang w:val="en-US"/>
+                              </w:rPr>
+                              <w:t xml:space="preserve"> of</w:t>
+                            </w:r>
+                            <w:r>
+                              <w:rPr>
+                                <w:i/>
+                                <w:iCs/>
+                                <w:lang w:val="en-US"/>
+                              </w:rPr>
+                              <w:t xml:space="preserve"> the ‘</w:t>
+                            </w:r>
+                            <w:proofErr w:type="spellStart"/>
+                            <w:r>
+                              <w:rPr>
+                                <w:i/>
+                                <w:iCs/>
+                                <w:lang w:val="en-US"/>
+                              </w:rPr>
+                              <w:t>Dim_</w:t>
+                            </w:r>
+                            <w:r>
+                              <w:rPr>
+                                <w:i/>
+                                <w:iCs/>
+                                <w:lang w:val="en-US"/>
+                              </w:rPr>
+                              <w:t>Diagnosis</w:t>
+                            </w:r>
+                            <w:proofErr w:type="spellEnd"/>
+                            <w:r>
+                              <w:rPr>
+                                <w:i/>
+                                <w:iCs/>
+                                <w:lang w:val="en-US"/>
+                              </w:rPr>
+                              <w:t>’ table after creating it:</w:t>
+                            </w:r>
+                          </w:p>
+                        </w:txbxContent>
+                      </wps:txbx>
+                      <wps:bodyPr rot="0" spcFirstLastPara="0" vertOverflow="overflow" horzOverflow="overflow" vert="horz" wrap="square" lIns="91440" tIns="45720" rIns="91440" bIns="45720" numCol="1" spcCol="0" rtlCol="0" fromWordArt="0" anchor="t" anchorCtr="0" forceAA="0" compatLnSpc="1">
+                        <a:prstTxWarp prst="textNoShape">
+                          <a:avLst/>
+                        </a:prstTxWarp>
+                        <a:noAutofit/>
+                      </wps:bodyPr>
+                    </wps:wsp>
+                  </a:graphicData>
+                </a:graphic>
+                <wp14:sizeRelH relativeFrom="margin">
+                  <wp14:pctWidth>0</wp14:pctWidth>
+                </wp14:sizeRelH>
+                <wp14:sizeRelV relativeFrom="margin">
+                  <wp14:pctHeight>0</wp14:pctHeight>
+                </wp14:sizeRelV>
+              </wp:anchor>
+            </w:drawing>
+          </mc:Choice>
+          <mc:Fallback>
+            <w:pict>
+              <v:shape w14:anchorId="15931BD9" id="_x0000_s1032" type="#_x0000_t202" style="position:absolute;margin-left:140.4pt;margin-top:.55pt;width:276.6pt;height:27pt;z-index:251672576;visibility:visible;mso-wrap-style:square;mso-width-percent:0;mso-height-percent:0;mso-wrap-distance-left:9pt;mso-wrap-distance-top:0;mso-wrap-distance-right:9pt;mso-wrap-distance-bottom:0;mso-position-horizontal:absolute;mso-position-horizontal-relative:text;mso-position-vertical:absolute;mso-position-vertical-relative:text;mso-width-percent:0;mso-height-percent:0;mso-width-relative:margin;mso-height-relative:margin;v-text-anchor:top" o:gfxdata="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" fillcolor="white [3201]" strokeweight=".5pt">
+                <v:textbox>
+                  <w:txbxContent>
+                    <w:p>
+                      <w:pPr>
+                        <w:rPr>
+                          <w:i/>
+                          <w:iCs/>
+                          <w:lang w:val="en-US"/>
+                        </w:rPr>
+                      </w:pPr>
+                      <w:r>
+                        <w:rPr>
+                          <w:i/>
+                          <w:iCs/>
+                          <w:lang w:val="en-US"/>
+                        </w:rPr>
+                        <w:t>Screenshot</w:t>
+                      </w:r>
+                      <w:r>
+                        <w:rPr>
+                          <w:i/>
+                          <w:iCs/>
+                          <w:lang w:val="en-US"/>
+                        </w:rPr>
+                        <w:t xml:space="preserve"> of</w:t>
+                      </w:r>
+                      <w:r>
+                        <w:rPr>
+                          <w:i/>
+                          <w:iCs/>
+                          <w:lang w:val="en-US"/>
+                        </w:rPr>
+                        <w:t xml:space="preserve"> the ‘</w:t>
+                      </w:r>
+                      <w:proofErr w:type="spellStart"/>
+                      <w:r>
+                        <w:rPr>
+                          <w:i/>
+                          <w:iCs/>
+                          <w:lang w:val="en-US"/>
+                        </w:rPr>
+                        <w:t>Dim_</w:t>
+                      </w:r>
+                      <w:r>
+                        <w:rPr>
+                          <w:i/>
+                          <w:iCs/>
+                          <w:lang w:val="en-US"/>
+                        </w:rPr>
+                        <w:t>Diagnosis</w:t>
+                      </w:r>
+                      <w:proofErr w:type="spellEnd"/>
+                      <w:r>
+                        <w:rPr>
+                          <w:i/>
+                          <w:iCs/>
+                          <w:lang w:val="en-US"/>
+                        </w:rPr>
+                        <w:t>’ table after creating it:</w:t>
+                      </w:r>
+                    </w:p>
+                  </w:txbxContent>
+                </v:textbox>
+              </v:shape>
+            </w:pict>
+          </mc:Fallback>
+        </mc:AlternateContent>
+      </w:r>
+      <w:r>
+        <w:rPr>
+          <w:noProof/>
+        </w:rPr>
+        <mc:AlternateContent>
+          <mc:Choice Requires="wps">
+            <w:drawing>
+              <wp:anchor distT="0" distB="0" distL="114300" distR="114300" simplePos="0" relativeHeight="251670528" behindDoc="0" locked="0" layoutInCell="1" allowOverlap="1" wp14:anchorId="52AB885D" wp14:editId="199B44E2">
+                <wp:simplePos x="0" y="0"/>
+                <wp:positionH relativeFrom="margin">
+                  <wp:posOffset>0</wp:posOffset>
+                </wp:positionH>
+                <wp:positionV relativeFrom="paragraph">
+                  <wp:posOffset>-635</wp:posOffset>
+                </wp:positionV>
+                <wp:extent cx="1501140" cy="480060"/>
+                <wp:effectExtent l="0" t="0" r="22860" b="15240"/>
+                <wp:wrapNone/>
+                <wp:docPr id="397051873" name="Text Box 1"/>
+                <wp:cNvGraphicFramePr/>
+                <a:graphic xmlns:a="http://schemas.openxmlformats.org/drawingml/2006/main">
+                  <a:graphicData uri="http://schemas.microsoft.com/office/word/2010/wordprocessingShape">
+                    <wps:wsp>
+                      <wps:cNvSpPr txBox="1"/>
+                      <wps:spPr>
+                        <a:xfrm>
+                          <a:off x="0" y="0"/>
+                          <a:ext cx="1501140" cy="480060"/>
+                        </a:xfrm>
+                        <a:prstGeom prst="rect">
+                          <a:avLst/>
+                        </a:prstGeom>
+                        <a:solidFill>
+                          <a:schemeClr val="lt1"/>
+                        </a:solidFill>
+                        <a:ln w="3175">
+                          <a:solidFill>
+                            <a:prstClr val="black"/>
+                          </a:solidFill>
+                        </a:ln>
+                      </wps:spPr>
+                      <wps:txbx>
+                        <w:txbxContent>
+                          <w:p>
+                            <w:pPr>
+                              <w:rPr>
+                                <w:i/>
+                                <w:iCs/>
+                                <w:lang w:val="en-US"/>
+                              </w:rPr>
+                            </w:pPr>
+                            <w:r>
+                              <w:rPr>
+                                <w:i/>
+                                <w:iCs/>
+                                <w:lang w:val="en-US"/>
+                              </w:rPr>
+                              <w:t>Choosing appropriate columns</w:t>
+                            </w:r>
+                            <w:r>
+                              <w:rPr>
+                                <w:i/>
+                                <w:iCs/>
+                                <w:lang w:val="en-US"/>
+                              </w:rPr>
+                              <w:t>:</w:t>
+                            </w:r>
+                          </w:p>
+                        </w:txbxContent>
+                      </wps:txbx>
+                      <wps:bodyPr rot="0" spcFirstLastPara="0" vertOverflow="overflow" horzOverflow="overflow" vert="horz" wrap="square" lIns="91440" tIns="45720" rIns="91440" bIns="45720" numCol="1" spcCol="0" rtlCol="0" fromWordArt="0" anchor="t" anchorCtr="0" forceAA="0" compatLnSpc="1">
+                        <a:prstTxWarp prst="textNoShape">
+                          <a:avLst/>
+                        </a:prstTxWarp>
+                        <a:noAutofit/>
+                      </wps:bodyPr>
+                    </wps:wsp>
+                  </a:graphicData>
+                </a:graphic>
+                <wp14:sizeRelH relativeFrom="margin">
+                  <wp14:pctWidth>0</wp14:pctWidth>
+                </wp14:sizeRelH>
+                <wp14:sizeRelV relativeFrom="margin">
+                  <wp14:pctHeight>0</wp14:pctHeight>
+                </wp14:sizeRelV>
+              </wp:anchor>
+            </w:drawing>
+          </mc:Choice>
+          <mc:Fallback>
+            <w:pict>
+              <v:shape w14:anchorId="52AB885D" id="_x0000_s1033" type="#_x0000_t202" style="position:absolute;margin-left:0;margin-top:-.05pt;width:118.2pt;height:37.8pt;z-index:251670528;visibility:visible;mso-wrap-style:square;mso-width-percent:0;mso-height-percent:0;mso-wrap-distance-left:9pt;mso-wrap-distance-top:0;mso-wrap-distance-right:9pt;mso-wrap-distance-bottom:0;mso-position-horizontal:absolute;mso-position-horizontal-relative:margin;mso-position-vertical:absolute;mso-position-vertical-relative:text;mso-width-percent:0;mso-height-percent:0;mso-width-relative:margin;mso-height-relative:margin;v-text-anchor:top" o:gfxdata="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" fillcolor="white [3201]" strokeweight=".25pt">
+                <v:textbox>
+                  <w:txbxContent>
+                    <w:p>
+                      <w:pPr>
+                        <w:rPr>
+                          <w:i/>
+                          <w:iCs/>
+                          <w:lang w:val="en-US"/>
+                        </w:rPr>
+                      </w:pPr>
+                      <w:r>
+                        <w:rPr>
+                          <w:i/>
+                          <w:iCs/>
+                          <w:lang w:val="en-US"/>
+                        </w:rPr>
+                        <w:t>Choosing appropriate columns</w:t>
+                      </w:r>
+                      <w:r>
+                        <w:rPr>
+                          <w:i/>
+                          <w:iCs/>
+                          <w:lang w:val="en-US"/>
+                        </w:rPr>
+                        <w:t>:</w:t>
+                      </w:r>
+                    </w:p>
+                  </w:txbxContent>
+                </v:textbox>
+                <w10:wrap anchorx="margin"/>
+              </v:shape>
+            </w:pict>
+          </mc:Fallback>
+        </mc:AlternateContent>
+      </w:r>
+    </w:p>
+    <w:p>
+      <w:pPr>
+        <w:rPr>
+          <w:lang w:val="en-US"/>
+        </w:rPr>
+      </w:pPr>
+    </w:p>
+    <w:p>
+      <w:pPr>
+        <w:rPr>
+          <w:noProof/>
+        </w:rPr>
+      </w:pPr>
+      <w:r>
+        <w:rPr>
+          <w:noProof/>
+        </w:rPr>
+        <w:drawing>
+          <wp:inline distT="0" distB="0" distL="0" distR="0" wp14:anchorId="1256E043" wp14:editId="3C9EEE61">
+            <wp:extent cx="1402080" cy="2453640"/>
+            <wp:effectExtent l="0" t="0" r="7620" b="3810"/>
+            <wp:docPr id="236526030" name="Picture 1"/>
+            <wp:cNvGraphicFramePr>
+              <a:graphicFrameLocks xmlns:a="http://schemas.openxmlformats.org/drawingml/2006/main" noChangeAspect="1"/>
+            </wp:cNvGraphicFramePr>
+            <a:graphic xmlns:a="http://schemas.openxmlformats.org/drawingml/2006/main">
+              <a:graphicData uri="http://schemas.openxmlformats.org/drawingml/2006/picture">
+                <pic:pic xmlns:pic="http://schemas.openxmlformats.org/drawingml/2006/picture">
+                  <pic:nvPicPr>
+                    <pic:cNvPr id="236526030" name=""/>
+                    <pic:cNvPicPr/>
+                  </pic:nvPicPr>
+                  <pic:blipFill rotWithShape="1">
+                    <a:blip r:embed="rId10"/>
+                    <a:srcRect l="38024" t="9928" r="37514" b="13964"/>
+                    <a:stretch/>
+                  </pic:blipFill>
+                  <pic:spPr bwMode="auto">
+                    <a:xfrm>
+                      <a:off x="0" y="0"/>
+                      <a:ext cx="1402080" cy="2453640"/>
+                    </a:xfrm>
+                    <a:prstGeom prst="rect">
+                      <a:avLst/>
+                    </a:prstGeom>
+                    <a:ln>
+                      <a:noFill/>
+                    </a:ln>
+                    <a:extLst>
+                      <a:ext uri="{53640926-AAD7-44D8-BBD7-CCE9431645EC}">
+                        <a14:shadowObscured xmlns:a14="http://schemas.microsoft.com/office/drawing/2010/main"/>
+                      </a:ext>
+                    </a:extLst>
+                  </pic:spPr>
+                </pic:pic>
+              </a:graphicData>
+            </a:graphic>
+          </wp:inline>
+        </w:drawing>
+      </w:r>
+      <w:r>
+        <w:rPr>
+          <w:noProof/>
+        </w:rPr>
+        <w:t xml:space="preserve">                             </w:t>
+      </w:r>
+      <w:r>
+        <w:rPr>
+          <w:noProof/>
+        </w:rPr>
+        <w:drawing>
+          <wp:inline distT="0" distB="0" distL="0" distR="0" wp14:anchorId="1168609E" wp14:editId="6C4F53AE">
+            <wp:extent cx="2735580" cy="2476500"/>
+            <wp:effectExtent l="0" t="0" r="7620" b="0"/>
+            <wp:docPr id="1055476812" name="Picture 1"/>
+            <wp:cNvGraphicFramePr>
+              <a:graphicFrameLocks xmlns:a="http://schemas.openxmlformats.org/drawingml/2006/main" noChangeAspect="1"/>
+            </wp:cNvGraphicFramePr>
+            <a:graphic xmlns:a="http://schemas.openxmlformats.org/drawingml/2006/main">
+              <a:graphicData uri="http://schemas.openxmlformats.org/drawingml/2006/picture">
+                <pic:pic xmlns:pic="http://schemas.openxmlformats.org/drawingml/2006/picture">
+                  <pic:nvPicPr>
+                    <pic:cNvPr id="1055476812" name=""/>
+                    <pic:cNvPicPr/>
+                  </pic:nvPicPr>
+                  <pic:blipFill rotWithShape="1">
+                    <a:blip r:embed="rId11"/>
+                    <a:srcRect l="9838" t="18437" r="42433" b="4746"/>
+                    <a:stretch/>
+                  </pic:blipFill>
+                  <pic:spPr bwMode="auto">
+                    <a:xfrm>
+                      <a:off x="0" y="0"/>
+                      <a:ext cx="2735580" cy="2476500"/>
+                    </a:xfrm>
+                    <a:prstGeom prst="rect">
+                      <a:avLst/>
+                    </a:prstGeom>
+                    <a:ln>
+                      <a:noFill/>
+                    </a:ln>
+                    <a:extLst>
+                      <a:ext uri="{53640926-AAD7-44D8-BBD7-CCE9431645EC}">
+                        <a14:shadowObscured xmlns:a14="http://schemas.microsoft.com/office/drawing/2010/main"/>
+                      </a:ext>
+                    </a:extLst>
+                  </pic:spPr>
+                </pic:pic>
+              </a:graphicData>
+            </a:graphic>
+          </wp:inline>
+        </w:drawing>
+      </w:r>
+    </w:p>
+    <w:p>
+      <w:pPr>
+        <w:rPr>
+          <w:noProof/>
+        </w:rPr>
+      </w:pPr>
+    </w:p>
+    <w:p>
+      <w:pPr>
+        <w:rPr>
+          <w:noProof/>
+        </w:rPr>
+      </w:pPr>
+    </w:p>
+    <w:p>
+      <w:pPr>
+        <w:rPr>
+          <w:noProof/>
+        </w:rPr>
+      </w:pPr>
+    </w:p>
+    <w:p>
+      <w:pPr>
+        <w:rPr>
+          <w:noProof/>
+        </w:rPr>
+      </w:pPr>
+    </w:p>
+    <w:p>
+      <w:pPr>
+        <w:rPr>
+          <w:lang w:val="en-US"/>
+        </w:rPr>
+      </w:pPr>
+    </w:p>
+    <w:p>
+      <w:pPr>
+        <w:rPr>
+          <w:lang w:val="en-US"/>
+        </w:rPr>
+      </w:pPr>
+    </w:p>
+    <w:p>
+      <w:pPr>
+        <w:rPr>
+          <w:lang w:val="en-US"/>
+        </w:rPr>
+      </w:pPr>
     </w:p>
     <w:p>
       <w:pPr>

</xml_diff>

<commit_message>
Data Modelling: Creating Dim_Medication - Hetal
</commit_message>
<xml_diff>
--- a/2_Documented_modelling.docx
+++ b/2_Documented_modelling.docx
@@ -2850,6 +2850,839 @@
                     <a:xfrm>
                       <a:off x="0" y="0"/>
                       <a:ext cx="2735580" cy="2476500"/>
+                    </a:xfrm>
+                    <a:prstGeom prst="rect">
+                      <a:avLst/>
+                    </a:prstGeom>
+                    <a:ln>
+                      <a:noFill/>
+                    </a:ln>
+                    <a:extLst>
+                      <a:ext uri="{53640926-AAD7-44D8-BBD7-CCE9431645EC}">
+                        <a14:shadowObscured xmlns:a14="http://schemas.microsoft.com/office/drawing/2010/main"/>
+                      </a:ext>
+                    </a:extLst>
+                  </pic:spPr>
+                </pic:pic>
+              </a:graphicData>
+            </a:graphic>
+          </wp:inline>
+        </w:drawing>
+      </w:r>
+    </w:p>
+    <w:p>
+      <w:pPr>
+        <w:rPr>
+          <w:b/>
+          <w:bCs/>
+          <w:lang w:val="en-US"/>
+        </w:rPr>
+      </w:pPr>
+      <w:r>
+        <w:rPr>
+          <w:b/>
+          <w:bCs/>
+          <w:lang w:val="en-US"/>
+        </w:rPr>
+        <w:t>Building ‘</w:t>
+      </w:r>
+      <w:proofErr w:type="spellStart"/>
+      <w:r>
+        <w:rPr>
+          <w:b/>
+          <w:bCs/>
+          <w:lang w:val="en-US"/>
+        </w:rPr>
+        <w:t>Dim_</w:t>
+      </w:r>
+      <w:r>
+        <w:rPr>
+          <w:b/>
+          <w:bCs/>
+          <w:lang w:val="en-US"/>
+        </w:rPr>
+        <w:t>Medication</w:t>
+      </w:r>
+      <w:proofErr w:type="spellEnd"/>
+      <w:r>
+        <w:rPr>
+          <w:b/>
+          <w:bCs/>
+          <w:lang w:val="en-US"/>
+        </w:rPr>
+        <w:t>’:</w:t>
+      </w:r>
+    </w:p>
+    <w:p>
+      <w:pPr>
+        <w:rPr>
+          <w:lang w:val="en-US"/>
+        </w:rPr>
+      </w:pPr>
+      <w:r>
+        <w:rPr>
+          <w:lang w:val="en-US"/>
+        </w:rPr>
+        <w:t xml:space="preserve"> This table has</w:t>
+      </w:r>
+      <w:r>
+        <w:rPr>
+          <w:lang w:val="en-US"/>
+        </w:rPr>
+        <w:t xml:space="preserve"> medication attributes describing which drug and how dosage changed</w:t>
+      </w:r>
+      <w:r>
+        <w:rPr>
+          <w:lang w:val="en-US"/>
+        </w:rPr>
+        <w:t>. Attributes include:</w:t>
+      </w:r>
+      <w:r>
+        <w:rPr>
+          <w:lang w:val="en-US"/>
+        </w:rPr>
+        <w:t xml:space="preserve"> ‘</w:t>
+      </w:r>
+      <w:proofErr w:type="spellStart"/>
+      <w:r>
+        <w:rPr>
+          <w:i/>
+          <w:iCs/>
+          <w:lang w:val="en-US"/>
+        </w:rPr>
+        <w:t>Drug_Name</w:t>
+      </w:r>
+      <w:proofErr w:type="spellEnd"/>
+      <w:r>
+        <w:rPr>
+          <w:lang w:val="en-US"/>
+        </w:rPr>
+        <w:t>’, ‘</w:t>
+      </w:r>
+      <w:proofErr w:type="spellStart"/>
+      <w:r>
+        <w:rPr>
+          <w:i/>
+          <w:iCs/>
+          <w:lang w:val="en-US"/>
+        </w:rPr>
+        <w:t>Dosage_Change_Type</w:t>
+      </w:r>
+      <w:proofErr w:type="spellEnd"/>
+      <w:r>
+        <w:rPr>
+          <w:lang w:val="en-US"/>
+        </w:rPr>
+        <w:t>’, ‘</w:t>
+      </w:r>
+      <w:proofErr w:type="spellStart"/>
+      <w:r>
+        <w:rPr>
+          <w:i/>
+          <w:iCs/>
+          <w:lang w:val="en-US"/>
+        </w:rPr>
+        <w:t>Medication_ID</w:t>
+      </w:r>
+      <w:proofErr w:type="spellEnd"/>
+      <w:r>
+        <w:rPr>
+          <w:lang w:val="en-US"/>
+        </w:rPr>
+        <w:t>’</w:t>
+      </w:r>
+      <w:r>
+        <w:rPr>
+          <w:lang w:val="en-US"/>
+        </w:rPr>
+        <w:t>.</w:t>
+      </w:r>
+    </w:p>
+    <w:p>
+      <w:pPr>
+        <w:rPr>
+          <w:lang w:val="en-US"/>
+        </w:rPr>
+      </w:pPr>
+      <w:r>
+        <w:rPr>
+          <w:lang w:val="en-US"/>
+        </w:rPr>
+        <w:t>I referenced the cleaned main table and renamed the new table to ‘</w:t>
+      </w:r>
+      <w:proofErr w:type="spellStart"/>
+      <w:r>
+        <w:rPr>
+          <w:lang w:val="en-US"/>
+        </w:rPr>
+        <w:t>Dim_Medication</w:t>
+      </w:r>
+      <w:proofErr w:type="spellEnd"/>
+      <w:r>
+        <w:rPr>
+          <w:lang w:val="en-US"/>
+        </w:rPr>
+        <w:t>’. Thereafter, I unpivoted all 24 medication columns to ‘Attribute’ (which is medication name) and ‘Value’ (which is dosage change). I renamed ‘Attribute’ to ‘</w:t>
+      </w:r>
+      <w:proofErr w:type="spellStart"/>
+      <w:r>
+        <w:rPr>
+          <w:lang w:val="en-US"/>
+        </w:rPr>
+        <w:t>Drug_Name</w:t>
+      </w:r>
+      <w:proofErr w:type="spellEnd"/>
+      <w:r>
+        <w:rPr>
+          <w:lang w:val="en-US"/>
+        </w:rPr>
+        <w:t>’ and ‘Value’ to ‘</w:t>
+      </w:r>
+      <w:proofErr w:type="spellStart"/>
+      <w:r>
+        <w:rPr>
+          <w:lang w:val="en-US"/>
+        </w:rPr>
+        <w:t>Dosage_Change_Type</w:t>
+      </w:r>
+      <w:proofErr w:type="spellEnd"/>
+      <w:r>
+        <w:rPr>
+          <w:lang w:val="en-US"/>
+        </w:rPr>
+        <w:t>’. I then added an index column and renamed it to ‘</w:t>
+      </w:r>
+      <w:proofErr w:type="spellStart"/>
+      <w:r>
+        <w:rPr>
+          <w:lang w:val="en-US"/>
+        </w:rPr>
+        <w:t>Medication_ID</w:t>
+      </w:r>
+      <w:proofErr w:type="spellEnd"/>
+      <w:r>
+        <w:rPr>
+          <w:lang w:val="en-US"/>
+        </w:rPr>
+        <w:t>’.</w:t>
+      </w:r>
+    </w:p>
+    <w:p>
+      <w:pPr>
+        <w:rPr>
+          <w:lang w:val="en-US"/>
+        </w:rPr>
+      </w:pPr>
+      <w:r>
+        <w:rPr>
+          <w:noProof/>
+        </w:rPr>
+        <mc:AlternateContent>
+          <mc:Choice Requires="wps">
+            <w:drawing>
+              <wp:anchor distT="0" distB="0" distL="114300" distR="114300" simplePos="0" relativeHeight="251674624" behindDoc="0" locked="0" layoutInCell="1" allowOverlap="1" wp14:anchorId="05E8FCE3" wp14:editId="571FE620">
+                <wp:simplePos x="0" y="0"/>
+                <wp:positionH relativeFrom="margin">
+                  <wp:posOffset>83820</wp:posOffset>
+                </wp:positionH>
+                <wp:positionV relativeFrom="paragraph">
+                  <wp:posOffset>7620</wp:posOffset>
+                </wp:positionV>
+                <wp:extent cx="1760220" cy="449580"/>
+                <wp:effectExtent l="0" t="0" r="11430" b="26670"/>
+                <wp:wrapNone/>
+                <wp:docPr id="337553629" name="Text Box 1"/>
+                <wp:cNvGraphicFramePr/>
+                <a:graphic xmlns:a="http://schemas.openxmlformats.org/drawingml/2006/main">
+                  <a:graphicData uri="http://schemas.microsoft.com/office/word/2010/wordprocessingShape">
+                    <wps:wsp>
+                      <wps:cNvSpPr txBox="1"/>
+                      <wps:spPr>
+                        <a:xfrm>
+                          <a:off x="0" y="0"/>
+                          <a:ext cx="1760220" cy="449580"/>
+                        </a:xfrm>
+                        <a:prstGeom prst="rect">
+                          <a:avLst/>
+                        </a:prstGeom>
+                        <a:solidFill>
+                          <a:schemeClr val="lt1"/>
+                        </a:solidFill>
+                        <a:ln w="3175">
+                          <a:solidFill>
+                            <a:prstClr val="black"/>
+                          </a:solidFill>
+                        </a:ln>
+                      </wps:spPr>
+                      <wps:txbx>
+                        <w:txbxContent>
+                          <w:p>
+                            <w:pPr>
+                              <w:rPr>
+                                <w:i/>
+                                <w:iCs/>
+                                <w:lang w:val="en-US"/>
+                              </w:rPr>
+                            </w:pPr>
+                            <w:r>
+                              <w:rPr>
+                                <w:i/>
+                                <w:iCs/>
+                                <w:lang w:val="en-US"/>
+                              </w:rPr>
+                              <w:t>Before unpivoting</w:t>
+                            </w:r>
+                            <w:r>
+                              <w:rPr>
+                                <w:i/>
+                                <w:iCs/>
+                                <w:lang w:val="en-US"/>
+                              </w:rPr>
+                              <w:t>:</w:t>
+                            </w:r>
+                          </w:p>
+                        </w:txbxContent>
+                      </wps:txbx>
+                      <wps:bodyPr rot="0" spcFirstLastPara="0" vertOverflow="overflow" horzOverflow="overflow" vert="horz" wrap="square" lIns="91440" tIns="45720" rIns="91440" bIns="45720" numCol="1" spcCol="0" rtlCol="0" fromWordArt="0" anchor="t" anchorCtr="0" forceAA="0" compatLnSpc="1">
+                        <a:prstTxWarp prst="textNoShape">
+                          <a:avLst/>
+                        </a:prstTxWarp>
+                        <a:noAutofit/>
+                      </wps:bodyPr>
+                    </wps:wsp>
+                  </a:graphicData>
+                </a:graphic>
+                <wp14:sizeRelH relativeFrom="margin">
+                  <wp14:pctWidth>0</wp14:pctWidth>
+                </wp14:sizeRelH>
+                <wp14:sizeRelV relativeFrom="margin">
+                  <wp14:pctHeight>0</wp14:pctHeight>
+                </wp14:sizeRelV>
+              </wp:anchor>
+            </w:drawing>
+          </mc:Choice>
+          <mc:Fallback>
+            <w:pict>
+              <v:shape w14:anchorId="05E8FCE3" id="_x0000_s1034" type="#_x0000_t202" style="position:absolute;margin-left:6.6pt;margin-top:.6pt;width:138.6pt;height:35.4pt;z-index:251674624;visibility:visible;mso-wrap-style:square;mso-width-percent:0;mso-height-percent:0;mso-wrap-distance-left:9pt;mso-wrap-distance-top:0;mso-wrap-distance-right:9pt;mso-wrap-distance-bottom:0;mso-position-horizontal:absolute;mso-position-horizontal-relative:margin;mso-position-vertical:absolute;mso-position-vertical-relative:text;mso-width-percent:0;mso-height-percent:0;mso-width-relative:margin;mso-height-relative:margin;v-text-anchor:top" o:gfxdata="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" fillcolor="white [3201]" strokeweight=".25pt">
+                <v:textbox>
+                  <w:txbxContent>
+                    <w:p>
+                      <w:pPr>
+                        <w:rPr>
+                          <w:i/>
+                          <w:iCs/>
+                          <w:lang w:val="en-US"/>
+                        </w:rPr>
+                      </w:pPr>
+                      <w:r>
+                        <w:rPr>
+                          <w:i/>
+                          <w:iCs/>
+                          <w:lang w:val="en-US"/>
+                        </w:rPr>
+                        <w:t>Before unpivoting</w:t>
+                      </w:r>
+                      <w:r>
+                        <w:rPr>
+                          <w:i/>
+                          <w:iCs/>
+                          <w:lang w:val="en-US"/>
+                        </w:rPr>
+                        <w:t>:</w:t>
+                      </w:r>
+                    </w:p>
+                  </w:txbxContent>
+                </v:textbox>
+                <w10:wrap anchorx="margin"/>
+              </v:shape>
+            </w:pict>
+          </mc:Fallback>
+        </mc:AlternateContent>
+      </w:r>
+      <w:r>
+        <w:rPr>
+          <w:noProof/>
+        </w:rPr>
+        <mc:AlternateContent>
+          <mc:Choice Requires="wps">
+            <w:drawing>
+              <wp:anchor distT="0" distB="0" distL="114300" distR="114300" simplePos="0" relativeHeight="251676672" behindDoc="0" locked="0" layoutInCell="1" allowOverlap="1" wp14:anchorId="041A9585" wp14:editId="3E23485F">
+                <wp:simplePos x="0" y="0"/>
+                <wp:positionH relativeFrom="margin">
+                  <wp:posOffset>3474720</wp:posOffset>
+                </wp:positionH>
+                <wp:positionV relativeFrom="paragraph">
+                  <wp:posOffset>114300</wp:posOffset>
+                </wp:positionV>
+                <wp:extent cx="1470660" cy="419100"/>
+                <wp:effectExtent l="0" t="0" r="15240" b="19050"/>
+                <wp:wrapNone/>
+                <wp:docPr id="613170462" name="Text Box 2"/>
+                <wp:cNvGraphicFramePr/>
+                <a:graphic xmlns:a="http://schemas.openxmlformats.org/drawingml/2006/main">
+                  <a:graphicData uri="http://schemas.microsoft.com/office/word/2010/wordprocessingShape">
+                    <wps:wsp>
+                      <wps:cNvSpPr txBox="1"/>
+                      <wps:spPr>
+                        <a:xfrm>
+                          <a:off x="0" y="0"/>
+                          <a:ext cx="1470660" cy="419100"/>
+                        </a:xfrm>
+                        <a:prstGeom prst="rect">
+                          <a:avLst/>
+                        </a:prstGeom>
+                        <a:solidFill>
+                          <a:schemeClr val="lt1"/>
+                        </a:solidFill>
+                        <a:ln w="6350">
+                          <a:solidFill>
+                            <a:prstClr val="black"/>
+                          </a:solidFill>
+                        </a:ln>
+                      </wps:spPr>
+                      <wps:txbx>
+                        <w:txbxContent>
+                          <w:p>
+                            <w:pPr>
+                              <w:rPr>
+                                <w:i/>
+                                <w:iCs/>
+                                <w:lang w:val="en-US"/>
+                              </w:rPr>
+                            </w:pPr>
+                            <w:r>
+                              <w:rPr>
+                                <w:i/>
+                                <w:iCs/>
+                                <w:lang w:val="en-US"/>
+                              </w:rPr>
+                              <w:t>After unpivoting</w:t>
+                            </w:r>
+                            <w:r>
+                              <w:rPr>
+                                <w:i/>
+                                <w:iCs/>
+                                <w:lang w:val="en-US"/>
+                              </w:rPr>
+                              <w:t>:</w:t>
+                            </w:r>
+                          </w:p>
+                        </w:txbxContent>
+                      </wps:txbx>
+                      <wps:bodyPr rot="0" spcFirstLastPara="0" vertOverflow="overflow" horzOverflow="overflow" vert="horz" wrap="square" lIns="91440" tIns="45720" rIns="91440" bIns="45720" numCol="1" spcCol="0" rtlCol="0" fromWordArt="0" anchor="t" anchorCtr="0" forceAA="0" compatLnSpc="1">
+                        <a:prstTxWarp prst="textNoShape">
+                          <a:avLst/>
+                        </a:prstTxWarp>
+                        <a:noAutofit/>
+                      </wps:bodyPr>
+                    </wps:wsp>
+                  </a:graphicData>
+                </a:graphic>
+                <wp14:sizeRelH relativeFrom="margin">
+                  <wp14:pctWidth>0</wp14:pctWidth>
+                </wp14:sizeRelH>
+                <wp14:sizeRelV relativeFrom="margin">
+                  <wp14:pctHeight>0</wp14:pctHeight>
+                </wp14:sizeRelV>
+              </wp:anchor>
+            </w:drawing>
+          </mc:Choice>
+          <mc:Fallback>
+            <w:pict>
+              <v:shape w14:anchorId="041A9585" id="_x0000_s1035" type="#_x0000_t202" style="position:absolute;margin-left:273.6pt;margin-top:9pt;width:115.8pt;height:33pt;z-index:251676672;visibility:visible;mso-wrap-style:square;mso-width-percent:0;mso-height-percent:0;mso-wrap-distance-left:9pt;mso-wrap-distance-top:0;mso-wrap-distance-right:9pt;mso-wrap-distance-bottom:0;mso-position-horizontal:absolute;mso-position-horizontal-relative:margin;mso-position-vertical:absolute;mso-position-vertical-relative:text;mso-width-percent:0;mso-height-percent:0;mso-width-relative:margin;mso-height-relative:margin;v-text-anchor:top" o:gfxdata="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" fillcolor="white [3201]" strokeweight=".5pt">
+                <v:textbox>
+                  <w:txbxContent>
+                    <w:p>
+                      <w:pPr>
+                        <w:rPr>
+                          <w:i/>
+                          <w:iCs/>
+                          <w:lang w:val="en-US"/>
+                        </w:rPr>
+                      </w:pPr>
+                      <w:r>
+                        <w:rPr>
+                          <w:i/>
+                          <w:iCs/>
+                          <w:lang w:val="en-US"/>
+                        </w:rPr>
+                        <w:t>After unpivoting</w:t>
+                      </w:r>
+                      <w:r>
+                        <w:rPr>
+                          <w:i/>
+                          <w:iCs/>
+                          <w:lang w:val="en-US"/>
+                        </w:rPr>
+                        <w:t>:</w:t>
+                      </w:r>
+                    </w:p>
+                  </w:txbxContent>
+                </v:textbox>
+                <w10:wrap anchorx="margin"/>
+              </v:shape>
+            </w:pict>
+          </mc:Fallback>
+        </mc:AlternateContent>
+      </w:r>
+    </w:p>
+    <w:p>
+      <w:pPr>
+        <w:rPr>
+          <w:lang w:val="en-US"/>
+        </w:rPr>
+      </w:pPr>
+    </w:p>
+    <w:p>
+      <w:pPr>
+        <w:rPr>
+          <w:lang w:val="en-US"/>
+        </w:rPr>
+      </w:pPr>
+      <w:r>
+        <w:rPr>
+          <w:noProof/>
+        </w:rPr>
+        <w:drawing>
+          <wp:inline distT="0" distB="0" distL="0" distR="0" wp14:anchorId="0E4F4F80" wp14:editId="55D42FE5">
+            <wp:extent cx="2933323" cy="2057400"/>
+            <wp:effectExtent l="0" t="0" r="635" b="0"/>
+            <wp:docPr id="1802360546" name="Picture 1"/>
+            <wp:cNvGraphicFramePr>
+              <a:graphicFrameLocks xmlns:a="http://schemas.openxmlformats.org/drawingml/2006/main" noChangeAspect="1"/>
+            </wp:cNvGraphicFramePr>
+            <a:graphic xmlns:a="http://schemas.openxmlformats.org/drawingml/2006/main">
+              <a:graphicData uri="http://schemas.openxmlformats.org/drawingml/2006/picture">
+                <pic:pic xmlns:pic="http://schemas.openxmlformats.org/drawingml/2006/picture">
+                  <pic:nvPicPr>
+                    <pic:cNvPr id="1802360546" name=""/>
+                    <pic:cNvPicPr/>
+                  </pic:nvPicPr>
+                  <pic:blipFill rotWithShape="1">
+                    <a:blip r:embed="rId12"/>
+                    <a:srcRect l="13227" t="19951" r="29055" b="8076"/>
+                    <a:stretch/>
+                  </pic:blipFill>
+                  <pic:spPr bwMode="auto">
+                    <a:xfrm>
+                      <a:off x="0" y="0"/>
+                      <a:ext cx="2934169" cy="2057993"/>
+                    </a:xfrm>
+                    <a:prstGeom prst="rect">
+                      <a:avLst/>
+                    </a:prstGeom>
+                    <a:ln>
+                      <a:noFill/>
+                    </a:ln>
+                    <a:extLst>
+                      <a:ext uri="{53640926-AAD7-44D8-BBD7-CCE9431645EC}">
+                        <a14:shadowObscured xmlns:a14="http://schemas.microsoft.com/office/drawing/2010/main"/>
+                      </a:ext>
+                    </a:extLst>
+                  </pic:spPr>
+                </pic:pic>
+              </a:graphicData>
+            </a:graphic>
+          </wp:inline>
+        </w:drawing>
+      </w:r>
+      <w:r>
+        <w:rPr>
+          <w:noProof/>
+        </w:rPr>
+        <w:t xml:space="preserve">                    </w:t>
+      </w:r>
+      <w:r>
+        <w:rPr>
+          <w:noProof/>
+        </w:rPr>
+        <w:drawing>
+          <wp:inline distT="0" distB="0" distL="0" distR="0" wp14:anchorId="0B0731FD" wp14:editId="6D33F826">
+            <wp:extent cx="1073849" cy="1950720"/>
+            <wp:effectExtent l="0" t="0" r="0" b="0"/>
+            <wp:docPr id="935171203" name="Picture 1"/>
+            <wp:cNvGraphicFramePr>
+              <a:graphicFrameLocks xmlns:a="http://schemas.openxmlformats.org/drawingml/2006/main" noChangeAspect="1"/>
+            </wp:cNvGraphicFramePr>
+            <a:graphic xmlns:a="http://schemas.openxmlformats.org/drawingml/2006/main">
+              <a:graphicData uri="http://schemas.openxmlformats.org/drawingml/2006/picture">
+                <pic:pic xmlns:pic="http://schemas.openxmlformats.org/drawingml/2006/picture">
+                  <pic:nvPicPr>
+                    <pic:cNvPr id="935171203" name=""/>
+                    <pic:cNvPicPr/>
+                  </pic:nvPicPr>
+                  <pic:blipFill rotWithShape="1">
+                    <a:blip r:embed="rId13"/>
+                    <a:srcRect l="60093" t="19618" r="17439" b="7819"/>
+                    <a:stretch/>
+                  </pic:blipFill>
+                  <pic:spPr bwMode="auto">
+                    <a:xfrm>
+                      <a:off x="0" y="0"/>
+                      <a:ext cx="1081719" cy="1965017"/>
+                    </a:xfrm>
+                    <a:prstGeom prst="rect">
+                      <a:avLst/>
+                    </a:prstGeom>
+                    <a:ln>
+                      <a:noFill/>
+                    </a:ln>
+                    <a:extLst>
+                      <a:ext uri="{53640926-AAD7-44D8-BBD7-CCE9431645EC}">
+                        <a14:shadowObscured xmlns:a14="http://schemas.microsoft.com/office/drawing/2010/main"/>
+                      </a:ext>
+                    </a:extLst>
+                  </pic:spPr>
+                </pic:pic>
+              </a:graphicData>
+            </a:graphic>
+          </wp:inline>
+        </w:drawing>
+      </w:r>
+    </w:p>
+    <w:p>
+      <w:pPr>
+        <w:rPr>
+          <w:lang w:val="en-US"/>
+        </w:rPr>
+      </w:pPr>
+      <w:r>
+        <w:rPr>
+          <w:noProof/>
+        </w:rPr>
+        <w:lastRenderedPageBreak/>
+        <mc:AlternateContent>
+          <mc:Choice Requires="wps">
+            <w:drawing>
+              <wp:anchor distT="0" distB="0" distL="114300" distR="114300" simplePos="0" relativeHeight="251678720" behindDoc="0" locked="0" layoutInCell="1" allowOverlap="1" wp14:anchorId="160AF28A" wp14:editId="14DFD380">
+                <wp:simplePos x="0" y="0"/>
+                <wp:positionH relativeFrom="margin">
+                  <wp:align>left</wp:align>
+                </wp:positionH>
+                <wp:positionV relativeFrom="paragraph">
+                  <wp:posOffset>0</wp:posOffset>
+                </wp:positionV>
+                <wp:extent cx="2308860" cy="487680"/>
+                <wp:effectExtent l="0" t="0" r="15240" b="26670"/>
+                <wp:wrapNone/>
+                <wp:docPr id="609893508" name="Text Box 2"/>
+                <wp:cNvGraphicFramePr/>
+                <a:graphic xmlns:a="http://schemas.openxmlformats.org/drawingml/2006/main">
+                  <a:graphicData uri="http://schemas.microsoft.com/office/word/2010/wordprocessingShape">
+                    <wps:wsp>
+                      <wps:cNvSpPr txBox="1"/>
+                      <wps:spPr>
+                        <a:xfrm>
+                          <a:off x="0" y="0"/>
+                          <a:ext cx="2308860" cy="487680"/>
+                        </a:xfrm>
+                        <a:prstGeom prst="rect">
+                          <a:avLst/>
+                        </a:prstGeom>
+                        <a:solidFill>
+                          <a:schemeClr val="lt1"/>
+                        </a:solidFill>
+                        <a:ln w="6350">
+                          <a:solidFill>
+                            <a:prstClr val="black"/>
+                          </a:solidFill>
+                        </a:ln>
+                      </wps:spPr>
+                      <wps:txbx>
+                        <w:txbxContent>
+                          <w:p>
+                            <w:pPr>
+                              <w:rPr>
+                                <w:i/>
+                                <w:iCs/>
+                                <w:lang w:val="en-US"/>
+                              </w:rPr>
+                            </w:pPr>
+                            <w:r>
+                              <w:rPr>
+                                <w:i/>
+                                <w:iCs/>
+                                <w:lang w:val="en-US"/>
+                              </w:rPr>
+                              <w:t>Screenshot</w:t>
+                            </w:r>
+                            <w:r>
+                              <w:rPr>
+                                <w:i/>
+                                <w:iCs/>
+                                <w:lang w:val="en-US"/>
+                              </w:rPr>
+                              <w:t xml:space="preserve"> of</w:t>
+                            </w:r>
+                            <w:r>
+                              <w:rPr>
+                                <w:i/>
+                                <w:iCs/>
+                                <w:lang w:val="en-US"/>
+                              </w:rPr>
+                              <w:t xml:space="preserve"> ‘</w:t>
+                            </w:r>
+                            <w:proofErr w:type="spellStart"/>
+                            <w:r>
+                              <w:rPr>
+                                <w:i/>
+                                <w:iCs/>
+                                <w:lang w:val="en-US"/>
+                              </w:rPr>
+                              <w:t>Dim_</w:t>
+                            </w:r>
+                            <w:r>
+                              <w:rPr>
+                                <w:i/>
+                                <w:iCs/>
+                                <w:lang w:val="en-US"/>
+                              </w:rPr>
+                              <w:t>Medication</w:t>
+                            </w:r>
+                            <w:proofErr w:type="spellEnd"/>
+                            <w:r>
+                              <w:rPr>
+                                <w:i/>
+                                <w:iCs/>
+                                <w:lang w:val="en-US"/>
+                              </w:rPr>
+                              <w:t>’ table after creating it:</w:t>
+                            </w:r>
+                          </w:p>
+                        </w:txbxContent>
+                      </wps:txbx>
+                      <wps:bodyPr rot="0" spcFirstLastPara="0" vertOverflow="overflow" horzOverflow="overflow" vert="horz" wrap="square" lIns="91440" tIns="45720" rIns="91440" bIns="45720" numCol="1" spcCol="0" rtlCol="0" fromWordArt="0" anchor="t" anchorCtr="0" forceAA="0" compatLnSpc="1">
+                        <a:prstTxWarp prst="textNoShape">
+                          <a:avLst/>
+                        </a:prstTxWarp>
+                        <a:noAutofit/>
+                      </wps:bodyPr>
+                    </wps:wsp>
+                  </a:graphicData>
+                </a:graphic>
+                <wp14:sizeRelH relativeFrom="margin">
+                  <wp14:pctWidth>0</wp14:pctWidth>
+                </wp14:sizeRelH>
+                <wp14:sizeRelV relativeFrom="margin">
+                  <wp14:pctHeight>0</wp14:pctHeight>
+                </wp14:sizeRelV>
+              </wp:anchor>
+            </w:drawing>
+          </mc:Choice>
+          <mc:Fallback>
+            <w:pict>
+              <v:shape w14:anchorId="160AF28A" id="_x0000_s1036" type="#_x0000_t202" style="position:absolute;margin-left:0;margin-top:0;width:181.8pt;height:38.4pt;z-index:251678720;visibility:visible;mso-wrap-style:square;mso-width-percent:0;mso-height-percent:0;mso-wrap-distance-left:9pt;mso-wrap-distance-top:0;mso-wrap-distance-right:9pt;mso-wrap-distance-bottom:0;mso-position-horizontal:left;mso-position-horizontal-relative:margin;mso-position-vertical:absolute;mso-position-vertical-relative:text;mso-width-percent:0;mso-height-percent:0;mso-width-relative:margin;mso-height-relative:margin;v-text-anchor:top" o:gfxdata="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" fillcolor="white [3201]" strokeweight=".5pt">
+                <v:textbox>
+                  <w:txbxContent>
+                    <w:p>
+                      <w:pPr>
+                        <w:rPr>
+                          <w:i/>
+                          <w:iCs/>
+                          <w:lang w:val="en-US"/>
+                        </w:rPr>
+                      </w:pPr>
+                      <w:r>
+                        <w:rPr>
+                          <w:i/>
+                          <w:iCs/>
+                          <w:lang w:val="en-US"/>
+                        </w:rPr>
+                        <w:t>Screenshot</w:t>
+                      </w:r>
+                      <w:r>
+                        <w:rPr>
+                          <w:i/>
+                          <w:iCs/>
+                          <w:lang w:val="en-US"/>
+                        </w:rPr>
+                        <w:t xml:space="preserve"> of</w:t>
+                      </w:r>
+                      <w:r>
+                        <w:rPr>
+                          <w:i/>
+                          <w:iCs/>
+                          <w:lang w:val="en-US"/>
+                        </w:rPr>
+                        <w:t xml:space="preserve"> ‘</w:t>
+                      </w:r>
+                      <w:proofErr w:type="spellStart"/>
+                      <w:r>
+                        <w:rPr>
+                          <w:i/>
+                          <w:iCs/>
+                          <w:lang w:val="en-US"/>
+                        </w:rPr>
+                        <w:t>Dim_</w:t>
+                      </w:r>
+                      <w:r>
+                        <w:rPr>
+                          <w:i/>
+                          <w:iCs/>
+                          <w:lang w:val="en-US"/>
+                        </w:rPr>
+                        <w:t>Medication</w:t>
+                      </w:r>
+                      <w:proofErr w:type="spellEnd"/>
+                      <w:r>
+                        <w:rPr>
+                          <w:i/>
+                          <w:iCs/>
+                          <w:lang w:val="en-US"/>
+                        </w:rPr>
+                        <w:t>’ table after creating it:</w:t>
+                      </w:r>
+                    </w:p>
+                  </w:txbxContent>
+                </v:textbox>
+                <w10:wrap anchorx="margin"/>
+              </v:shape>
+            </w:pict>
+          </mc:Fallback>
+        </mc:AlternateContent>
+      </w:r>
+    </w:p>
+    <w:p>
+      <w:pPr>
+        <w:rPr>
+          <w:noProof/>
+        </w:rPr>
+      </w:pPr>
+    </w:p>
+    <w:p>
+      <w:pPr>
+        <w:rPr>
+          <w:noProof/>
+        </w:rPr>
+      </w:pPr>
+      <w:r>
+        <w:rPr>
+          <w:noProof/>
+        </w:rPr>
+        <w:drawing>
+          <wp:inline distT="0" distB="0" distL="0" distR="0" wp14:anchorId="7F62355A" wp14:editId="66E5A786">
+            <wp:extent cx="2522220" cy="3082713"/>
+            <wp:effectExtent l="0" t="0" r="0" b="3810"/>
+            <wp:docPr id="891713307" name="Picture 1"/>
+            <wp:cNvGraphicFramePr>
+              <a:graphicFrameLocks xmlns:a="http://schemas.openxmlformats.org/drawingml/2006/main" noChangeAspect="1"/>
+            </wp:cNvGraphicFramePr>
+            <a:graphic xmlns:a="http://schemas.openxmlformats.org/drawingml/2006/main">
+              <a:graphicData uri="http://schemas.openxmlformats.org/drawingml/2006/picture">
+                <pic:pic xmlns:pic="http://schemas.openxmlformats.org/drawingml/2006/picture">
+                  <pic:nvPicPr>
+                    <pic:cNvPr id="891713307" name=""/>
+                    <pic:cNvPicPr/>
+                  </pic:nvPicPr>
+                  <pic:blipFill rotWithShape="1">
+                    <a:blip r:embed="rId14"/>
+                    <a:srcRect l="12231" t="18673" r="53069" b="5929"/>
+                    <a:stretch/>
+                  </pic:blipFill>
+                  <pic:spPr bwMode="auto">
+                    <a:xfrm>
+                      <a:off x="0" y="0"/>
+                      <a:ext cx="2524107" cy="3085019"/>
                     </a:xfrm>
                     <a:prstGeom prst="rect">
                       <a:avLst/>

</xml_diff>

<commit_message>
Data Modelling: Creating Dim_Date - Hetal
</commit_message>
<xml_diff>
--- a/2_Documented_modelling.docx
+++ b/2_Documented_modelling.docx
@@ -3683,6 +3683,448 @@
                     <a:xfrm>
                       <a:off x="0" y="0"/>
                       <a:ext cx="2524107" cy="3085019"/>
+                    </a:xfrm>
+                    <a:prstGeom prst="rect">
+                      <a:avLst/>
+                    </a:prstGeom>
+                    <a:ln>
+                      <a:noFill/>
+                    </a:ln>
+                    <a:extLst>
+                      <a:ext uri="{53640926-AAD7-44D8-BBD7-CCE9431645EC}">
+                        <a14:shadowObscured xmlns:a14="http://schemas.microsoft.com/office/drawing/2010/main"/>
+                      </a:ext>
+                    </a:extLst>
+                  </pic:spPr>
+                </pic:pic>
+              </a:graphicData>
+            </a:graphic>
+          </wp:inline>
+        </w:drawing>
+      </w:r>
+    </w:p>
+    <w:p>
+      <w:pPr>
+        <w:rPr>
+          <w:b/>
+          <w:bCs/>
+          <w:lang w:val="en-US"/>
+        </w:rPr>
+      </w:pPr>
+      <w:r>
+        <w:rPr>
+          <w:b/>
+          <w:bCs/>
+          <w:lang w:val="en-US"/>
+        </w:rPr>
+        <w:t>Building ‘</w:t>
+      </w:r>
+      <w:proofErr w:type="spellStart"/>
+      <w:r>
+        <w:rPr>
+          <w:b/>
+          <w:bCs/>
+          <w:lang w:val="en-US"/>
+        </w:rPr>
+        <w:t>Dim_</w:t>
+      </w:r>
+      <w:r>
+        <w:rPr>
+          <w:b/>
+          <w:bCs/>
+          <w:lang w:val="en-US"/>
+        </w:rPr>
+        <w:t>Date</w:t>
+      </w:r>
+      <w:proofErr w:type="spellEnd"/>
+      <w:r>
+        <w:rPr>
+          <w:b/>
+          <w:bCs/>
+          <w:lang w:val="en-US"/>
+        </w:rPr>
+        <w:t>’:</w:t>
+      </w:r>
+    </w:p>
+    <w:p>
+      <w:pPr>
+        <w:rPr>
+          <w:b/>
+          <w:bCs/>
+          <w:lang w:val="en-US"/>
+        </w:rPr>
+      </w:pPr>
+      <w:r>
+        <w:rPr>
+          <w:lang w:val="en-US"/>
+        </w:rPr>
+        <w:t xml:space="preserve">This table </w:t>
+      </w:r>
+      <w:r>
+        <w:rPr>
+          <w:lang w:val="en-US"/>
+        </w:rPr>
+        <w:t>is a standard calendar table for time intelligence in DAX</w:t>
+      </w:r>
+      <w:r>
+        <w:rPr>
+          <w:lang w:val="en-US"/>
+        </w:rPr>
+        <w:t>. Attributes include:</w:t>
+      </w:r>
+      <w:r>
+        <w:rPr>
+          <w:lang w:val="en-US"/>
+        </w:rPr>
+        <w:t xml:space="preserve"> ‘</w:t>
+      </w:r>
+      <w:r>
+        <w:rPr>
+          <w:i/>
+          <w:iCs/>
+          <w:lang w:val="en-US"/>
+        </w:rPr>
+        <w:t>Date</w:t>
+      </w:r>
+      <w:r>
+        <w:rPr>
+          <w:lang w:val="en-US"/>
+        </w:rPr>
+        <w:t>’, ‘</w:t>
+      </w:r>
+      <w:r>
+        <w:rPr>
+          <w:i/>
+          <w:iCs/>
+          <w:lang w:val="en-US"/>
+        </w:rPr>
+        <w:t>Year</w:t>
+      </w:r>
+      <w:r>
+        <w:rPr>
+          <w:lang w:val="en-US"/>
+        </w:rPr>
+        <w:t>’, ‘</w:t>
+      </w:r>
+      <w:r>
+        <w:rPr>
+          <w:i/>
+          <w:iCs/>
+          <w:lang w:val="en-US"/>
+        </w:rPr>
+        <w:t>Month Number</w:t>
+      </w:r>
+      <w:r>
+        <w:rPr>
+          <w:lang w:val="en-US"/>
+        </w:rPr>
+        <w:t>’, ‘</w:t>
+      </w:r>
+      <w:r>
+        <w:rPr>
+          <w:i/>
+          <w:iCs/>
+          <w:lang w:val="en-US"/>
+        </w:rPr>
+        <w:t>Month Name</w:t>
+      </w:r>
+      <w:r>
+        <w:rPr>
+          <w:lang w:val="en-US"/>
+        </w:rPr>
+        <w:t>’, ‘</w:t>
+      </w:r>
+      <w:r>
+        <w:rPr>
+          <w:i/>
+          <w:iCs/>
+          <w:lang w:val="en-US"/>
+        </w:rPr>
+        <w:t>Quarter</w:t>
+      </w:r>
+      <w:r>
+        <w:rPr>
+          <w:lang w:val="en-US"/>
+        </w:rPr>
+        <w:t>’, ‘</w:t>
+      </w:r>
+      <w:r>
+        <w:rPr>
+          <w:i/>
+          <w:iCs/>
+          <w:lang w:val="en-US"/>
+        </w:rPr>
+        <w:t>Day Name</w:t>
+      </w:r>
+      <w:r>
+        <w:rPr>
+          <w:lang w:val="en-US"/>
+        </w:rPr>
+        <w:t>’, ‘</w:t>
+      </w:r>
+      <w:r>
+        <w:rPr>
+          <w:i/>
+          <w:iCs/>
+          <w:lang w:val="en-US"/>
+        </w:rPr>
+        <w:t>Date ID</w:t>
+      </w:r>
+      <w:r>
+        <w:rPr>
+          <w:lang w:val="en-US"/>
+        </w:rPr>
+        <w:t>’.</w:t>
+      </w:r>
+      <w:r>
+        <w:rPr>
+          <w:lang w:val="en-US"/>
+        </w:rPr>
+        <w:t xml:space="preserve"> </w:t>
+      </w:r>
+    </w:p>
+    <w:p>
+      <w:pPr>
+        <w:rPr>
+          <w:noProof/>
+        </w:rPr>
+      </w:pPr>
+      <w:r>
+        <w:rPr>
+          <w:noProof/>
+        </w:rPr>
+        <mc:AlternateContent>
+          <mc:Choice Requires="wps">
+            <w:drawing>
+              <wp:anchor distT="0" distB="0" distL="114300" distR="114300" simplePos="0" relativeHeight="251680768" behindDoc="0" locked="0" layoutInCell="1" allowOverlap="1" wp14:anchorId="08FC8F74" wp14:editId="08EC4F47">
+                <wp:simplePos x="0" y="0"/>
+                <wp:positionH relativeFrom="margin">
+                  <wp:align>left</wp:align>
+                </wp:positionH>
+                <wp:positionV relativeFrom="paragraph">
+                  <wp:posOffset>-1270</wp:posOffset>
+                </wp:positionV>
+                <wp:extent cx="2979420" cy="388620"/>
+                <wp:effectExtent l="0" t="0" r="11430" b="11430"/>
+                <wp:wrapNone/>
+                <wp:docPr id="591954038" name="Text Box 2"/>
+                <wp:cNvGraphicFramePr/>
+                <a:graphic xmlns:a="http://schemas.openxmlformats.org/drawingml/2006/main">
+                  <a:graphicData uri="http://schemas.microsoft.com/office/word/2010/wordprocessingShape">
+                    <wps:wsp>
+                      <wps:cNvSpPr txBox="1"/>
+                      <wps:spPr>
+                        <a:xfrm>
+                          <a:off x="0" y="0"/>
+                          <a:ext cx="2979420" cy="388620"/>
+                        </a:xfrm>
+                        <a:prstGeom prst="rect">
+                          <a:avLst/>
+                        </a:prstGeom>
+                        <a:solidFill>
+                          <a:schemeClr val="lt1"/>
+                        </a:solidFill>
+                        <a:ln w="6350">
+                          <a:solidFill>
+                            <a:prstClr val="black"/>
+                          </a:solidFill>
+                        </a:ln>
+                      </wps:spPr>
+                      <wps:txbx>
+                        <w:txbxContent>
+                          <w:p>
+                            <w:pPr>
+                              <w:rPr>
+                                <w:i/>
+                                <w:iCs/>
+                                <w:lang w:val="en-US"/>
+                              </w:rPr>
+                            </w:pPr>
+                            <w:r>
+                              <w:rPr>
+                                <w:i/>
+                                <w:iCs/>
+                                <w:lang w:val="en-US"/>
+                              </w:rPr>
+                              <w:t>Screenshot</w:t>
+                            </w:r>
+                            <w:r>
+                              <w:rPr>
+                                <w:i/>
+                                <w:iCs/>
+                                <w:lang w:val="en-US"/>
+                              </w:rPr>
+                              <w:t xml:space="preserve"> of</w:t>
+                            </w:r>
+                            <w:r>
+                              <w:rPr>
+                                <w:i/>
+                                <w:iCs/>
+                                <w:lang w:val="en-US"/>
+                              </w:rPr>
+                              <w:t xml:space="preserve"> ‘</w:t>
+                            </w:r>
+                            <w:proofErr w:type="spellStart"/>
+                            <w:r>
+                              <w:rPr>
+                                <w:i/>
+                                <w:iCs/>
+                                <w:lang w:val="en-US"/>
+                              </w:rPr>
+                              <w:t>Dim_</w:t>
+                            </w:r>
+                            <w:r>
+                              <w:rPr>
+                                <w:i/>
+                                <w:iCs/>
+                                <w:lang w:val="en-US"/>
+                              </w:rPr>
+                              <w:t>Date</w:t>
+                            </w:r>
+                            <w:proofErr w:type="spellEnd"/>
+                            <w:r>
+                              <w:rPr>
+                                <w:i/>
+                                <w:iCs/>
+                                <w:lang w:val="en-US"/>
+                              </w:rPr>
+                              <w:t>’ table after creating it:</w:t>
+                            </w:r>
+                          </w:p>
+                        </w:txbxContent>
+                      </wps:txbx>
+                      <wps:bodyPr rot="0" spcFirstLastPara="0" vertOverflow="overflow" horzOverflow="overflow" vert="horz" wrap="square" lIns="91440" tIns="45720" rIns="91440" bIns="45720" numCol="1" spcCol="0" rtlCol="0" fromWordArt="0" anchor="t" anchorCtr="0" forceAA="0" compatLnSpc="1">
+                        <a:prstTxWarp prst="textNoShape">
+                          <a:avLst/>
+                        </a:prstTxWarp>
+                        <a:noAutofit/>
+                      </wps:bodyPr>
+                    </wps:wsp>
+                  </a:graphicData>
+                </a:graphic>
+                <wp14:sizeRelH relativeFrom="margin">
+                  <wp14:pctWidth>0</wp14:pctWidth>
+                </wp14:sizeRelH>
+                <wp14:sizeRelV relativeFrom="margin">
+                  <wp14:pctHeight>0</wp14:pctHeight>
+                </wp14:sizeRelV>
+              </wp:anchor>
+            </w:drawing>
+          </mc:Choice>
+          <mc:Fallback>
+            <w:pict>
+              <v:shape w14:anchorId="08FC8F74" id="_x0000_s1037" type="#_x0000_t202" style="position:absolute;margin-left:0;margin-top:-.1pt;width:234.6pt;height:30.6pt;z-index:251680768;visibility:visible;mso-wrap-style:square;mso-width-percent:0;mso-height-percent:0;mso-wrap-distance-left:9pt;mso-wrap-distance-top:0;mso-wrap-distance-right:9pt;mso-wrap-distance-bottom:0;mso-position-horizontal:left;mso-position-horizontal-relative:margin;mso-position-vertical:absolute;mso-position-vertical-relative:text;mso-width-percent:0;mso-height-percent:0;mso-width-relative:margin;mso-height-relative:margin;v-text-anchor:top" o:gfxdata="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" fillcolor="white [3201]" strokeweight=".5pt">
+                <v:textbox>
+                  <w:txbxContent>
+                    <w:p>
+                      <w:pPr>
+                        <w:rPr>
+                          <w:i/>
+                          <w:iCs/>
+                          <w:lang w:val="en-US"/>
+                        </w:rPr>
+                      </w:pPr>
+                      <w:r>
+                        <w:rPr>
+                          <w:i/>
+                          <w:iCs/>
+                          <w:lang w:val="en-US"/>
+                        </w:rPr>
+                        <w:t>Screenshot</w:t>
+                      </w:r>
+                      <w:r>
+                        <w:rPr>
+                          <w:i/>
+                          <w:iCs/>
+                          <w:lang w:val="en-US"/>
+                        </w:rPr>
+                        <w:t xml:space="preserve"> of</w:t>
+                      </w:r>
+                      <w:r>
+                        <w:rPr>
+                          <w:i/>
+                          <w:iCs/>
+                          <w:lang w:val="en-US"/>
+                        </w:rPr>
+                        <w:t xml:space="preserve"> ‘</w:t>
+                      </w:r>
+                      <w:proofErr w:type="spellStart"/>
+                      <w:r>
+                        <w:rPr>
+                          <w:i/>
+                          <w:iCs/>
+                          <w:lang w:val="en-US"/>
+                        </w:rPr>
+                        <w:t>Dim_</w:t>
+                      </w:r>
+                      <w:r>
+                        <w:rPr>
+                          <w:i/>
+                          <w:iCs/>
+                          <w:lang w:val="en-US"/>
+                        </w:rPr>
+                        <w:t>Date</w:t>
+                      </w:r>
+                      <w:proofErr w:type="spellEnd"/>
+                      <w:r>
+                        <w:rPr>
+                          <w:i/>
+                          <w:iCs/>
+                          <w:lang w:val="en-US"/>
+                        </w:rPr>
+                        <w:t>’ table after creating it:</w:t>
+                      </w:r>
+                    </w:p>
+                  </w:txbxContent>
+                </v:textbox>
+                <w10:wrap anchorx="margin"/>
+              </v:shape>
+            </w:pict>
+          </mc:Fallback>
+        </mc:AlternateContent>
+      </w:r>
+    </w:p>
+    <w:p>
+      <w:pPr>
+        <w:rPr>
+          <w:noProof/>
+        </w:rPr>
+      </w:pPr>
+    </w:p>
+    <w:p>
+      <w:pPr>
+        <w:rPr>
+          <w:noProof/>
+        </w:rPr>
+      </w:pPr>
+      <w:r>
+        <w:rPr>
+          <w:noProof/>
+        </w:rPr>
+        <w:drawing>
+          <wp:inline distT="0" distB="0" distL="0" distR="0" wp14:anchorId="5E2A07BD" wp14:editId="17B82B0A">
+            <wp:extent cx="4549140" cy="2693229"/>
+            <wp:effectExtent l="0" t="0" r="3810" b="0"/>
+            <wp:docPr id="2115101001" name="Picture 1"/>
+            <wp:cNvGraphicFramePr>
+              <a:graphicFrameLocks xmlns:a="http://schemas.openxmlformats.org/drawingml/2006/main" noChangeAspect="1"/>
+            </wp:cNvGraphicFramePr>
+            <a:graphic xmlns:a="http://schemas.openxmlformats.org/drawingml/2006/main">
+              <a:graphicData uri="http://schemas.openxmlformats.org/drawingml/2006/picture">
+                <pic:pic xmlns:pic="http://schemas.openxmlformats.org/drawingml/2006/picture">
+                  <pic:nvPicPr>
+                    <pic:cNvPr id="2115101001" name=""/>
+                    <pic:cNvPicPr/>
+                  </pic:nvPicPr>
+                  <pic:blipFill rotWithShape="1">
+                    <a:blip r:embed="rId15"/>
+                    <a:srcRect l="12896" t="19382" r="17040" b="6874"/>
+                    <a:stretch/>
+                  </pic:blipFill>
+                  <pic:spPr bwMode="auto">
+                    <a:xfrm>
+                      <a:off x="0" y="0"/>
+                      <a:ext cx="4556529" cy="2697603"/>
                     </a:xfrm>
                     <a:prstGeom prst="rect">
                       <a:avLst/>

</xml_diff>

<commit_message>
Data Modelling: Creating relationships - Hetal
</commit_message>
<xml_diff>
--- a/2_Documented_modelling.docx
+++ b/2_Documented_modelling.docx
@@ -72,64 +72,35 @@
           <w:bCs/>
           <w:lang w:val="en-US"/>
         </w:rPr>
-        <w:t>Fact Table Creation (</w:t>
-      </w:r>
-      <w:proofErr w:type="spellStart"/>
+        <w:t>Fact Table Creation (Fact_Encounter):</w:t>
+      </w:r>
+    </w:p>
+    <w:p>
+      <w:pPr>
+        <w:rPr>
+          <w:lang w:val="en-US"/>
+        </w:rPr>
+      </w:pPr>
+      <w:r>
+        <w:rPr>
+          <w:lang w:val="en-US"/>
+        </w:rPr>
+        <w:t>‘</w:t>
+      </w:r>
       <w:r>
         <w:rPr>
           <w:b/>
           <w:bCs/>
           <w:lang w:val="en-US"/>
         </w:rPr>
-        <w:t>Fact_Encounter</w:t>
-      </w:r>
-      <w:proofErr w:type="spellEnd"/>
-      <w:r>
-        <w:rPr>
-          <w:b/>
-          <w:bCs/>
-          <w:lang w:val="en-US"/>
-        </w:rPr>
-        <w:t>):</w:t>
-      </w:r>
-    </w:p>
-    <w:p>
-      <w:pPr>
-        <w:rPr>
-          <w:lang w:val="en-US"/>
-        </w:rPr>
-      </w:pPr>
+        <w:t xml:space="preserve">Fact_Encounter’ columns: </w:t>
+      </w:r>
       <w:r>
         <w:rPr>
           <w:lang w:val="en-US"/>
         </w:rPr>
         <w:t>‘</w:t>
       </w:r>
-      <w:proofErr w:type="spellStart"/>
-      <w:r>
-        <w:rPr>
-          <w:b/>
-          <w:bCs/>
-          <w:lang w:val="en-US"/>
-        </w:rPr>
-        <w:t>Fact_Encounter</w:t>
-      </w:r>
-      <w:proofErr w:type="spellEnd"/>
-      <w:r>
-        <w:rPr>
-          <w:b/>
-          <w:bCs/>
-          <w:lang w:val="en-US"/>
-        </w:rPr>
-        <w:t xml:space="preserve">’ columns: </w:t>
-      </w:r>
-      <w:r>
-        <w:rPr>
-          <w:lang w:val="en-US"/>
-        </w:rPr>
-        <w:t>‘</w:t>
-      </w:r>
-      <w:proofErr w:type="spellStart"/>
       <w:r>
         <w:rPr>
           <w:i/>
@@ -138,7 +109,6 @@
         </w:rPr>
         <w:t>encounter_id</w:t>
       </w:r>
-      <w:proofErr w:type="spellEnd"/>
       <w:r>
         <w:rPr>
           <w:i/>
@@ -153,7 +123,6 @@
         </w:rPr>
         <w:t>’, ‘</w:t>
       </w:r>
-      <w:proofErr w:type="spellStart"/>
       <w:r>
         <w:rPr>
           <w:i/>
@@ -162,14 +131,12 @@
         </w:rPr>
         <w:t>patient_nbr</w:t>
       </w:r>
-      <w:proofErr w:type="spellEnd"/>
       <w:r>
         <w:rPr>
           <w:lang w:val="en-US"/>
         </w:rPr>
         <w:t>’, ‘</w:t>
       </w:r>
-      <w:proofErr w:type="spellStart"/>
       <w:r>
         <w:rPr>
           <w:i/>
@@ -178,14 +145,12 @@
         </w:rPr>
         <w:t>admission_type_id</w:t>
       </w:r>
-      <w:proofErr w:type="spellEnd"/>
       <w:r>
         <w:rPr>
           <w:lang w:val="en-US"/>
         </w:rPr>
         <w:t>’, ‘</w:t>
       </w:r>
-      <w:proofErr w:type="spellStart"/>
       <w:r>
         <w:rPr>
           <w:i/>
@@ -194,14 +159,12 @@
         </w:rPr>
         <w:t>admission_source_id</w:t>
       </w:r>
-      <w:proofErr w:type="spellEnd"/>
       <w:r>
         <w:rPr>
           <w:lang w:val="en-US"/>
         </w:rPr>
         <w:t>’, ‘</w:t>
       </w:r>
-      <w:proofErr w:type="spellStart"/>
       <w:r>
         <w:rPr>
           <w:i/>
@@ -210,7 +173,6 @@
         </w:rPr>
         <w:t>discharge_disposition_id</w:t>
       </w:r>
-      <w:proofErr w:type="spellEnd"/>
       <w:r>
         <w:rPr>
           <w:lang w:val="en-US"/>
@@ -259,7 +221,6 @@
         </w:rPr>
         <w:t>’, ‘</w:t>
       </w:r>
-      <w:proofErr w:type="spellStart"/>
       <w:r>
         <w:rPr>
           <w:i/>
@@ -268,14 +229,12 @@
         </w:rPr>
         <w:t>time_in_hospital</w:t>
       </w:r>
-      <w:proofErr w:type="spellEnd"/>
       <w:r>
         <w:rPr>
           <w:lang w:val="en-US"/>
         </w:rPr>
         <w:t>’, ‘</w:t>
       </w:r>
-      <w:proofErr w:type="spellStart"/>
       <w:r>
         <w:rPr>
           <w:i/>
@@ -284,14 +243,12 @@
         </w:rPr>
         <w:t>num_lab_procedures</w:t>
       </w:r>
-      <w:proofErr w:type="spellEnd"/>
       <w:r>
         <w:rPr>
           <w:lang w:val="en-US"/>
         </w:rPr>
         <w:t>’, ‘</w:t>
       </w:r>
-      <w:proofErr w:type="spellStart"/>
       <w:r>
         <w:rPr>
           <w:i/>
@@ -300,14 +257,12 @@
         </w:rPr>
         <w:t>num_procedures</w:t>
       </w:r>
-      <w:proofErr w:type="spellEnd"/>
       <w:r>
         <w:rPr>
           <w:lang w:val="en-US"/>
         </w:rPr>
         <w:t>’, ‘</w:t>
       </w:r>
-      <w:proofErr w:type="spellStart"/>
       <w:r>
         <w:rPr>
           <w:i/>
@@ -316,14 +271,12 @@
         </w:rPr>
         <w:t>num_medications</w:t>
       </w:r>
-      <w:proofErr w:type="spellEnd"/>
       <w:r>
         <w:rPr>
           <w:lang w:val="en-US"/>
         </w:rPr>
         <w:t>’, ‘</w:t>
       </w:r>
-      <w:proofErr w:type="spellStart"/>
       <w:r>
         <w:rPr>
           <w:i/>
@@ -332,14 +285,12 @@
         </w:rPr>
         <w:t>number_outpatient</w:t>
       </w:r>
-      <w:proofErr w:type="spellEnd"/>
       <w:r>
         <w:rPr>
           <w:lang w:val="en-US"/>
         </w:rPr>
         <w:t>’, ‘</w:t>
       </w:r>
-      <w:proofErr w:type="spellStart"/>
       <w:r>
         <w:rPr>
           <w:i/>
@@ -348,14 +299,12 @@
         </w:rPr>
         <w:t>number_emergency</w:t>
       </w:r>
-      <w:proofErr w:type="spellEnd"/>
       <w:r>
         <w:rPr>
           <w:lang w:val="en-US"/>
         </w:rPr>
         <w:t>’, ‘</w:t>
       </w:r>
-      <w:proofErr w:type="spellStart"/>
       <w:r>
         <w:rPr>
           <w:i/>
@@ -364,14 +313,12 @@
         </w:rPr>
         <w:t>number_inpatient</w:t>
       </w:r>
-      <w:proofErr w:type="spellEnd"/>
       <w:r>
         <w:rPr>
           <w:lang w:val="en-US"/>
         </w:rPr>
         <w:t>’, ‘</w:t>
       </w:r>
-      <w:proofErr w:type="spellStart"/>
       <w:r>
         <w:rPr>
           <w:i/>
@@ -380,7 +327,6 @@
         </w:rPr>
         <w:t>number_diagnoses</w:t>
       </w:r>
-      <w:proofErr w:type="spellEnd"/>
       <w:r>
         <w:rPr>
           <w:lang w:val="en-US"/>
@@ -400,6 +346,46 @@
           <w:lang w:val="en-US"/>
         </w:rPr>
         <w:t>readmitted</w:t>
+      </w:r>
+      <w:r>
+        <w:rPr>
+          <w:lang w:val="en-US"/>
+        </w:rPr>
+        <w:t>’</w:t>
+      </w:r>
+      <w:r>
+        <w:rPr>
+          <w:lang w:val="en-US"/>
+        </w:rPr>
+        <w:t>, ‘</w:t>
+      </w:r>
+      <w:r>
+        <w:rPr>
+          <w:i/>
+          <w:iCs/>
+          <w:lang w:val="en-US"/>
+        </w:rPr>
+        <w:t>Admission_Key</w:t>
+      </w:r>
+      <w:r>
+        <w:rPr>
+          <w:lang w:val="en-US"/>
+        </w:rPr>
+        <w:t>’</w:t>
+      </w:r>
+      <w:r>
+        <w:rPr>
+          <w:lang w:val="en-US"/>
+        </w:rPr>
+        <w:t>, ‘</w:t>
+      </w:r>
+      <w:r>
+        <w:rPr>
+          <w:i/>
+          <w:iCs/>
+          <w:lang w:val="en-US"/>
+        </w:rPr>
+        <w:t>Diagnosis_Key</w:t>
       </w:r>
       <w:r>
         <w:rPr>
@@ -487,25 +473,7 @@
                                 <w:iCs/>
                                 <w:lang w:val="en-US"/>
                               </w:rPr>
-                              <w:t xml:space="preserve"> the ‘</w:t>
-                            </w:r>
-                            <w:proofErr w:type="spellStart"/>
-                            <w:r>
-                              <w:rPr>
-                                <w:i/>
-                                <w:iCs/>
-                                <w:lang w:val="en-US"/>
-                              </w:rPr>
-                              <w:t>Fact_Encounter</w:t>
-                            </w:r>
-                            <w:proofErr w:type="spellEnd"/>
-                            <w:r>
-                              <w:rPr>
-                                <w:i/>
-                                <w:iCs/>
-                                <w:lang w:val="en-US"/>
-                              </w:rPr>
-                              <w:t>’ table</w:t>
+                              <w:t xml:space="preserve"> the ‘Fact_Encounter’ table</w:t>
                             </w:r>
                             <w:r>
                               <w:rPr>
@@ -575,25 +543,7 @@
                           <w:iCs/>
                           <w:lang w:val="en-US"/>
                         </w:rPr>
-                        <w:t xml:space="preserve"> the ‘</w:t>
-                      </w:r>
-                      <w:proofErr w:type="spellStart"/>
-                      <w:r>
-                        <w:rPr>
-                          <w:i/>
-                          <w:iCs/>
-                          <w:lang w:val="en-US"/>
-                        </w:rPr>
-                        <w:t>Fact_Encounter</w:t>
-                      </w:r>
-                      <w:proofErr w:type="spellEnd"/>
-                      <w:r>
-                        <w:rPr>
-                          <w:i/>
-                          <w:iCs/>
-                          <w:lang w:val="en-US"/>
-                        </w:rPr>
-                        <w:t>’ table</w:t>
+                        <w:t xml:space="preserve"> the ‘Fact_Encounter’ table</w:t>
                       </w:r>
                       <w:r>
                         <w:rPr>
@@ -615,21 +565,7 @@
         <w:rPr>
           <w:lang w:val="en-US"/>
         </w:rPr>
-        <w:t>Below is a screenshot of choosing the appropriate columns for ‘</w:t>
-      </w:r>
-      <w:proofErr w:type="spellStart"/>
-      <w:r>
-        <w:rPr>
-          <w:lang w:val="en-US"/>
-        </w:rPr>
-        <w:t>Fact_Encounter</w:t>
-      </w:r>
-      <w:proofErr w:type="spellEnd"/>
-      <w:r>
-        <w:rPr>
-          <w:lang w:val="en-US"/>
-        </w:rPr>
-        <w:t>’ table. I kept numeric/measurable attributes and removed descriptive attributes.</w:t>
+        <w:t>Below is a screenshot of choosing the appropriate columns for ‘Fact_Encounter’ table. I kept numeric/measurable attributes and removed descriptive attributes.</w:t>
       </w:r>
     </w:p>
     <w:p>
@@ -959,13 +895,6 @@
     <w:p>
       <w:pPr>
         <w:rPr>
-          <w:lang w:val="en-US"/>
-        </w:rPr>
-      </w:pPr>
-    </w:p>
-    <w:p>
-      <w:pPr>
-        <w:rPr>
           <w:b/>
           <w:bCs/>
           <w:lang w:val="en-US"/>
@@ -978,25 +907,7 @@
           <w:lang w:val="en-US"/>
         </w:rPr>
         <w:lastRenderedPageBreak/>
-        <w:t>Building ‘</w:t>
-      </w:r>
-      <w:proofErr w:type="spellStart"/>
-      <w:r>
-        <w:rPr>
-          <w:b/>
-          <w:bCs/>
-          <w:lang w:val="en-US"/>
-        </w:rPr>
-        <w:t>Dim_Patient</w:t>
-      </w:r>
-      <w:proofErr w:type="spellEnd"/>
-      <w:r>
-        <w:rPr>
-          <w:b/>
-          <w:bCs/>
-          <w:lang w:val="en-US"/>
-        </w:rPr>
-        <w:t>’:</w:t>
+        <w:t>Building ‘Dim_Patient’:</w:t>
       </w:r>
     </w:p>
     <w:p>
@@ -1011,23 +922,27 @@
         </w:rPr>
         <w:t>This table contains only patient demographic attributes which include: ‘</w:t>
       </w:r>
-      <w:proofErr w:type="spellStart"/>
       <w:r>
         <w:rPr>
           <w:i/>
           <w:iCs/>
           <w:lang w:val="en-US"/>
         </w:rPr>
-        <w:t>patient_nbr</w:t>
-      </w:r>
-      <w:proofErr w:type="spellEnd"/>
+        <w:t>patient_nbr (PK)</w:t>
+      </w:r>
+      <w:r>
+        <w:rPr>
+          <w:lang w:val="en-US"/>
+        </w:rPr>
+        <w:t>’, ‘</w:t>
+      </w:r>
       <w:r>
         <w:rPr>
           <w:i/>
           <w:iCs/>
           <w:lang w:val="en-US"/>
         </w:rPr>
-        <w:t xml:space="preserve"> (PK)</w:t>
+        <w:t>race</w:t>
       </w:r>
       <w:r>
         <w:rPr>
@@ -1041,7 +956,7 @@
           <w:iCs/>
           <w:lang w:val="en-US"/>
         </w:rPr>
-        <w:t>race</w:t>
+        <w:t>gender</w:t>
       </w:r>
       <w:r>
         <w:rPr>
@@ -1055,22 +970,15 @@
           <w:iCs/>
           <w:lang w:val="en-US"/>
         </w:rPr>
-        <w:t>gender</w:t>
-      </w:r>
-      <w:r>
-        <w:rPr>
-          <w:lang w:val="en-US"/>
-        </w:rPr>
-        <w:t>’, ‘</w:t>
-      </w:r>
-      <w:proofErr w:type="spellStart"/>
+        <w:t>A</w:t>
+      </w:r>
       <w:r>
         <w:rPr>
           <w:i/>
           <w:iCs/>
           <w:lang w:val="en-US"/>
         </w:rPr>
-        <w:t>A</w:t>
+        <w:t>ge_</w:t>
       </w:r>
       <w:r>
         <w:rPr>
@@ -1078,7 +986,7 @@
           <w:iCs/>
           <w:lang w:val="en-US"/>
         </w:rPr>
-        <w:t>ge_</w:t>
+        <w:t>M</w:t>
       </w:r>
       <w:r>
         <w:rPr>
@@ -1086,7 +994,13 @@
           <w:iCs/>
           <w:lang w:val="en-US"/>
         </w:rPr>
-        <w:t>M</w:t>
+        <w:t>idpoint</w:t>
+      </w:r>
+      <w:r>
+        <w:rPr>
+          <w:lang w:val="en-US"/>
+        </w:rPr>
+        <w:t>’, ‘</w:t>
       </w:r>
       <w:r>
         <w:rPr>
@@ -1094,25 +1008,8 @@
           <w:iCs/>
           <w:lang w:val="en-US"/>
         </w:rPr>
-        <w:t>idpoint</w:t>
-      </w:r>
-      <w:proofErr w:type="spellEnd"/>
-      <w:r>
-        <w:rPr>
-          <w:lang w:val="en-US"/>
-        </w:rPr>
-        <w:t>’, ‘</w:t>
-      </w:r>
-      <w:proofErr w:type="spellStart"/>
-      <w:r>
-        <w:rPr>
-          <w:i/>
-          <w:iCs/>
-          <w:lang w:val="en-US"/>
-        </w:rPr>
         <w:t>payer_code</w:t>
       </w:r>
-      <w:proofErr w:type="spellEnd"/>
       <w:r>
         <w:rPr>
           <w:lang w:val="en-US"/>
@@ -1132,19 +1029,11 @@
         </w:rPr>
         <w:t>Below is a screenshot of choosing the appropriate columns for ‘</w:t>
       </w:r>
-      <w:proofErr w:type="spellStart"/>
-      <w:r>
-        <w:rPr>
-          <w:lang w:val="en-US"/>
-        </w:rPr>
-        <w:t>Dim_Patient</w:t>
-      </w:r>
-      <w:proofErr w:type="spellEnd"/>
-      <w:r>
-        <w:rPr>
-          <w:lang w:val="en-US"/>
-        </w:rPr>
-        <w:t>’ dimension</w:t>
+      <w:r>
+        <w:rPr>
+          <w:lang w:val="en-US"/>
+        </w:rPr>
+        <w:t>Dim_Patient’ dimension</w:t>
       </w:r>
       <w:r>
         <w:rPr>
@@ -1156,21 +1045,7 @@
         <w:rPr>
           <w:lang w:val="en-US"/>
         </w:rPr>
-        <w:t xml:space="preserve">Thereafter, I removed duplicate rows to ensure each patient appears once, all demographics are consistent, fact table can safely reference </w:t>
-      </w:r>
-      <w:proofErr w:type="spellStart"/>
-      <w:r>
-        <w:rPr>
-          <w:lang w:val="en-US"/>
-        </w:rPr>
-        <w:t>patient_nbr</w:t>
-      </w:r>
-      <w:proofErr w:type="spellEnd"/>
-      <w:r>
-        <w:rPr>
-          <w:lang w:val="en-US"/>
-        </w:rPr>
-        <w:t>, and there are no broken relationships.</w:t>
+        <w:t>Thereafter, I removed duplicate rows to ensure each patient appears once, all demographics are consistent, fact table can safely reference patient_nbr, and there are no broken relationships.</w:t>
       </w:r>
     </w:p>
     <w:p>
@@ -1241,7 +1116,6 @@
                               </w:rPr>
                               <w:t>Screenshot the ‘</w:t>
                             </w:r>
-                            <w:proofErr w:type="spellStart"/>
                             <w:r>
                               <w:rPr>
                                 <w:i/>
@@ -1250,7 +1124,6 @@
                               </w:rPr>
                               <w:t>Dim_Patient</w:t>
                             </w:r>
-                            <w:proofErr w:type="spellEnd"/>
                             <w:r>
                               <w:rPr>
                                 <w:i/>
@@ -1301,7 +1174,6 @@
                         </w:rPr>
                         <w:t>Screenshot the ‘</w:t>
                       </w:r>
-                      <w:proofErr w:type="spellStart"/>
                       <w:r>
                         <w:rPr>
                           <w:i/>
@@ -1310,7 +1182,6 @@
                         </w:rPr>
                         <w:t>Dim_Patient</w:t>
                       </w:r>
-                      <w:proofErr w:type="spellEnd"/>
                       <w:r>
                         <w:rPr>
                           <w:i/>
@@ -1470,7 +1341,7 @@
     <w:p>
       <w:pPr>
         <w:rPr>
-          <w:lang w:val="en-US"/>
+          <w:noProof/>
         </w:rPr>
       </w:pPr>
       <w:r>
@@ -1588,16 +1459,15 @@
           <w:bCs/>
           <w:lang w:val="en-US"/>
         </w:rPr>
-        <w:t>Building ‘</w:t>
-      </w:r>
-      <w:proofErr w:type="spellStart"/>
+        <w:t>Building ‘Dim_</w:t>
+      </w:r>
       <w:r>
         <w:rPr>
           <w:b/>
           <w:bCs/>
           <w:lang w:val="en-US"/>
         </w:rPr>
-        <w:t>Dim_</w:t>
+        <w:t>Admission</w:t>
       </w:r>
       <w:r>
         <w:rPr>
@@ -1605,15 +1475,6 @@
           <w:bCs/>
           <w:lang w:val="en-US"/>
         </w:rPr>
-        <w:t>Admission</w:t>
-      </w:r>
-      <w:proofErr w:type="spellEnd"/>
-      <w:r>
-        <w:rPr>
-          <w:b/>
-          <w:bCs/>
-          <w:lang w:val="en-US"/>
-        </w:rPr>
         <w:t>’:</w:t>
       </w:r>
     </w:p>
@@ -1629,7 +1490,6 @@
         </w:rPr>
         <w:t xml:space="preserve"> This table categorizes how the patient entered and exited the hospital. Attributes include: ‘</w:t>
       </w:r>
-      <w:proofErr w:type="spellStart"/>
       <w:r>
         <w:rPr>
           <w:i/>
@@ -1638,14 +1498,12 @@
         </w:rPr>
         <w:t>admission_type_id</w:t>
       </w:r>
-      <w:proofErr w:type="spellEnd"/>
       <w:r>
         <w:rPr>
           <w:lang w:val="en-US"/>
         </w:rPr>
         <w:t>’, ‘</w:t>
       </w:r>
-      <w:proofErr w:type="spellStart"/>
       <w:r>
         <w:rPr>
           <w:i/>
@@ -1654,14 +1512,12 @@
         </w:rPr>
         <w:t>admission_source_id</w:t>
       </w:r>
-      <w:proofErr w:type="spellEnd"/>
       <w:r>
         <w:rPr>
           <w:lang w:val="en-US"/>
         </w:rPr>
         <w:t>’, ‘</w:t>
       </w:r>
-      <w:proofErr w:type="spellStart"/>
       <w:r>
         <w:rPr>
           <w:i/>
@@ -1670,14 +1526,12 @@
         </w:rPr>
         <w:t>discharge_disposition_id</w:t>
       </w:r>
-      <w:proofErr w:type="spellEnd"/>
       <w:r>
         <w:rPr>
           <w:lang w:val="en-US"/>
         </w:rPr>
         <w:t>’, ‘</w:t>
       </w:r>
-      <w:proofErr w:type="spellStart"/>
       <w:r>
         <w:rPr>
           <w:i/>
@@ -1686,12 +1540,37 @@
         </w:rPr>
         <w:t>Admission_ID</w:t>
       </w:r>
-      <w:proofErr w:type="spellEnd"/>
-      <w:r>
-        <w:rPr>
-          <w:lang w:val="en-US"/>
-        </w:rPr>
-        <w:t>’.</w:t>
+      <w:r>
+        <w:rPr>
+          <w:lang w:val="en-US"/>
+        </w:rPr>
+        <w:t>’</w:t>
+      </w:r>
+      <w:r>
+        <w:rPr>
+          <w:lang w:val="en-US"/>
+        </w:rPr>
+        <w:t>, ‘</w:t>
+      </w:r>
+      <w:r>
+        <w:rPr>
+          <w:i/>
+          <w:iCs/>
+          <w:lang w:val="en-US"/>
+        </w:rPr>
+        <w:t>Admission_Key</w:t>
+      </w:r>
+      <w:r>
+        <w:rPr>
+          <w:lang w:val="en-US"/>
+        </w:rPr>
+        <w:t>’</w:t>
+      </w:r>
+      <w:r>
+        <w:rPr>
+          <w:lang w:val="en-US"/>
+        </w:rPr>
+        <w:t>.</w:t>
       </w:r>
     </w:p>
     <w:p>
@@ -1707,13 +1586,231 @@
         <mc:AlternateContent>
           <mc:Choice Requires="wps">
             <w:drawing>
-              <wp:anchor distT="0" distB="0" distL="114300" distR="114300" simplePos="0" relativeHeight="251668480" behindDoc="0" locked="0" layoutInCell="1" allowOverlap="1" wp14:anchorId="5C570E18" wp14:editId="4938EEFE">
+              <wp:anchor distT="0" distB="0" distL="114300" distR="114300" simplePos="0" relativeHeight="251666432" behindDoc="0" locked="0" layoutInCell="1" allowOverlap="1" wp14:anchorId="54B00759" wp14:editId="518DADB9">
+                <wp:simplePos x="0" y="0"/>
+                <wp:positionH relativeFrom="margin">
+                  <wp:align>left</wp:align>
+                </wp:positionH>
+                <wp:positionV relativeFrom="paragraph">
+                  <wp:posOffset>741468</wp:posOffset>
+                </wp:positionV>
+                <wp:extent cx="2023533" cy="270934"/>
+                <wp:effectExtent l="0" t="0" r="15240" b="15240"/>
+                <wp:wrapNone/>
+                <wp:docPr id="1002869855" name="Text Box 1"/>
+                <wp:cNvGraphicFramePr/>
+                <a:graphic xmlns:a="http://schemas.openxmlformats.org/drawingml/2006/main">
+                  <a:graphicData uri="http://schemas.microsoft.com/office/word/2010/wordprocessingShape">
+                    <wps:wsp>
+                      <wps:cNvSpPr txBox="1"/>
+                      <wps:spPr>
+                        <a:xfrm>
+                          <a:off x="0" y="0"/>
+                          <a:ext cx="2023533" cy="270934"/>
+                        </a:xfrm>
+                        <a:prstGeom prst="rect">
+                          <a:avLst/>
+                        </a:prstGeom>
+                        <a:solidFill>
+                          <a:schemeClr val="lt1"/>
+                        </a:solidFill>
+                        <a:ln w="3175">
+                          <a:solidFill>
+                            <a:prstClr val="black"/>
+                          </a:solidFill>
+                        </a:ln>
+                      </wps:spPr>
+                      <wps:txbx>
+                        <w:txbxContent>
+                          <w:p>
+                            <w:pPr>
+                              <w:rPr>
+                                <w:i/>
+                                <w:iCs/>
+                                <w:lang w:val="en-US"/>
+                              </w:rPr>
+                            </w:pPr>
+                            <w:r>
+                              <w:rPr>
+                                <w:i/>
+                                <w:iCs/>
+                                <w:lang w:val="en-US"/>
+                              </w:rPr>
+                              <w:t>Choosing appropriate columns</w:t>
+                            </w:r>
+                            <w:r>
+                              <w:rPr>
+                                <w:i/>
+                                <w:iCs/>
+                                <w:lang w:val="en-US"/>
+                              </w:rPr>
+                              <w:t>:</w:t>
+                            </w:r>
+                          </w:p>
+                        </w:txbxContent>
+                      </wps:txbx>
+                      <wps:bodyPr rot="0" spcFirstLastPara="0" vertOverflow="overflow" horzOverflow="overflow" vert="horz" wrap="square" lIns="91440" tIns="45720" rIns="91440" bIns="45720" numCol="1" spcCol="0" rtlCol="0" fromWordArt="0" anchor="t" anchorCtr="0" forceAA="0" compatLnSpc="1">
+                        <a:prstTxWarp prst="textNoShape">
+                          <a:avLst/>
+                        </a:prstTxWarp>
+                        <a:noAutofit/>
+                      </wps:bodyPr>
+                    </wps:wsp>
+                  </a:graphicData>
+                </a:graphic>
+                <wp14:sizeRelH relativeFrom="margin">
+                  <wp14:pctWidth>0</wp14:pctWidth>
+                </wp14:sizeRelH>
+                <wp14:sizeRelV relativeFrom="margin">
+                  <wp14:pctHeight>0</wp14:pctHeight>
+                </wp14:sizeRelV>
+              </wp:anchor>
+            </w:drawing>
+          </mc:Choice>
+          <mc:Fallback>
+            <w:pict>
+              <v:shape w14:anchorId="54B00759" id="_x0000_s1030" type="#_x0000_t202" style="position:absolute;margin-left:0;margin-top:58.4pt;width:159.35pt;height:21.35pt;z-index:251666432;visibility:visible;mso-wrap-style:square;mso-width-percent:0;mso-height-percent:0;mso-wrap-distance-left:9pt;mso-wrap-distance-top:0;mso-wrap-distance-right:9pt;mso-wrap-distance-bottom:0;mso-position-horizontal:left;mso-position-horizontal-relative:margin;mso-position-vertical:absolute;mso-position-vertical-relative:text;mso-width-percent:0;mso-height-percent:0;mso-width-relative:margin;mso-height-relative:margin;v-text-anchor:top" o:gfxdata="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" fillcolor="white [3201]" strokeweight=".25pt">
+                <v:textbox>
+                  <w:txbxContent>
+                    <w:p>
+                      <w:pPr>
+                        <w:rPr>
+                          <w:i/>
+                          <w:iCs/>
+                          <w:lang w:val="en-US"/>
+                        </w:rPr>
+                      </w:pPr>
+                      <w:r>
+                        <w:rPr>
+                          <w:i/>
+                          <w:iCs/>
+                          <w:lang w:val="en-US"/>
+                        </w:rPr>
+                        <w:t>Choosing appropriate columns</w:t>
+                      </w:r>
+                      <w:r>
+                        <w:rPr>
+                          <w:i/>
+                          <w:iCs/>
+                          <w:lang w:val="en-US"/>
+                        </w:rPr>
+                        <w:t>:</w:t>
+                      </w:r>
+                    </w:p>
+                  </w:txbxContent>
+                </v:textbox>
+                <w10:wrap anchorx="margin"/>
+              </v:shape>
+            </w:pict>
+          </mc:Fallback>
+        </mc:AlternateContent>
+      </w:r>
+      <w:r>
+        <w:rPr>
+          <w:lang w:val="en-US"/>
+        </w:rPr>
+        <w:t>Below is a screenshot of choosing the appropriate columns for ‘Dim_</w:t>
+      </w:r>
+      <w:r>
+        <w:rPr>
+          <w:lang w:val="en-US"/>
+        </w:rPr>
+        <w:t>Admission</w:t>
+      </w:r>
+      <w:r>
+        <w:rPr>
+          <w:lang w:val="en-US"/>
+        </w:rPr>
+        <w:t>’ dimension table. Thereafter, I removed duplicate rows</w:t>
+      </w:r>
+      <w:r>
+        <w:rPr>
+          <w:lang w:val="en-US"/>
+        </w:rPr>
+        <w:t>,</w:t>
+      </w:r>
+      <w:r>
+        <w:rPr>
+          <w:lang w:val="en-US"/>
+        </w:rPr>
+        <w:t xml:space="preserve"> </w:t>
+      </w:r>
+      <w:r>
+        <w:rPr>
+          <w:lang w:val="en-US"/>
+        </w:rPr>
+        <w:t>created a</w:t>
+      </w:r>
+      <w:r>
+        <w:rPr>
+          <w:lang w:val="en-US"/>
+        </w:rPr>
+        <w:t>n</w:t>
+      </w:r>
+      <w:r>
+        <w:rPr>
+          <w:lang w:val="en-US"/>
+        </w:rPr>
+        <w:t xml:space="preserve"> </w:t>
+      </w:r>
+      <w:r>
+        <w:rPr>
+          <w:lang w:val="en-US"/>
+        </w:rPr>
+        <w:t>index</w:t>
+      </w:r>
+      <w:r>
+        <w:rPr>
+          <w:lang w:val="en-US"/>
+        </w:rPr>
+        <w:t xml:space="preserve"> key</w:t>
+      </w:r>
+      <w:r>
+        <w:rPr>
+          <w:lang w:val="en-US"/>
+        </w:rPr>
+        <w:t xml:space="preserve"> (Admission_ID), and created a composite key (Admission_Key)</w:t>
+      </w:r>
+      <w:r>
+        <w:rPr>
+          <w:lang w:val="en-US"/>
+        </w:rPr>
+        <w:t xml:space="preserve"> to aid while creating a relationship between Fact_Encounter and Dim_Admission.</w:t>
+      </w:r>
+      <w:r>
+        <w:rPr>
+          <w:lang w:val="en-US"/>
+        </w:rPr>
+        <w:t xml:space="preserve"> </w:t>
+      </w:r>
+    </w:p>
+    <w:p>
+      <w:pPr>
+        <w:rPr>
+          <w:lang w:val="en-US"/>
+        </w:rPr>
+      </w:pPr>
+    </w:p>
+    <w:p>
+      <w:pPr>
+        <w:rPr>
+          <w:noProof/>
+        </w:rPr>
+      </w:pPr>
+      <w:r>
+        <w:rPr>
+          <w:noProof/>
+        </w:rPr>
+        <mc:AlternateContent>
+          <mc:Choice Requires="wps">
+            <w:drawing>
+              <wp:anchor distT="0" distB="0" distL="114300" distR="114300" simplePos="0" relativeHeight="251668480" behindDoc="0" locked="0" layoutInCell="1" allowOverlap="1" wp14:anchorId="5C570E18" wp14:editId="5526BFF7">
                 <wp:simplePos x="0" y="0"/>
                 <wp:positionH relativeFrom="column">
-                  <wp:posOffset>1935480</wp:posOffset>
+                  <wp:posOffset>1478280</wp:posOffset>
                 </wp:positionH>
                 <wp:positionV relativeFrom="paragraph">
-                  <wp:posOffset>593725</wp:posOffset>
+                  <wp:posOffset>272203</wp:posOffset>
                 </wp:positionV>
                 <wp:extent cx="3512820" cy="342900"/>
                 <wp:effectExtent l="0" t="0" r="11430" b="19050"/>
@@ -1775,7 +1872,6 @@
                               </w:rPr>
                               <w:t xml:space="preserve"> the ‘</w:t>
                             </w:r>
-                            <w:proofErr w:type="spellStart"/>
                             <w:r>
                               <w:rPr>
                                 <w:i/>
@@ -1792,7 +1888,6 @@
                               </w:rPr>
                               <w:t>Admission</w:t>
                             </w:r>
-                            <w:proofErr w:type="spellEnd"/>
                             <w:r>
                               <w:rPr>
                                 <w:i/>
@@ -1824,7 +1919,7 @@
           </mc:Choice>
           <mc:Fallback>
             <w:pict>
-              <v:shape w14:anchorId="5C570E18" id="_x0000_s1030" type="#_x0000_t202" style="position:absolute;margin-left:152.4pt;margin-top:46.75pt;width:276.6pt;height:27pt;z-index:251668480;visibility:visible;mso-wrap-style:square;mso-width-percent:0;mso-height-percent:0;mso-wrap-distance-left:9pt;mso-wrap-distance-top:0;mso-wrap-distance-right:9pt;mso-wrap-distance-bottom:0;mso-position-horizontal:absolute;mso-position-horizontal-relative:text;mso-position-vertical:absolute;mso-position-vertical-relative:text;mso-width-percent:0;mso-height-percent:0;mso-width-relative:margin;mso-height-relative:margin;v-text-anchor:top" o:gfxdata="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" fillcolor="white [3201]" strokeweight=".5pt">
+              <v:shape w14:anchorId="5C570E18" id="_x0000_s1031" type="#_x0000_t202" style="position:absolute;margin-left:116.4pt;margin-top:21.45pt;width:276.6pt;height:27pt;z-index:251668480;visibility:visible;mso-wrap-style:square;mso-width-percent:0;mso-height-percent:0;mso-wrap-distance-left:9pt;mso-wrap-distance-top:0;mso-wrap-distance-right:9pt;mso-wrap-distance-bottom:0;mso-position-horizontal:absolute;mso-position-horizontal-relative:text;mso-position-vertical:absolute;mso-position-vertical-relative:text;mso-width-percent:0;mso-height-percent:0;mso-width-relative:margin;mso-height-relative:margin;v-text-anchor:top" o:gfxdata="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" fillcolor="white [3201]" strokeweight=".5pt">
                 <v:textbox>
                   <w:txbxContent>
                     <w:p>
@@ -1859,7 +1954,6 @@
                         </w:rPr>
                         <w:t xml:space="preserve"> the ‘</w:t>
                       </w:r>
-                      <w:proofErr w:type="spellStart"/>
                       <w:r>
                         <w:rPr>
                           <w:i/>
@@ -1876,7 +1970,6 @@
                         </w:rPr>
                         <w:t>Admission</w:t>
                       </w:r>
-                      <w:proofErr w:type="spellEnd"/>
                       <w:r>
                         <w:rPr>
                           <w:i/>
@@ -1897,228 +1990,16 @@
         <w:rPr>
           <w:noProof/>
         </w:rPr>
-        <mc:AlternateContent>
-          <mc:Choice Requires="wps">
-            <w:drawing>
-              <wp:anchor distT="0" distB="0" distL="114300" distR="114300" simplePos="0" relativeHeight="251666432" behindDoc="0" locked="0" layoutInCell="1" allowOverlap="1" wp14:anchorId="54B00759" wp14:editId="2B99FA10">
-                <wp:simplePos x="0" y="0"/>
-                <wp:positionH relativeFrom="margin">
-                  <wp:align>left</wp:align>
-                </wp:positionH>
-                <wp:positionV relativeFrom="paragraph">
-                  <wp:posOffset>584835</wp:posOffset>
-                </wp:positionV>
-                <wp:extent cx="1501140" cy="480060"/>
-                <wp:effectExtent l="0" t="0" r="22860" b="15240"/>
-                <wp:wrapNone/>
-                <wp:docPr id="1002869855" name="Text Box 1"/>
-                <wp:cNvGraphicFramePr/>
-                <a:graphic xmlns:a="http://schemas.openxmlformats.org/drawingml/2006/main">
-                  <a:graphicData uri="http://schemas.microsoft.com/office/word/2010/wordprocessingShape">
-                    <wps:wsp>
-                      <wps:cNvSpPr txBox="1"/>
-                      <wps:spPr>
-                        <a:xfrm>
-                          <a:off x="0" y="0"/>
-                          <a:ext cx="1501140" cy="480060"/>
-                        </a:xfrm>
-                        <a:prstGeom prst="rect">
-                          <a:avLst/>
-                        </a:prstGeom>
-                        <a:solidFill>
-                          <a:schemeClr val="lt1"/>
-                        </a:solidFill>
-                        <a:ln w="3175">
-                          <a:solidFill>
-                            <a:prstClr val="black"/>
-                          </a:solidFill>
-                        </a:ln>
-                      </wps:spPr>
-                      <wps:txbx>
-                        <w:txbxContent>
-                          <w:p>
-                            <w:pPr>
-                              <w:rPr>
-                                <w:i/>
-                                <w:iCs/>
-                                <w:lang w:val="en-US"/>
-                              </w:rPr>
-                            </w:pPr>
-                            <w:r>
-                              <w:rPr>
-                                <w:i/>
-                                <w:iCs/>
-                                <w:lang w:val="en-US"/>
-                              </w:rPr>
-                              <w:t>Choosing appropriate columns</w:t>
-                            </w:r>
-                            <w:r>
-                              <w:rPr>
-                                <w:i/>
-                                <w:iCs/>
-                                <w:lang w:val="en-US"/>
-                              </w:rPr>
-                              <w:t>:</w:t>
-                            </w:r>
-                          </w:p>
-                        </w:txbxContent>
-                      </wps:txbx>
-                      <wps:bodyPr rot="0" spcFirstLastPara="0" vertOverflow="overflow" horzOverflow="overflow" vert="horz" wrap="square" lIns="91440" tIns="45720" rIns="91440" bIns="45720" numCol="1" spcCol="0" rtlCol="0" fromWordArt="0" anchor="t" anchorCtr="0" forceAA="0" compatLnSpc="1">
-                        <a:prstTxWarp prst="textNoShape">
-                          <a:avLst/>
-                        </a:prstTxWarp>
-                        <a:noAutofit/>
-                      </wps:bodyPr>
-                    </wps:wsp>
-                  </a:graphicData>
-                </a:graphic>
-                <wp14:sizeRelH relativeFrom="margin">
-                  <wp14:pctWidth>0</wp14:pctWidth>
-                </wp14:sizeRelH>
-                <wp14:sizeRelV relativeFrom="margin">
-                  <wp14:pctHeight>0</wp14:pctHeight>
-                </wp14:sizeRelV>
-              </wp:anchor>
-            </w:drawing>
-          </mc:Choice>
-          <mc:Fallback>
-            <w:pict>
-              <v:shape w14:anchorId="54B00759" id="_x0000_s1031" type="#_x0000_t202" style="position:absolute;margin-left:0;margin-top:46.05pt;width:118.2pt;height:37.8pt;z-index:251666432;visibility:visible;mso-wrap-style:square;mso-width-percent:0;mso-height-percent:0;mso-wrap-distance-left:9pt;mso-wrap-distance-top:0;mso-wrap-distance-right:9pt;mso-wrap-distance-bottom:0;mso-position-horizontal:left;mso-position-horizontal-relative:margin;mso-position-vertical:absolute;mso-position-vertical-relative:text;mso-width-percent:0;mso-height-percent:0;mso-width-relative:margin;mso-height-relative:margin;v-text-anchor:top" o:gfxdata="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" fillcolor="white [3201]" strokeweight=".25pt">
-                <v:textbox>
-                  <w:txbxContent>
-                    <w:p>
-                      <w:pPr>
-                        <w:rPr>
-                          <w:i/>
-                          <w:iCs/>
-                          <w:lang w:val="en-US"/>
-                        </w:rPr>
-                      </w:pPr>
-                      <w:r>
-                        <w:rPr>
-                          <w:i/>
-                          <w:iCs/>
-                          <w:lang w:val="en-US"/>
-                        </w:rPr>
-                        <w:t>Choosing appropriate columns</w:t>
-                      </w:r>
-                      <w:r>
-                        <w:rPr>
-                          <w:i/>
-                          <w:iCs/>
-                          <w:lang w:val="en-US"/>
-                        </w:rPr>
-                        <w:t>:</w:t>
-                      </w:r>
-                    </w:p>
-                  </w:txbxContent>
-                </v:textbox>
-                <w10:wrap anchorx="margin"/>
-              </v:shape>
-            </w:pict>
-          </mc:Fallback>
-        </mc:AlternateContent>
-      </w:r>
-      <w:r>
-        <w:rPr>
-          <w:lang w:val="en-US"/>
-        </w:rPr>
-        <w:t>Below is a screenshot of choosing the appropriate columns for ‘</w:t>
-      </w:r>
-      <w:proofErr w:type="spellStart"/>
-      <w:r>
-        <w:rPr>
-          <w:lang w:val="en-US"/>
-        </w:rPr>
-        <w:t>Dim_</w:t>
-      </w:r>
-      <w:r>
-        <w:rPr>
-          <w:lang w:val="en-US"/>
-        </w:rPr>
-        <w:t>Admission</w:t>
-      </w:r>
-      <w:proofErr w:type="spellEnd"/>
-      <w:r>
-        <w:rPr>
-          <w:lang w:val="en-US"/>
-        </w:rPr>
-        <w:t>’ dimension table. Thereafter, I removed duplicate rows</w:t>
-      </w:r>
-      <w:r>
-        <w:rPr>
-          <w:lang w:val="en-US"/>
-        </w:rPr>
-        <w:t xml:space="preserve"> and </w:t>
-      </w:r>
-      <w:r>
-        <w:rPr>
-          <w:lang w:val="en-US"/>
-        </w:rPr>
-        <w:t xml:space="preserve">created a surrogate key to aid while creating a relationship between </w:t>
-      </w:r>
-      <w:proofErr w:type="spellStart"/>
-      <w:r>
-        <w:rPr>
-          <w:lang w:val="en-US"/>
-        </w:rPr>
-        <w:t>Fact_Encounter</w:t>
-      </w:r>
-      <w:proofErr w:type="spellEnd"/>
-      <w:r>
-        <w:rPr>
-          <w:lang w:val="en-US"/>
-        </w:rPr>
-        <w:t xml:space="preserve"> and </w:t>
-      </w:r>
-      <w:proofErr w:type="spellStart"/>
-      <w:r>
-        <w:rPr>
-          <w:lang w:val="en-US"/>
-        </w:rPr>
-        <w:t>Dim_Admission</w:t>
-      </w:r>
-      <w:proofErr w:type="spellEnd"/>
-      <w:r>
-        <w:rPr>
-          <w:lang w:val="en-US"/>
-        </w:rPr>
-        <w:t>.</w:t>
-      </w:r>
-      <w:r>
-        <w:rPr>
-          <w:lang w:val="en-US"/>
-        </w:rPr>
         <w:t xml:space="preserve"> </w:t>
       </w:r>
-    </w:p>
-    <w:p>
-      <w:pPr>
-        <w:rPr>
-          <w:lang w:val="en-US"/>
-        </w:rPr>
-      </w:pPr>
-    </w:p>
-    <w:p>
-      <w:pPr>
-        <w:rPr>
-          <w:lang w:val="en-US"/>
-        </w:rPr>
-      </w:pPr>
-      <w:r>
-        <w:rPr>
-          <w:noProof/>
-        </w:rPr>
-        <w:t xml:space="preserve"> </w:t>
-      </w:r>
       <w:r>
         <w:rPr>
           <w:noProof/>
         </w:rPr>
         <w:drawing>
-          <wp:inline distT="0" distB="0" distL="0" distR="0" wp14:anchorId="6F75FEFC" wp14:editId="311FC1EC">
-            <wp:extent cx="1325880" cy="2392680"/>
-            <wp:effectExtent l="0" t="0" r="7620" b="7620"/>
+          <wp:inline distT="0" distB="0" distL="0" distR="0" wp14:anchorId="6F75FEFC" wp14:editId="46FC046C">
+            <wp:extent cx="1176866" cy="2123770"/>
+            <wp:effectExtent l="0" t="0" r="4445" b="0"/>
             <wp:docPr id="1636714163" name="Picture 1"/>
             <wp:cNvGraphicFramePr>
               <a:graphicFrameLocks xmlns:a="http://schemas.openxmlformats.org/drawingml/2006/main" noChangeAspect="1"/>
@@ -2138,7 +2019,7 @@
                   <pic:spPr bwMode="auto">
                     <a:xfrm>
                       <a:off x="0" y="0"/>
-                      <a:ext cx="1325880" cy="2392680"/>
+                      <a:ext cx="1179243" cy="2128060"/>
                     </a:xfrm>
                     <a:prstGeom prst="rect">
                       <a:avLst/>
@@ -2162,17 +2043,17 @@
         <w:rPr>
           <w:noProof/>
         </w:rPr>
-        <w:t xml:space="preserve">                                   </w:t>
+        <w:t xml:space="preserve">        </w:t>
       </w:r>
       <w:r>
         <w:rPr>
           <w:noProof/>
         </w:rPr>
         <w:drawing>
-          <wp:inline distT="0" distB="0" distL="0" distR="0" wp14:anchorId="64B500D3" wp14:editId="0EED89F4">
-            <wp:extent cx="2811780" cy="2522220"/>
-            <wp:effectExtent l="0" t="0" r="7620" b="0"/>
-            <wp:docPr id="536979437" name="Picture 1"/>
+          <wp:inline distT="0" distB="0" distL="0" distR="0" wp14:anchorId="67D34FDA" wp14:editId="0FC18D71">
+            <wp:extent cx="2979420" cy="1385464"/>
+            <wp:effectExtent l="0" t="0" r="0" b="5715"/>
+            <wp:docPr id="801341451" name="Picture 1"/>
             <wp:cNvGraphicFramePr>
               <a:graphicFrameLocks xmlns:a="http://schemas.openxmlformats.org/drawingml/2006/main" noChangeAspect="1"/>
             </wp:cNvGraphicFramePr>
@@ -2180,18 +2061,18 @@
               <a:graphicData uri="http://schemas.openxmlformats.org/drawingml/2006/picture">
                 <pic:pic xmlns:pic="http://schemas.openxmlformats.org/drawingml/2006/picture">
                   <pic:nvPicPr>
-                    <pic:cNvPr id="536979437" name=""/>
+                    <pic:cNvPr id="751929249" name=""/>
                     <pic:cNvPicPr/>
                   </pic:nvPicPr>
                   <pic:blipFill rotWithShape="1">
                     <a:blip r:embed="rId9"/>
-                    <a:srcRect l="10769" t="16781" r="40173" b="4984"/>
+                    <a:srcRect l="12364" t="18673" r="28739" b="32637"/>
                     <a:stretch/>
                   </pic:blipFill>
                   <pic:spPr bwMode="auto">
                     <a:xfrm>
                       <a:off x="0" y="0"/>
-                      <a:ext cx="2811780" cy="2522220"/>
+                      <a:ext cx="2984942" cy="1388032"/>
                     </a:xfrm>
                     <a:prstGeom prst="rect">
                       <a:avLst/>
@@ -2211,6 +2092,12 @@
           </wp:inline>
         </w:drawing>
       </w:r>
+      <w:r>
+        <w:rPr>
+          <w:noProof/>
+        </w:rPr>
+        <w:t xml:space="preserve">                           </w:t>
+      </w:r>
     </w:p>
     <w:p>
       <w:pPr>
@@ -2227,16 +2114,15 @@
           <w:lang w:val="en-US"/>
         </w:rPr>
         <w:lastRenderedPageBreak/>
-        <w:t>Building ‘</w:t>
-      </w:r>
-      <w:proofErr w:type="spellStart"/>
+        <w:t>Building ‘Dim_</w:t>
+      </w:r>
       <w:r>
         <w:rPr>
           <w:b/>
           <w:bCs/>
           <w:lang w:val="en-US"/>
         </w:rPr>
-        <w:t>Dim_</w:t>
+        <w:t>Diagnosis</w:t>
       </w:r>
       <w:r>
         <w:rPr>
@@ -2244,15 +2130,6 @@
           <w:bCs/>
           <w:lang w:val="en-US"/>
         </w:rPr>
-        <w:t>Diagnosis</w:t>
-      </w:r>
-      <w:proofErr w:type="spellEnd"/>
-      <w:r>
-        <w:rPr>
-          <w:b/>
-          <w:bCs/>
-          <w:lang w:val="en-US"/>
-        </w:rPr>
         <w:t>’:</w:t>
       </w:r>
     </w:p>
@@ -2334,7 +2211,6 @@
         </w:rPr>
         <w:t>’, ‘</w:t>
       </w:r>
-      <w:proofErr w:type="spellStart"/>
       <w:r>
         <w:rPr>
           <w:i/>
@@ -2343,7 +2219,6 @@
         </w:rPr>
         <w:t>Diagnosis_ID</w:t>
       </w:r>
-      <w:proofErr w:type="spellEnd"/>
       <w:r>
         <w:rPr>
           <w:lang w:val="en-US"/>
@@ -2354,6 +2229,26 @@
         <w:rPr>
           <w:lang w:val="en-US"/>
         </w:rPr>
+        <w:t>, ‘</w:t>
+      </w:r>
+      <w:r>
+        <w:rPr>
+          <w:i/>
+          <w:iCs/>
+          <w:lang w:val="en-US"/>
+        </w:rPr>
+        <w:t>Diagnosis_Key</w:t>
+      </w:r>
+      <w:r>
+        <w:rPr>
+          <w:lang w:val="en-US"/>
+        </w:rPr>
+        <w:t>’</w:t>
+      </w:r>
+      <w:r>
+        <w:rPr>
+          <w:lang w:val="en-US"/>
+        </w:rPr>
         <w:t>.</w:t>
       </w:r>
     </w:p>
@@ -2373,14 +2268,7 @@
         <w:rPr>
           <w:lang w:val="en-US"/>
         </w:rPr>
-        <w:t>elow is a screenshot of choosing the appropriate columns for ‘</w:t>
-      </w:r>
-      <w:proofErr w:type="spellStart"/>
-      <w:r>
-        <w:rPr>
-          <w:lang w:val="en-US"/>
-        </w:rPr>
-        <w:t>Dim_</w:t>
+        <w:t>elow is a screenshot of choosing the appropriate columns for ‘Dim_</w:t>
       </w:r>
       <w:r>
         <w:rPr>
@@ -2388,33 +2276,35 @@
         </w:rPr>
         <w:t>Diagnosis</w:t>
       </w:r>
-      <w:proofErr w:type="spellEnd"/>
-      <w:r>
-        <w:rPr>
-          <w:lang w:val="en-US"/>
-        </w:rPr>
-        <w:t xml:space="preserve">’ dimension table. Thereafter, I removed duplicate rows and created a surrogate key to aid while creating a relationship between </w:t>
-      </w:r>
-      <w:proofErr w:type="spellStart"/>
-      <w:r>
-        <w:rPr>
-          <w:lang w:val="en-US"/>
-        </w:rPr>
-        <w:t>Fact_Encounter</w:t>
-      </w:r>
-      <w:proofErr w:type="spellEnd"/>
-      <w:r>
-        <w:rPr>
-          <w:lang w:val="en-US"/>
-        </w:rPr>
-        <w:t xml:space="preserve"> and </w:t>
-      </w:r>
-      <w:proofErr w:type="spellStart"/>
-      <w:r>
-        <w:rPr>
-          <w:lang w:val="en-US"/>
-        </w:rPr>
-        <w:t>Dim_</w:t>
+      <w:r>
+        <w:rPr>
+          <w:lang w:val="en-US"/>
+        </w:rPr>
+        <w:t>’ dimension table. Thereafter, I removed duplicate rows</w:t>
+      </w:r>
+      <w:r>
+        <w:rPr>
+          <w:lang w:val="en-US"/>
+        </w:rPr>
+        <w:t xml:space="preserve">, created an index </w:t>
+      </w:r>
+      <w:r>
+        <w:rPr>
+          <w:lang w:val="en-US"/>
+        </w:rPr>
+        <w:t>key</w:t>
+      </w:r>
+      <w:r>
+        <w:rPr>
+          <w:lang w:val="en-US"/>
+        </w:rPr>
+        <w:t xml:space="preserve"> (Diagnosis_ID), and created a composite key (Diagnosis_Key)</w:t>
+      </w:r>
+      <w:r>
+        <w:rPr>
+          <w:lang w:val="en-US"/>
+        </w:rPr>
+        <w:t xml:space="preserve"> to aid while creating a relationship between Fact_Encounter and Dim_</w:t>
       </w:r>
       <w:r>
         <w:rPr>
@@ -2422,7 +2312,6 @@
         </w:rPr>
         <w:t>Diagnosis</w:t>
       </w:r>
-      <w:proofErr w:type="spellEnd"/>
       <w:r>
         <w:rPr>
           <w:lang w:val="en-US"/>
@@ -2443,200 +2332,7 @@
         <mc:AlternateContent>
           <mc:Choice Requires="wps">
             <w:drawing>
-              <wp:anchor distT="0" distB="0" distL="114300" distR="114300" simplePos="0" relativeHeight="251672576" behindDoc="0" locked="0" layoutInCell="1" allowOverlap="1" wp14:anchorId="15931BD9" wp14:editId="024ED871">
-                <wp:simplePos x="0" y="0"/>
-                <wp:positionH relativeFrom="column">
-                  <wp:posOffset>1783080</wp:posOffset>
-                </wp:positionH>
-                <wp:positionV relativeFrom="paragraph">
-                  <wp:posOffset>6985</wp:posOffset>
-                </wp:positionV>
-                <wp:extent cx="3512820" cy="342900"/>
-                <wp:effectExtent l="0" t="0" r="11430" b="19050"/>
-                <wp:wrapNone/>
-                <wp:docPr id="1067158044" name="Text Box 2"/>
-                <wp:cNvGraphicFramePr/>
-                <a:graphic xmlns:a="http://schemas.openxmlformats.org/drawingml/2006/main">
-                  <a:graphicData uri="http://schemas.microsoft.com/office/word/2010/wordprocessingShape">
-                    <wps:wsp>
-                      <wps:cNvSpPr txBox="1"/>
-                      <wps:spPr>
-                        <a:xfrm>
-                          <a:off x="0" y="0"/>
-                          <a:ext cx="3512820" cy="342900"/>
-                        </a:xfrm>
-                        <a:prstGeom prst="rect">
-                          <a:avLst/>
-                        </a:prstGeom>
-                        <a:solidFill>
-                          <a:schemeClr val="lt1"/>
-                        </a:solidFill>
-                        <a:ln w="6350">
-                          <a:solidFill>
-                            <a:prstClr val="black"/>
-                          </a:solidFill>
-                        </a:ln>
-                      </wps:spPr>
-                      <wps:txbx>
-                        <w:txbxContent>
-                          <w:p>
-                            <w:pPr>
-                              <w:rPr>
-                                <w:i/>
-                                <w:iCs/>
-                                <w:lang w:val="en-US"/>
-                              </w:rPr>
-                            </w:pPr>
-                            <w:r>
-                              <w:rPr>
-                                <w:i/>
-                                <w:iCs/>
-                                <w:lang w:val="en-US"/>
-                              </w:rPr>
-                              <w:t>Screenshot</w:t>
-                            </w:r>
-                            <w:r>
-                              <w:rPr>
-                                <w:i/>
-                                <w:iCs/>
-                                <w:lang w:val="en-US"/>
-                              </w:rPr>
-                              <w:t xml:space="preserve"> of</w:t>
-                            </w:r>
-                            <w:r>
-                              <w:rPr>
-                                <w:i/>
-                                <w:iCs/>
-                                <w:lang w:val="en-US"/>
-                              </w:rPr>
-                              <w:t xml:space="preserve"> the ‘</w:t>
-                            </w:r>
-                            <w:proofErr w:type="spellStart"/>
-                            <w:r>
-                              <w:rPr>
-                                <w:i/>
-                                <w:iCs/>
-                                <w:lang w:val="en-US"/>
-                              </w:rPr>
-                              <w:t>Dim_</w:t>
-                            </w:r>
-                            <w:r>
-                              <w:rPr>
-                                <w:i/>
-                                <w:iCs/>
-                                <w:lang w:val="en-US"/>
-                              </w:rPr>
-                              <w:t>Diagnosis</w:t>
-                            </w:r>
-                            <w:proofErr w:type="spellEnd"/>
-                            <w:r>
-                              <w:rPr>
-                                <w:i/>
-                                <w:iCs/>
-                                <w:lang w:val="en-US"/>
-                              </w:rPr>
-                              <w:t>’ table after creating it:</w:t>
-                            </w:r>
-                          </w:p>
-                        </w:txbxContent>
-                      </wps:txbx>
-                      <wps:bodyPr rot="0" spcFirstLastPara="0" vertOverflow="overflow" horzOverflow="overflow" vert="horz" wrap="square" lIns="91440" tIns="45720" rIns="91440" bIns="45720" numCol="1" spcCol="0" rtlCol="0" fromWordArt="0" anchor="t" anchorCtr="0" forceAA="0" compatLnSpc="1">
-                        <a:prstTxWarp prst="textNoShape">
-                          <a:avLst/>
-                        </a:prstTxWarp>
-                        <a:noAutofit/>
-                      </wps:bodyPr>
-                    </wps:wsp>
-                  </a:graphicData>
-                </a:graphic>
-                <wp14:sizeRelH relativeFrom="margin">
-                  <wp14:pctWidth>0</wp14:pctWidth>
-                </wp14:sizeRelH>
-                <wp14:sizeRelV relativeFrom="margin">
-                  <wp14:pctHeight>0</wp14:pctHeight>
-                </wp14:sizeRelV>
-              </wp:anchor>
-            </w:drawing>
-          </mc:Choice>
-          <mc:Fallback>
-            <w:pict>
-              <v:shape w14:anchorId="15931BD9" id="_x0000_s1032" type="#_x0000_t202" style="position:absolute;margin-left:140.4pt;margin-top:.55pt;width:276.6pt;height:27pt;z-index:251672576;visibility:visible;mso-wrap-style:square;mso-width-percent:0;mso-height-percent:0;mso-wrap-distance-left:9pt;mso-wrap-distance-top:0;mso-wrap-distance-right:9pt;mso-wrap-distance-bottom:0;mso-position-horizontal:absolute;mso-position-horizontal-relative:text;mso-position-vertical:absolute;mso-position-vertical-relative:text;mso-width-percent:0;mso-height-percent:0;mso-width-relative:margin;mso-height-relative:margin;v-text-anchor:top" o:gfxdata="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" fillcolor="white [3201]" strokeweight=".5pt">
-                <v:textbox>
-                  <w:txbxContent>
-                    <w:p>
-                      <w:pPr>
-                        <w:rPr>
-                          <w:i/>
-                          <w:iCs/>
-                          <w:lang w:val="en-US"/>
-                        </w:rPr>
-                      </w:pPr>
-                      <w:r>
-                        <w:rPr>
-                          <w:i/>
-                          <w:iCs/>
-                          <w:lang w:val="en-US"/>
-                        </w:rPr>
-                        <w:t>Screenshot</w:t>
-                      </w:r>
-                      <w:r>
-                        <w:rPr>
-                          <w:i/>
-                          <w:iCs/>
-                          <w:lang w:val="en-US"/>
-                        </w:rPr>
-                        <w:t xml:space="preserve"> of</w:t>
-                      </w:r>
-                      <w:r>
-                        <w:rPr>
-                          <w:i/>
-                          <w:iCs/>
-                          <w:lang w:val="en-US"/>
-                        </w:rPr>
-                        <w:t xml:space="preserve"> the ‘</w:t>
-                      </w:r>
-                      <w:proofErr w:type="spellStart"/>
-                      <w:r>
-                        <w:rPr>
-                          <w:i/>
-                          <w:iCs/>
-                          <w:lang w:val="en-US"/>
-                        </w:rPr>
-                        <w:t>Dim_</w:t>
-                      </w:r>
-                      <w:r>
-                        <w:rPr>
-                          <w:i/>
-                          <w:iCs/>
-                          <w:lang w:val="en-US"/>
-                        </w:rPr>
-                        <w:t>Diagnosis</w:t>
-                      </w:r>
-                      <w:proofErr w:type="spellEnd"/>
-                      <w:r>
-                        <w:rPr>
-                          <w:i/>
-                          <w:iCs/>
-                          <w:lang w:val="en-US"/>
-                        </w:rPr>
-                        <w:t>’ table after creating it:</w:t>
-                      </w:r>
-                    </w:p>
-                  </w:txbxContent>
-                </v:textbox>
-              </v:shape>
-            </w:pict>
-          </mc:Fallback>
-        </mc:AlternateContent>
-      </w:r>
-      <w:r>
-        <w:rPr>
-          <w:noProof/>
-        </w:rPr>
-        <mc:AlternateContent>
-          <mc:Choice Requires="wps">
-            <w:drawing>
-              <wp:anchor distT="0" distB="0" distL="114300" distR="114300" simplePos="0" relativeHeight="251670528" behindDoc="0" locked="0" layoutInCell="1" allowOverlap="1" wp14:anchorId="52AB885D" wp14:editId="199B44E2">
+              <wp:anchor distT="0" distB="0" distL="114300" distR="114300" simplePos="0" relativeHeight="251670528" behindDoc="0" locked="0" layoutInCell="1" allowOverlap="1" wp14:anchorId="52AB885D" wp14:editId="195CE9C7">
                 <wp:simplePos x="0" y="0"/>
                 <wp:positionH relativeFrom="margin">
                   <wp:posOffset>0</wp:posOffset>
@@ -2719,7 +2415,7 @@
           </mc:Choice>
           <mc:Fallback>
             <w:pict>
-              <v:shape w14:anchorId="52AB885D" id="_x0000_s1033" type="#_x0000_t202" style="position:absolute;margin-left:0;margin-top:-.05pt;width:118.2pt;height:37.8pt;z-index:251670528;visibility:visible;mso-wrap-style:square;mso-width-percent:0;mso-height-percent:0;mso-wrap-distance-left:9pt;mso-wrap-distance-top:0;mso-wrap-distance-right:9pt;mso-wrap-distance-bottom:0;mso-position-horizontal:absolute;mso-position-horizontal-relative:margin;mso-position-vertical:absolute;mso-position-vertical-relative:text;mso-width-percent:0;mso-height-percent:0;mso-width-relative:margin;mso-height-relative:margin;v-text-anchor:top" o:gfxdata="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" fillcolor="white [3201]" strokeweight=".25pt">
+              <v:shape w14:anchorId="52AB885D" id="_x0000_s1032" type="#_x0000_t202" style="position:absolute;margin-left:0;margin-top:-.05pt;width:118.2pt;height:37.8pt;z-index:251670528;visibility:visible;mso-wrap-style:square;mso-width-percent:0;mso-height-percent:0;mso-wrap-distance-left:9pt;mso-wrap-distance-top:0;mso-wrap-distance-right:9pt;mso-wrap-distance-bottom:0;mso-position-horizontal:absolute;mso-position-horizontal-relative:margin;mso-position-vertical:absolute;mso-position-vertical-relative:text;mso-width-percent:0;mso-height-percent:0;mso-width-relative:margin;mso-height-relative:margin;v-text-anchor:top" o:gfxdata="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" fillcolor="white [3201]" strokeweight=".25pt">
                 <v:textbox>
                   <w:txbxContent>
                     <w:p>
@@ -2769,6 +2465,195 @@
           <w:noProof/>
         </w:rPr>
       </w:pPr>
+      <w:r>
+        <w:rPr>
+          <w:noProof/>
+        </w:rPr>
+        <mc:AlternateContent>
+          <mc:Choice Requires="wps">
+            <w:drawing>
+              <wp:anchor distT="0" distB="0" distL="114300" distR="114300" simplePos="0" relativeHeight="251672576" behindDoc="0" locked="0" layoutInCell="1" allowOverlap="1" wp14:anchorId="15931BD9" wp14:editId="44DC78CA">
+                <wp:simplePos x="0" y="0"/>
+                <wp:positionH relativeFrom="column">
+                  <wp:posOffset>2130213</wp:posOffset>
+                </wp:positionH>
+                <wp:positionV relativeFrom="paragraph">
+                  <wp:posOffset>561552</wp:posOffset>
+                </wp:positionV>
+                <wp:extent cx="3512820" cy="342900"/>
+                <wp:effectExtent l="0" t="0" r="11430" b="19050"/>
+                <wp:wrapNone/>
+                <wp:docPr id="1067158044" name="Text Box 2"/>
+                <wp:cNvGraphicFramePr/>
+                <a:graphic xmlns:a="http://schemas.openxmlformats.org/drawingml/2006/main">
+                  <a:graphicData uri="http://schemas.microsoft.com/office/word/2010/wordprocessingShape">
+                    <wps:wsp>
+                      <wps:cNvSpPr txBox="1"/>
+                      <wps:spPr>
+                        <a:xfrm>
+                          <a:off x="0" y="0"/>
+                          <a:ext cx="3512820" cy="342900"/>
+                        </a:xfrm>
+                        <a:prstGeom prst="rect">
+                          <a:avLst/>
+                        </a:prstGeom>
+                        <a:solidFill>
+                          <a:schemeClr val="lt1"/>
+                        </a:solidFill>
+                        <a:ln w="6350">
+                          <a:solidFill>
+                            <a:prstClr val="black"/>
+                          </a:solidFill>
+                        </a:ln>
+                      </wps:spPr>
+                      <wps:txbx>
+                        <w:txbxContent>
+                          <w:p>
+                            <w:pPr>
+                              <w:rPr>
+                                <w:i/>
+                                <w:iCs/>
+                                <w:lang w:val="en-US"/>
+                              </w:rPr>
+                            </w:pPr>
+                            <w:r>
+                              <w:rPr>
+                                <w:i/>
+                                <w:iCs/>
+                                <w:lang w:val="en-US"/>
+                              </w:rPr>
+                              <w:t>Screenshot</w:t>
+                            </w:r>
+                            <w:r>
+                              <w:rPr>
+                                <w:i/>
+                                <w:iCs/>
+                                <w:lang w:val="en-US"/>
+                              </w:rPr>
+                              <w:t xml:space="preserve"> of</w:t>
+                            </w:r>
+                            <w:r>
+                              <w:rPr>
+                                <w:i/>
+                                <w:iCs/>
+                                <w:lang w:val="en-US"/>
+                              </w:rPr>
+                              <w:t xml:space="preserve"> the ‘</w:t>
+                            </w:r>
+                            <w:r>
+                              <w:rPr>
+                                <w:i/>
+                                <w:iCs/>
+                                <w:lang w:val="en-US"/>
+                              </w:rPr>
+                              <w:t>Dim_</w:t>
+                            </w:r>
+                            <w:r>
+                              <w:rPr>
+                                <w:i/>
+                                <w:iCs/>
+                                <w:lang w:val="en-US"/>
+                              </w:rPr>
+                              <w:t>Diagnosis</w:t>
+                            </w:r>
+                            <w:r>
+                              <w:rPr>
+                                <w:i/>
+                                <w:iCs/>
+                                <w:lang w:val="en-US"/>
+                              </w:rPr>
+                              <w:t>’ table after creating it:</w:t>
+                            </w:r>
+                          </w:p>
+                        </w:txbxContent>
+                      </wps:txbx>
+                      <wps:bodyPr rot="0" spcFirstLastPara="0" vertOverflow="overflow" horzOverflow="overflow" vert="horz" wrap="square" lIns="91440" tIns="45720" rIns="91440" bIns="45720" numCol="1" spcCol="0" rtlCol="0" fromWordArt="0" anchor="t" anchorCtr="0" forceAA="0" compatLnSpc="1">
+                        <a:prstTxWarp prst="textNoShape">
+                          <a:avLst/>
+                        </a:prstTxWarp>
+                        <a:noAutofit/>
+                      </wps:bodyPr>
+                    </wps:wsp>
+                  </a:graphicData>
+                </a:graphic>
+                <wp14:sizeRelH relativeFrom="margin">
+                  <wp14:pctWidth>0</wp14:pctWidth>
+                </wp14:sizeRelH>
+                <wp14:sizeRelV relativeFrom="margin">
+                  <wp14:pctHeight>0</wp14:pctHeight>
+                </wp14:sizeRelV>
+              </wp:anchor>
+            </w:drawing>
+          </mc:Choice>
+          <mc:Fallback>
+            <w:pict>
+              <v:shape w14:anchorId="15931BD9" id="_x0000_s1033" type="#_x0000_t202" style="position:absolute;margin-left:167.75pt;margin-top:44.2pt;width:276.6pt;height:27pt;z-index:251672576;visibility:visible;mso-wrap-style:square;mso-width-percent:0;mso-height-percent:0;mso-wrap-distance-left:9pt;mso-wrap-distance-top:0;mso-wrap-distance-right:9pt;mso-wrap-distance-bottom:0;mso-position-horizontal:absolute;mso-position-horizontal-relative:text;mso-position-vertical:absolute;mso-position-vertical-relative:text;mso-width-percent:0;mso-height-percent:0;mso-width-relative:margin;mso-height-relative:margin;v-text-anchor:top" o:gfxdata="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" fillcolor="white [3201]" strokeweight=".5pt">
+                <v:textbox>
+                  <w:txbxContent>
+                    <w:p>
+                      <w:pPr>
+                        <w:rPr>
+                          <w:i/>
+                          <w:iCs/>
+                          <w:lang w:val="en-US"/>
+                        </w:rPr>
+                      </w:pPr>
+                      <w:r>
+                        <w:rPr>
+                          <w:i/>
+                          <w:iCs/>
+                          <w:lang w:val="en-US"/>
+                        </w:rPr>
+                        <w:t>Screenshot</w:t>
+                      </w:r>
+                      <w:r>
+                        <w:rPr>
+                          <w:i/>
+                          <w:iCs/>
+                          <w:lang w:val="en-US"/>
+                        </w:rPr>
+                        <w:t xml:space="preserve"> of</w:t>
+                      </w:r>
+                      <w:r>
+                        <w:rPr>
+                          <w:i/>
+                          <w:iCs/>
+                          <w:lang w:val="en-US"/>
+                        </w:rPr>
+                        <w:t xml:space="preserve"> the ‘</w:t>
+                      </w:r>
+                      <w:r>
+                        <w:rPr>
+                          <w:i/>
+                          <w:iCs/>
+                          <w:lang w:val="en-US"/>
+                        </w:rPr>
+                        <w:t>Dim_</w:t>
+                      </w:r>
+                      <w:r>
+                        <w:rPr>
+                          <w:i/>
+                          <w:iCs/>
+                          <w:lang w:val="en-US"/>
+                        </w:rPr>
+                        <w:t>Diagnosis</w:t>
+                      </w:r>
+                      <w:r>
+                        <w:rPr>
+                          <w:i/>
+                          <w:iCs/>
+                          <w:lang w:val="en-US"/>
+                        </w:rPr>
+                        <w:t>’ table after creating it:</w:t>
+                      </w:r>
+                    </w:p>
+                  </w:txbxContent>
+                </v:textbox>
+              </v:shape>
+            </w:pict>
+          </mc:Fallback>
+        </mc:AlternateContent>
+      </w:r>
       <w:r>
         <w:rPr>
           <w:noProof/>
@@ -2827,10 +2712,10 @@
           <w:noProof/>
         </w:rPr>
         <w:drawing>
-          <wp:inline distT="0" distB="0" distL="0" distR="0" wp14:anchorId="1168609E" wp14:editId="6C4F53AE">
-            <wp:extent cx="2735580" cy="2476500"/>
-            <wp:effectExtent l="0" t="0" r="7620" b="0"/>
-            <wp:docPr id="1055476812" name="Picture 1"/>
+          <wp:inline distT="0" distB="0" distL="0" distR="0" wp14:anchorId="03214E11" wp14:editId="2FBC8984">
+            <wp:extent cx="3335867" cy="1337733"/>
+            <wp:effectExtent l="0" t="0" r="0" b="0"/>
+            <wp:docPr id="1272951671" name="Picture 1"/>
             <wp:cNvGraphicFramePr>
               <a:graphicFrameLocks xmlns:a="http://schemas.openxmlformats.org/drawingml/2006/main" noChangeAspect="1"/>
             </wp:cNvGraphicFramePr>
@@ -2838,18 +2723,18 @@
               <a:graphicData uri="http://schemas.openxmlformats.org/drawingml/2006/picture">
                 <pic:pic xmlns:pic="http://schemas.openxmlformats.org/drawingml/2006/picture">
                   <pic:nvPicPr>
-                    <pic:cNvPr id="1055476812" name=""/>
+                    <pic:cNvPr id="1972044580" name=""/>
                     <pic:cNvPicPr/>
                   </pic:nvPicPr>
                   <pic:blipFill rotWithShape="1">
                     <a:blip r:embed="rId11"/>
-                    <a:srcRect l="9838" t="18437" r="42433" b="4746"/>
+                    <a:srcRect l="10489" t="18909" r="31307" b="39595"/>
                     <a:stretch/>
                   </pic:blipFill>
                   <pic:spPr bwMode="auto">
                     <a:xfrm>
                       <a:off x="0" y="0"/>
-                      <a:ext cx="2735580" cy="2476500"/>
+                      <a:ext cx="3336005" cy="1337788"/>
                     </a:xfrm>
                     <a:prstGeom prst="rect">
                       <a:avLst/>
@@ -2878,38 +2763,164 @@
           <w:lang w:val="en-US"/>
         </w:rPr>
       </w:pPr>
-      <w:r>
+    </w:p>
+    <w:p>
+      <w:pPr>
         <w:rPr>
           <w:b/>
           <w:bCs/>
           <w:lang w:val="en-US"/>
         </w:rPr>
-        <w:t>Building ‘</w:t>
-      </w:r>
-      <w:proofErr w:type="spellStart"/>
-      <w:r>
+      </w:pPr>
+    </w:p>
+    <w:p>
+      <w:pPr>
         <w:rPr>
           <w:b/>
           <w:bCs/>
           <w:lang w:val="en-US"/>
         </w:rPr>
-        <w:t>Dim_</w:t>
-      </w:r>
-      <w:r>
+      </w:pPr>
+    </w:p>
+    <w:p>
+      <w:pPr>
         <w:rPr>
           <w:b/>
           <w:bCs/>
           <w:lang w:val="en-US"/>
         </w:rPr>
-        <w:t>Medication</w:t>
-      </w:r>
-      <w:proofErr w:type="spellEnd"/>
-      <w:r>
+      </w:pPr>
+    </w:p>
+    <w:p>
+      <w:pPr>
         <w:rPr>
           <w:b/>
           <w:bCs/>
           <w:lang w:val="en-US"/>
         </w:rPr>
+      </w:pPr>
+    </w:p>
+    <w:p>
+      <w:pPr>
+        <w:rPr>
+          <w:b/>
+          <w:bCs/>
+          <w:lang w:val="en-US"/>
+        </w:rPr>
+      </w:pPr>
+    </w:p>
+    <w:p>
+      <w:pPr>
+        <w:rPr>
+          <w:b/>
+          <w:bCs/>
+          <w:lang w:val="en-US"/>
+        </w:rPr>
+      </w:pPr>
+    </w:p>
+    <w:p>
+      <w:pPr>
+        <w:rPr>
+          <w:b/>
+          <w:bCs/>
+          <w:lang w:val="en-US"/>
+        </w:rPr>
+      </w:pPr>
+    </w:p>
+    <w:p>
+      <w:pPr>
+        <w:rPr>
+          <w:b/>
+          <w:bCs/>
+          <w:lang w:val="en-US"/>
+        </w:rPr>
+      </w:pPr>
+    </w:p>
+    <w:p>
+      <w:pPr>
+        <w:rPr>
+          <w:b/>
+          <w:bCs/>
+          <w:lang w:val="en-US"/>
+        </w:rPr>
+      </w:pPr>
+    </w:p>
+    <w:p>
+      <w:pPr>
+        <w:rPr>
+          <w:b/>
+          <w:bCs/>
+          <w:lang w:val="en-US"/>
+        </w:rPr>
+      </w:pPr>
+    </w:p>
+    <w:p>
+      <w:pPr>
+        <w:rPr>
+          <w:b/>
+          <w:bCs/>
+          <w:lang w:val="en-US"/>
+        </w:rPr>
+      </w:pPr>
+    </w:p>
+    <w:p>
+      <w:pPr>
+        <w:rPr>
+          <w:b/>
+          <w:bCs/>
+          <w:lang w:val="en-US"/>
+        </w:rPr>
+      </w:pPr>
+    </w:p>
+    <w:p>
+      <w:pPr>
+        <w:rPr>
+          <w:b/>
+          <w:bCs/>
+          <w:lang w:val="en-US"/>
+        </w:rPr>
+      </w:pPr>
+    </w:p>
+    <w:p>
+      <w:pPr>
+        <w:rPr>
+          <w:b/>
+          <w:bCs/>
+          <w:lang w:val="en-US"/>
+        </w:rPr>
+      </w:pPr>
+    </w:p>
+    <w:p>
+      <w:pPr>
+        <w:rPr>
+          <w:b/>
+          <w:bCs/>
+          <w:lang w:val="en-US"/>
+        </w:rPr>
+      </w:pPr>
+      <w:r>
+        <w:rPr>
+          <w:b/>
+          <w:bCs/>
+          <w:lang w:val="en-US"/>
+        </w:rPr>
+        <w:lastRenderedPageBreak/>
+        <w:t>Building ‘Dim_</w:t>
+      </w:r>
+      <w:r>
+        <w:rPr>
+          <w:b/>
+          <w:bCs/>
+          <w:lang w:val="en-US"/>
+        </w:rPr>
+        <w:t>Medication</w:t>
+      </w:r>
+      <w:r>
+        <w:rPr>
+          <w:b/>
+          <w:bCs/>
+          <w:lang w:val="en-US"/>
+        </w:rPr>
         <w:t>’:</w:t>
       </w:r>
     </w:p>
@@ -2943,7 +2954,6 @@
         </w:rPr>
         <w:t xml:space="preserve"> ‘</w:t>
       </w:r>
-      <w:proofErr w:type="spellStart"/>
       <w:r>
         <w:rPr>
           <w:i/>
@@ -2952,14 +2962,12 @@
         </w:rPr>
         <w:t>Drug_Name</w:t>
       </w:r>
-      <w:proofErr w:type="spellEnd"/>
       <w:r>
         <w:rPr>
           <w:lang w:val="en-US"/>
         </w:rPr>
         <w:t>’, ‘</w:t>
       </w:r>
-      <w:proofErr w:type="spellStart"/>
       <w:r>
         <w:rPr>
           <w:i/>
@@ -2968,14 +2976,12 @@
         </w:rPr>
         <w:t>Dosage_Change_Type</w:t>
       </w:r>
-      <w:proofErr w:type="spellEnd"/>
       <w:r>
         <w:rPr>
           <w:lang w:val="en-US"/>
         </w:rPr>
         <w:t>’, ‘</w:t>
       </w:r>
-      <w:proofErr w:type="spellStart"/>
       <w:r>
         <w:rPr>
           <w:i/>
@@ -2984,7 +2990,6 @@
         </w:rPr>
         <w:t>Medication_ID</w:t>
       </w:r>
-      <w:proofErr w:type="spellEnd"/>
       <w:r>
         <w:rPr>
           <w:lang w:val="en-US"/>
@@ -2995,6 +3000,26 @@
         <w:rPr>
           <w:lang w:val="en-US"/>
         </w:rPr>
+        <w:t>, ‘</w:t>
+      </w:r>
+      <w:r>
+        <w:rPr>
+          <w:i/>
+          <w:iCs/>
+          <w:lang w:val="en-US"/>
+        </w:rPr>
+        <w:t>Medication_Key</w:t>
+      </w:r>
+      <w:r>
+        <w:rPr>
+          <w:lang w:val="en-US"/>
+        </w:rPr>
+        <w:t>’</w:t>
+      </w:r>
+      <w:r>
+        <w:rPr>
+          <w:lang w:val="en-US"/>
+        </w:rPr>
         <w:t>.</w:t>
       </w:r>
     </w:p>
@@ -3008,63 +3033,13 @@
         <w:rPr>
           <w:lang w:val="en-US"/>
         </w:rPr>
-        <w:t>I referenced the cleaned main table and renamed the new table to ‘</w:t>
-      </w:r>
-      <w:proofErr w:type="spellStart"/>
-      <w:r>
-        <w:rPr>
-          <w:lang w:val="en-US"/>
-        </w:rPr>
-        <w:t>Dim_Medication</w:t>
-      </w:r>
-      <w:proofErr w:type="spellEnd"/>
-      <w:r>
-        <w:rPr>
-          <w:lang w:val="en-US"/>
-        </w:rPr>
-        <w:t>’. Thereafter, I unpivoted all 24 medication columns to ‘Attribute’ (which is medication name) and ‘Value’ (which is dosage change). I renamed ‘Attribute’ to ‘</w:t>
-      </w:r>
-      <w:proofErr w:type="spellStart"/>
-      <w:r>
-        <w:rPr>
-          <w:lang w:val="en-US"/>
-        </w:rPr>
-        <w:t>Drug_Name</w:t>
-      </w:r>
-      <w:proofErr w:type="spellEnd"/>
-      <w:r>
-        <w:rPr>
-          <w:lang w:val="en-US"/>
-        </w:rPr>
-        <w:t>’ and ‘Value’ to ‘</w:t>
-      </w:r>
-      <w:proofErr w:type="spellStart"/>
-      <w:r>
-        <w:rPr>
-          <w:lang w:val="en-US"/>
-        </w:rPr>
-        <w:t>Dosage_Change_Type</w:t>
-      </w:r>
-      <w:proofErr w:type="spellEnd"/>
-      <w:r>
-        <w:rPr>
-          <w:lang w:val="en-US"/>
-        </w:rPr>
-        <w:t>’. I then added an index column and renamed it to ‘</w:t>
-      </w:r>
-      <w:proofErr w:type="spellStart"/>
-      <w:r>
-        <w:rPr>
-          <w:lang w:val="en-US"/>
-        </w:rPr>
-        <w:t>Medication_ID</w:t>
-      </w:r>
-      <w:proofErr w:type="spellEnd"/>
-      <w:r>
-        <w:rPr>
-          <w:lang w:val="en-US"/>
-        </w:rPr>
-        <w:t>’.</w:t>
+        <w:t>I referenced the cleaned main table and renamed the new table to ‘Dim_Medication’. Thereafter, I unpivoted all 24 medication columns to ‘Attribute’ (which is medication name) and ‘Value’ (which is dosage change). I renamed ‘Attribute’ to ‘Drug_Name’ and ‘Value’ to ‘Dosage_Change_Type’. I then added an index column and renamed it to ‘Medication_ID’.</w:t>
+      </w:r>
+      <w:r>
+        <w:rPr>
+          <w:lang w:val="en-US"/>
+        </w:rPr>
+        <w:t xml:space="preserve"> Created a composite key ‘Medication_Key’ to aid when creating a relationship.</w:t>
       </w:r>
     </w:p>
     <w:p>
@@ -3344,7 +3319,7 @@
           <w:noProof/>
         </w:rPr>
         <w:drawing>
-          <wp:inline distT="0" distB="0" distL="0" distR="0" wp14:anchorId="0E4F4F80" wp14:editId="55D42FE5">
+          <wp:inline distT="0" distB="0" distL="0" distR="0" wp14:anchorId="0E4F4F80" wp14:editId="7B353529">
             <wp:extent cx="2933323" cy="2057400"/>
             <wp:effectExtent l="0" t="0" r="635" b="0"/>
             <wp:docPr id="1802360546" name="Picture 1"/>
@@ -3450,20 +3425,19 @@
         <w:rPr>
           <w:noProof/>
         </w:rPr>
-        <w:lastRenderedPageBreak/>
         <mc:AlternateContent>
           <mc:Choice Requires="wps">
             <w:drawing>
-              <wp:anchor distT="0" distB="0" distL="114300" distR="114300" simplePos="0" relativeHeight="251678720" behindDoc="0" locked="0" layoutInCell="1" allowOverlap="1" wp14:anchorId="160AF28A" wp14:editId="14DFD380">
+              <wp:anchor distT="0" distB="0" distL="114300" distR="114300" simplePos="0" relativeHeight="251678720" behindDoc="0" locked="0" layoutInCell="1" allowOverlap="1" wp14:anchorId="160AF28A" wp14:editId="0682AE0D">
                 <wp:simplePos x="0" y="0"/>
                 <wp:positionH relativeFrom="margin">
                   <wp:align>left</wp:align>
                 </wp:positionH>
                 <wp:positionV relativeFrom="paragraph">
-                  <wp:posOffset>0</wp:posOffset>
+                  <wp:posOffset>110702</wp:posOffset>
                 </wp:positionV>
-                <wp:extent cx="2308860" cy="487680"/>
-                <wp:effectExtent l="0" t="0" r="15240" b="26670"/>
+                <wp:extent cx="3471333" cy="321733"/>
+                <wp:effectExtent l="0" t="0" r="15240" b="21590"/>
                 <wp:wrapNone/>
                 <wp:docPr id="609893508" name="Text Box 2"/>
                 <wp:cNvGraphicFramePr/>
@@ -3474,7 +3448,7 @@
                       <wps:spPr>
                         <a:xfrm>
                           <a:off x="0" y="0"/>
-                          <a:ext cx="2308860" cy="487680"/>
+                          <a:ext cx="3471333" cy="321733"/>
                         </a:xfrm>
                         <a:prstGeom prst="rect">
                           <a:avLst/>
@@ -3522,7 +3496,6 @@
                               </w:rPr>
                               <w:t xml:space="preserve"> ‘</w:t>
                             </w:r>
-                            <w:proofErr w:type="spellStart"/>
                             <w:r>
                               <w:rPr>
                                 <w:i/>
@@ -3539,7 +3512,6 @@
                               </w:rPr>
                               <w:t>Medication</w:t>
                             </w:r>
-                            <w:proofErr w:type="spellEnd"/>
                             <w:r>
                               <w:rPr>
                                 <w:i/>
@@ -3571,7 +3543,7 @@
           </mc:Choice>
           <mc:Fallback>
             <w:pict>
-              <v:shape w14:anchorId="160AF28A" id="_x0000_s1036" type="#_x0000_t202" style="position:absolute;margin-left:0;margin-top:0;width:181.8pt;height:38.4pt;z-index:251678720;visibility:visible;mso-wrap-style:square;mso-width-percent:0;mso-height-percent:0;mso-wrap-distance-left:9pt;mso-wrap-distance-top:0;mso-wrap-distance-right:9pt;mso-wrap-distance-bottom:0;mso-position-horizontal:left;mso-position-horizontal-relative:margin;mso-position-vertical:absolute;mso-position-vertical-relative:text;mso-width-percent:0;mso-height-percent:0;mso-width-relative:margin;mso-height-relative:margin;v-text-anchor:top" o:gfxdata="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" fillcolor="white [3201]" strokeweight=".5pt">
+              <v:shape w14:anchorId="160AF28A" id="_x0000_s1036" type="#_x0000_t202" style="position:absolute;margin-left:0;margin-top:8.7pt;width:273.35pt;height:25.35pt;z-index:251678720;visibility:visible;mso-wrap-style:square;mso-width-percent:0;mso-height-percent:0;mso-wrap-distance-left:9pt;mso-wrap-distance-top:0;mso-wrap-distance-right:9pt;mso-wrap-distance-bottom:0;mso-position-horizontal:left;mso-position-horizontal-relative:margin;mso-position-vertical:absolute;mso-position-vertical-relative:text;mso-width-percent:0;mso-height-percent:0;mso-width-relative:margin;mso-height-relative:margin;v-text-anchor:top" o:gfxdata="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" fillcolor="white [3201]" strokeweight=".5pt">
                 <v:textbox>
                   <w:txbxContent>
                     <w:p>
@@ -3606,7 +3578,6 @@
                         </w:rPr>
                         <w:t xml:space="preserve"> ‘</w:t>
                       </w:r>
-                      <w:proofErr w:type="spellStart"/>
                       <w:r>
                         <w:rPr>
                           <w:i/>
@@ -3623,7 +3594,6 @@
                         </w:rPr>
                         <w:t>Medication</w:t>
                       </w:r>
-                      <w:proofErr w:type="spellEnd"/>
                       <w:r>
                         <w:rPr>
                           <w:i/>
@@ -3660,10 +3630,10 @@
           <w:noProof/>
         </w:rPr>
         <w:drawing>
-          <wp:inline distT="0" distB="0" distL="0" distR="0" wp14:anchorId="7F62355A" wp14:editId="66E5A786">
-            <wp:extent cx="2522220" cy="3082713"/>
-            <wp:effectExtent l="0" t="0" r="0" b="3810"/>
-            <wp:docPr id="891713307" name="Picture 1"/>
+          <wp:inline distT="0" distB="0" distL="0" distR="0" wp14:anchorId="0C09ED23" wp14:editId="53D190EC">
+            <wp:extent cx="2599267" cy="2404533"/>
+            <wp:effectExtent l="0" t="0" r="0" b="0"/>
+            <wp:docPr id="1335546210" name="Picture 1"/>
             <wp:cNvGraphicFramePr>
               <a:graphicFrameLocks xmlns:a="http://schemas.openxmlformats.org/drawingml/2006/main" noChangeAspect="1"/>
             </wp:cNvGraphicFramePr>
@@ -3671,18 +3641,18 @@
               <a:graphicData uri="http://schemas.openxmlformats.org/drawingml/2006/picture">
                 <pic:pic xmlns:pic="http://schemas.openxmlformats.org/drawingml/2006/picture">
                   <pic:nvPicPr>
-                    <pic:cNvPr id="891713307" name=""/>
+                    <pic:cNvPr id="1335546210" name=""/>
                     <pic:cNvPicPr/>
                   </pic:nvPicPr>
                   <pic:blipFill rotWithShape="1">
                     <a:blip r:embed="rId14"/>
-                    <a:srcRect l="12231" t="18673" r="53069" b="5929"/>
+                    <a:srcRect l="12557" t="17858" r="42089" b="7551"/>
                     <a:stretch/>
                   </pic:blipFill>
                   <pic:spPr bwMode="auto">
                     <a:xfrm>
                       <a:off x="0" y="0"/>
-                      <a:ext cx="2524107" cy="3085019"/>
+                      <a:ext cx="2599486" cy="2404736"/>
                     </a:xfrm>
                     <a:prstGeom prst="rect">
                       <a:avLst/>
@@ -3706,6 +3676,34 @@
     <w:p>
       <w:pPr>
         <w:rPr>
+          <w:noProof/>
+        </w:rPr>
+      </w:pPr>
+    </w:p>
+    <w:p>
+      <w:pPr>
+        <w:rPr>
+          <w:noProof/>
+        </w:rPr>
+      </w:pPr>
+    </w:p>
+    <w:p>
+      <w:pPr>
+        <w:rPr>
+          <w:noProof/>
+        </w:rPr>
+      </w:pPr>
+    </w:p>
+    <w:p>
+      <w:pPr>
+        <w:rPr>
+          <w:noProof/>
+        </w:rPr>
+      </w:pPr>
+    </w:p>
+    <w:p>
+      <w:pPr>
+        <w:rPr>
           <w:b/>
           <w:bCs/>
           <w:lang w:val="en-US"/>
@@ -3717,26 +3715,17 @@
           <w:bCs/>
           <w:lang w:val="en-US"/>
         </w:rPr>
-        <w:t>Building ‘</w:t>
-      </w:r>
-      <w:proofErr w:type="spellStart"/>
+        <w:lastRenderedPageBreak/>
+        <w:t>Building ‘Dim_</w:t>
+      </w:r>
       <w:r>
         <w:rPr>
           <w:b/>
           <w:bCs/>
           <w:lang w:val="en-US"/>
         </w:rPr>
-        <w:t>Dim_</w:t>
-      </w:r>
-      <w:r>
-        <w:rPr>
-          <w:b/>
-          <w:bCs/>
-          <w:lang w:val="en-US"/>
-        </w:rPr>
         <w:t>Date</w:t>
       </w:r>
-      <w:proofErr w:type="spellEnd"/>
       <w:r>
         <w:rPr>
           <w:b/>
@@ -3964,7 +3953,6 @@
                               </w:rPr>
                               <w:t xml:space="preserve"> ‘</w:t>
                             </w:r>
-                            <w:proofErr w:type="spellStart"/>
                             <w:r>
                               <w:rPr>
                                 <w:i/>
@@ -3981,7 +3969,6 @@
                               </w:rPr>
                               <w:t>Date</w:t>
                             </w:r>
-                            <w:proofErr w:type="spellEnd"/>
                             <w:r>
                               <w:rPr>
                                 <w:i/>
@@ -4048,7 +4035,6 @@
                         </w:rPr>
                         <w:t xml:space="preserve"> ‘</w:t>
                       </w:r>
-                      <w:proofErr w:type="spellStart"/>
                       <w:r>
                         <w:rPr>
                           <w:i/>
@@ -4065,7 +4051,6 @@
                         </w:rPr>
                         <w:t>Date</w:t>
                       </w:r>
-                      <w:proofErr w:type="spellEnd"/>
                       <w:r>
                         <w:rPr>
                           <w:i/>
@@ -4155,16 +4140,1059 @@
     <w:p>
       <w:pPr>
         <w:rPr>
-          <w:noProof/>
-        </w:rPr>
-      </w:pPr>
-    </w:p>
-    <w:p>
-      <w:pPr>
-        <w:rPr>
-          <w:noProof/>
-        </w:rPr>
-      </w:pPr>
+          <w:b/>
+          <w:bCs/>
+          <w:noProof/>
+        </w:rPr>
+      </w:pPr>
+      <w:r>
+        <w:rPr>
+          <w:b/>
+          <w:bCs/>
+          <w:noProof/>
+        </w:rPr>
+        <w:t>Creating relationships:</w:t>
+      </w:r>
+    </w:p>
+    <w:p>
+      <w:pPr>
+        <w:rPr>
+          <w:noProof/>
+        </w:rPr>
+      </w:pPr>
+      <w:r>
+        <w:rPr>
+          <w:noProof/>
+        </w:rPr>
+        <mc:AlternateContent>
+          <mc:Choice Requires="wps">
+            <w:drawing>
+              <wp:anchor distT="0" distB="0" distL="114300" distR="114300" simplePos="0" relativeHeight="251683840" behindDoc="0" locked="0" layoutInCell="1" allowOverlap="1" wp14:anchorId="44A0C246" wp14:editId="71F0821A">
+                <wp:simplePos x="0" y="0"/>
+                <wp:positionH relativeFrom="margin">
+                  <wp:posOffset>2827867</wp:posOffset>
+                </wp:positionH>
+                <wp:positionV relativeFrom="paragraph">
+                  <wp:posOffset>10583</wp:posOffset>
+                </wp:positionV>
+                <wp:extent cx="2886921" cy="787400"/>
+                <wp:effectExtent l="0" t="0" r="27940" b="12700"/>
+                <wp:wrapNone/>
+                <wp:docPr id="487421843" name="Text Box 3"/>
+                <wp:cNvGraphicFramePr/>
+                <a:graphic xmlns:a="http://schemas.openxmlformats.org/drawingml/2006/main">
+                  <a:graphicData uri="http://schemas.microsoft.com/office/word/2010/wordprocessingShape">
+                    <wps:wsp>
+                      <wps:cNvSpPr txBox="1"/>
+                      <wps:spPr>
+                        <a:xfrm>
+                          <a:off x="0" y="0"/>
+                          <a:ext cx="2886921" cy="787400"/>
+                        </a:xfrm>
+                        <a:prstGeom prst="rect">
+                          <a:avLst/>
+                        </a:prstGeom>
+                        <a:solidFill>
+                          <a:schemeClr val="lt1"/>
+                        </a:solidFill>
+                        <a:ln w="6350">
+                          <a:solidFill>
+                            <a:prstClr val="black"/>
+                          </a:solidFill>
+                        </a:ln>
+                      </wps:spPr>
+                      <wps:txbx>
+                        <w:txbxContent>
+                          <w:p>
+                            <w:pPr>
+                              <w:rPr>
+                                <w:noProof/>
+                              </w:rPr>
+                            </w:pPr>
+                            <w:r>
+                              <w:rPr>
+                                <w:noProof/>
+                              </w:rPr>
+                              <w:t>Relationship between Dim_</w:t>
+                            </w:r>
+                            <w:r>
+                              <w:rPr>
+                                <w:noProof/>
+                              </w:rPr>
+                              <w:t>Admission</w:t>
+                            </w:r>
+                            <w:r>
+                              <w:rPr>
+                                <w:noProof/>
+                              </w:rPr>
+                              <w:t xml:space="preserve"> and Fact_Encounter is one-to-many because one </w:t>
+                            </w:r>
+                            <w:r>
+                              <w:rPr>
+                                <w:noProof/>
+                              </w:rPr>
+                              <w:t>admission type can apply to</w:t>
+                            </w:r>
+                            <w:r>
+                              <w:rPr>
+                                <w:noProof/>
+                              </w:rPr>
+                              <w:t xml:space="preserve"> many encounters.</w:t>
+                            </w:r>
+                          </w:p>
+                          <w:p>
+                            <w:pPr>
+                              <w:rPr>
+                                <w:lang w:val="en-US"/>
+                              </w:rPr>
+                            </w:pPr>
+                          </w:p>
+                        </w:txbxContent>
+                      </wps:txbx>
+                      <wps:bodyPr rot="0" spcFirstLastPara="0" vertOverflow="overflow" horzOverflow="overflow" vert="horz" wrap="square" lIns="91440" tIns="45720" rIns="91440" bIns="45720" numCol="1" spcCol="0" rtlCol="0" fromWordArt="0" anchor="t" anchorCtr="0" forceAA="0" compatLnSpc="1">
+                        <a:prstTxWarp prst="textNoShape">
+                          <a:avLst/>
+                        </a:prstTxWarp>
+                        <a:noAutofit/>
+                      </wps:bodyPr>
+                    </wps:wsp>
+                  </a:graphicData>
+                </a:graphic>
+                <wp14:sizeRelH relativeFrom="margin">
+                  <wp14:pctWidth>0</wp14:pctWidth>
+                </wp14:sizeRelH>
+                <wp14:sizeRelV relativeFrom="margin">
+                  <wp14:pctHeight>0</wp14:pctHeight>
+                </wp14:sizeRelV>
+              </wp:anchor>
+            </w:drawing>
+          </mc:Choice>
+          <mc:Fallback>
+            <w:pict>
+              <v:shape w14:anchorId="44A0C246" id="Text Box 3" o:spid="_x0000_s1038" type="#_x0000_t202" style="position:absolute;margin-left:222.65pt;margin-top:.85pt;width:227.3pt;height:62pt;z-index:251683840;visibility:visible;mso-wrap-style:square;mso-width-percent:0;mso-height-percent:0;mso-wrap-distance-left:9pt;mso-wrap-distance-top:0;mso-wrap-distance-right:9pt;mso-wrap-distance-bottom:0;mso-position-horizontal:absolute;mso-position-horizontal-relative:margin;mso-position-vertical:absolute;mso-position-vertical-relative:text;mso-width-percent:0;mso-height-percent:0;mso-width-relative:margin;mso-height-relative:margin;v-text-anchor:top" o:gfxdata="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" fillcolor="white [3201]" strokeweight=".5pt">
+                <v:textbox>
+                  <w:txbxContent>
+                    <w:p>
+                      <w:pPr>
+                        <w:rPr>
+                          <w:noProof/>
+                        </w:rPr>
+                      </w:pPr>
+                      <w:r>
+                        <w:rPr>
+                          <w:noProof/>
+                        </w:rPr>
+                        <w:t>Relationship between Dim_</w:t>
+                      </w:r>
+                      <w:r>
+                        <w:rPr>
+                          <w:noProof/>
+                        </w:rPr>
+                        <w:t>Admission</w:t>
+                      </w:r>
+                      <w:r>
+                        <w:rPr>
+                          <w:noProof/>
+                        </w:rPr>
+                        <w:t xml:space="preserve"> and Fact_Encounter is one-to-many because one </w:t>
+                      </w:r>
+                      <w:r>
+                        <w:rPr>
+                          <w:noProof/>
+                        </w:rPr>
+                        <w:t>admission type can apply to</w:t>
+                      </w:r>
+                      <w:r>
+                        <w:rPr>
+                          <w:noProof/>
+                        </w:rPr>
+                        <w:t xml:space="preserve"> many encounters.</w:t>
+                      </w:r>
+                    </w:p>
+                    <w:p>
+                      <w:pPr>
+                        <w:rPr>
+                          <w:lang w:val="en-US"/>
+                        </w:rPr>
+                      </w:pPr>
+                    </w:p>
+                  </w:txbxContent>
+                </v:textbox>
+                <w10:wrap anchorx="margin"/>
+              </v:shape>
+            </w:pict>
+          </mc:Fallback>
+        </mc:AlternateContent>
+      </w:r>
+      <w:r>
+        <w:rPr>
+          <w:noProof/>
+        </w:rPr>
+        <mc:AlternateContent>
+          <mc:Choice Requires="wps">
+            <w:drawing>
+              <wp:anchor distT="0" distB="0" distL="114300" distR="114300" simplePos="0" relativeHeight="251681792" behindDoc="0" locked="0" layoutInCell="1" allowOverlap="1" wp14:anchorId="25B656E4" wp14:editId="4BF4E9BE">
+                <wp:simplePos x="0" y="0"/>
+                <wp:positionH relativeFrom="margin">
+                  <wp:align>left</wp:align>
+                </wp:positionH>
+                <wp:positionV relativeFrom="paragraph">
+                  <wp:posOffset>128905</wp:posOffset>
+                </wp:positionV>
+                <wp:extent cx="2583180" cy="746760"/>
+                <wp:effectExtent l="0" t="0" r="26670" b="15240"/>
+                <wp:wrapNone/>
+                <wp:docPr id="1911020100" name="Text Box 3"/>
+                <wp:cNvGraphicFramePr/>
+                <a:graphic xmlns:a="http://schemas.openxmlformats.org/drawingml/2006/main">
+                  <a:graphicData uri="http://schemas.microsoft.com/office/word/2010/wordprocessingShape">
+                    <wps:wsp>
+                      <wps:cNvSpPr txBox="1"/>
+                      <wps:spPr>
+                        <a:xfrm>
+                          <a:off x="0" y="0"/>
+                          <a:ext cx="2583180" cy="746760"/>
+                        </a:xfrm>
+                        <a:prstGeom prst="rect">
+                          <a:avLst/>
+                        </a:prstGeom>
+                        <a:solidFill>
+                          <a:schemeClr val="lt1"/>
+                        </a:solidFill>
+                        <a:ln w="6350">
+                          <a:solidFill>
+                            <a:prstClr val="black"/>
+                          </a:solidFill>
+                        </a:ln>
+                      </wps:spPr>
+                      <wps:txbx>
+                        <w:txbxContent>
+                          <w:p>
+                            <w:pPr>
+                              <w:rPr>
+                                <w:noProof/>
+                              </w:rPr>
+                            </w:pPr>
+                            <w:r>
+                              <w:rPr>
+                                <w:noProof/>
+                              </w:rPr>
+                              <w:t>Relationship between Dim_Patient and Fact_Encounter is one-to-many because one patient can have many encounters.</w:t>
+                            </w:r>
+                          </w:p>
+                          <w:p>
+                            <w:pPr>
+                              <w:rPr>
+                                <w:lang w:val="en-US"/>
+                              </w:rPr>
+                            </w:pPr>
+                          </w:p>
+                        </w:txbxContent>
+                      </wps:txbx>
+                      <wps:bodyPr rot="0" spcFirstLastPara="0" vertOverflow="overflow" horzOverflow="overflow" vert="horz" wrap="square" lIns="91440" tIns="45720" rIns="91440" bIns="45720" numCol="1" spcCol="0" rtlCol="0" fromWordArt="0" anchor="t" anchorCtr="0" forceAA="0" compatLnSpc="1">
+                        <a:prstTxWarp prst="textNoShape">
+                          <a:avLst/>
+                        </a:prstTxWarp>
+                        <a:noAutofit/>
+                      </wps:bodyPr>
+                    </wps:wsp>
+                  </a:graphicData>
+                </a:graphic>
+                <wp14:sizeRelH relativeFrom="margin">
+                  <wp14:pctWidth>0</wp14:pctWidth>
+                </wp14:sizeRelH>
+                <wp14:sizeRelV relativeFrom="margin">
+                  <wp14:pctHeight>0</wp14:pctHeight>
+                </wp14:sizeRelV>
+              </wp:anchor>
+            </w:drawing>
+          </mc:Choice>
+          <mc:Fallback>
+            <w:pict>
+              <v:shape w14:anchorId="25B656E4" id="_x0000_s1039" type="#_x0000_t202" style="position:absolute;margin-left:0;margin-top:10.15pt;width:203.4pt;height:58.8pt;z-index:251681792;visibility:visible;mso-wrap-style:square;mso-width-percent:0;mso-height-percent:0;mso-wrap-distance-left:9pt;mso-wrap-distance-top:0;mso-wrap-distance-right:9pt;mso-wrap-distance-bottom:0;mso-position-horizontal:left;mso-position-horizontal-relative:margin;mso-position-vertical:absolute;mso-position-vertical-relative:text;mso-width-percent:0;mso-height-percent:0;mso-width-relative:margin;mso-height-relative:margin;v-text-anchor:top" o:gfxdata="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" fillcolor="white [3201]" strokeweight=".5pt">
+                <v:textbox>
+                  <w:txbxContent>
+                    <w:p>
+                      <w:pPr>
+                        <w:rPr>
+                          <w:noProof/>
+                        </w:rPr>
+                      </w:pPr>
+                      <w:r>
+                        <w:rPr>
+                          <w:noProof/>
+                        </w:rPr>
+                        <w:t>Relationship between Dim_Patient and Fact_Encounter is one-to-many because one patient can have many encounters.</w:t>
+                      </w:r>
+                    </w:p>
+                    <w:p>
+                      <w:pPr>
+                        <w:rPr>
+                          <w:lang w:val="en-US"/>
+                        </w:rPr>
+                      </w:pPr>
+                    </w:p>
+                  </w:txbxContent>
+                </v:textbox>
+                <w10:wrap anchorx="margin"/>
+              </v:shape>
+            </w:pict>
+          </mc:Fallback>
+        </mc:AlternateContent>
+      </w:r>
+    </w:p>
+    <w:p>
+      <w:pPr>
+        <w:rPr>
+          <w:noProof/>
+        </w:rPr>
+      </w:pPr>
+    </w:p>
+    <w:p>
+      <w:pPr>
+        <w:rPr>
+          <w:noProof/>
+        </w:rPr>
+      </w:pPr>
+    </w:p>
+    <w:p>
+      <w:pPr>
+        <w:rPr>
+          <w:noProof/>
+        </w:rPr>
+      </w:pPr>
+      <w:r>
+        <w:rPr>
+          <w:noProof/>
+        </w:rPr>
+        <w:drawing>
+          <wp:inline distT="0" distB="0" distL="0" distR="0" wp14:anchorId="363A2C66" wp14:editId="0B7BF8ED">
+            <wp:extent cx="2644140" cy="2964180"/>
+            <wp:effectExtent l="0" t="0" r="3810" b="7620"/>
+            <wp:docPr id="1757807839" name="Picture 1"/>
+            <wp:cNvGraphicFramePr>
+              <a:graphicFrameLocks xmlns:a="http://schemas.openxmlformats.org/drawingml/2006/main" noChangeAspect="1"/>
+            </wp:cNvGraphicFramePr>
+            <a:graphic xmlns:a="http://schemas.openxmlformats.org/drawingml/2006/main">
+              <a:graphicData uri="http://schemas.openxmlformats.org/drawingml/2006/picture">
+                <pic:pic xmlns:pic="http://schemas.openxmlformats.org/drawingml/2006/picture">
+                  <pic:nvPicPr>
+                    <pic:cNvPr id="1757807839" name=""/>
+                    <pic:cNvPicPr/>
+                  </pic:nvPicPr>
+                  <pic:blipFill rotWithShape="1">
+                    <a:blip r:embed="rId16"/>
+                    <a:srcRect l="26989" t="-1655" r="26878" b="9711"/>
+                    <a:stretch/>
+                  </pic:blipFill>
+                  <pic:spPr bwMode="auto">
+                    <a:xfrm>
+                      <a:off x="0" y="0"/>
+                      <a:ext cx="2644140" cy="2964180"/>
+                    </a:xfrm>
+                    <a:prstGeom prst="rect">
+                      <a:avLst/>
+                    </a:prstGeom>
+                    <a:ln>
+                      <a:noFill/>
+                    </a:ln>
+                    <a:extLst>
+                      <a:ext uri="{53640926-AAD7-44D8-BBD7-CCE9431645EC}">
+                        <a14:shadowObscured xmlns:a14="http://schemas.microsoft.com/office/drawing/2010/main"/>
+                      </a:ext>
+                    </a:extLst>
+                  </pic:spPr>
+                </pic:pic>
+              </a:graphicData>
+            </a:graphic>
+          </wp:inline>
+        </w:drawing>
+      </w:r>
+      <w:r>
+        <w:rPr>
+          <w:noProof/>
+        </w:rPr>
+        <w:t xml:space="preserve">          </w:t>
+      </w:r>
+      <w:r>
+        <w:rPr>
+          <w:noProof/>
+        </w:rPr>
+        <w:drawing>
+          <wp:inline distT="0" distB="0" distL="0" distR="0" wp14:anchorId="0E5DA184" wp14:editId="3909F415">
+            <wp:extent cx="2717800" cy="2971800"/>
+            <wp:effectExtent l="0" t="0" r="6350" b="0"/>
+            <wp:docPr id="1131541131" name="Picture 1"/>
+            <wp:cNvGraphicFramePr>
+              <a:graphicFrameLocks xmlns:a="http://schemas.openxmlformats.org/drawingml/2006/main" noChangeAspect="1"/>
+            </wp:cNvGraphicFramePr>
+            <a:graphic xmlns:a="http://schemas.openxmlformats.org/drawingml/2006/main">
+              <a:graphicData uri="http://schemas.openxmlformats.org/drawingml/2006/picture">
+                <pic:pic xmlns:pic="http://schemas.openxmlformats.org/drawingml/2006/picture">
+                  <pic:nvPicPr>
+                    <pic:cNvPr id="1131541131" name=""/>
+                    <pic:cNvPicPr/>
+                  </pic:nvPicPr>
+                  <pic:blipFill rotWithShape="1">
+                    <a:blip r:embed="rId17"/>
+                    <a:srcRect l="27033" t="-1576" r="25549" b="9395"/>
+                    <a:stretch/>
+                  </pic:blipFill>
+                  <pic:spPr bwMode="auto">
+                    <a:xfrm>
+                      <a:off x="0" y="0"/>
+                      <a:ext cx="2717800" cy="2971800"/>
+                    </a:xfrm>
+                    <a:prstGeom prst="rect">
+                      <a:avLst/>
+                    </a:prstGeom>
+                    <a:ln>
+                      <a:noFill/>
+                    </a:ln>
+                    <a:extLst>
+                      <a:ext uri="{53640926-AAD7-44D8-BBD7-CCE9431645EC}">
+                        <a14:shadowObscured xmlns:a14="http://schemas.microsoft.com/office/drawing/2010/main"/>
+                      </a:ext>
+                    </a:extLst>
+                  </pic:spPr>
+                </pic:pic>
+              </a:graphicData>
+            </a:graphic>
+          </wp:inline>
+        </w:drawing>
+      </w:r>
+    </w:p>
+    <w:p>
+      <w:pPr>
+        <w:rPr>
+          <w:noProof/>
+        </w:rPr>
+      </w:pPr>
+    </w:p>
+    <w:p>
+      <w:pPr>
+        <w:rPr>
+          <w:noProof/>
+        </w:rPr>
+      </w:pPr>
+      <w:r>
+        <w:rPr>
+          <w:noProof/>
+        </w:rPr>
+        <w:lastRenderedPageBreak/>
+        <mc:AlternateContent>
+          <mc:Choice Requires="wps">
+            <w:drawing>
+              <wp:anchor distT="0" distB="0" distL="114300" distR="114300" simplePos="0" relativeHeight="251685888" behindDoc="0" locked="0" layoutInCell="1" allowOverlap="1" wp14:anchorId="205D9F91" wp14:editId="1BA78D19">
+                <wp:simplePos x="0" y="0"/>
+                <wp:positionH relativeFrom="margin">
+                  <wp:posOffset>-8467</wp:posOffset>
+                </wp:positionH>
+                <wp:positionV relativeFrom="paragraph">
+                  <wp:posOffset>195157</wp:posOffset>
+                </wp:positionV>
+                <wp:extent cx="2709333" cy="787400"/>
+                <wp:effectExtent l="0" t="0" r="15240" b="12700"/>
+                <wp:wrapNone/>
+                <wp:docPr id="174787753" name="Text Box 3"/>
+                <wp:cNvGraphicFramePr/>
+                <a:graphic xmlns:a="http://schemas.openxmlformats.org/drawingml/2006/main">
+                  <a:graphicData uri="http://schemas.microsoft.com/office/word/2010/wordprocessingShape">
+                    <wps:wsp>
+                      <wps:cNvSpPr txBox="1"/>
+                      <wps:spPr>
+                        <a:xfrm>
+                          <a:off x="0" y="0"/>
+                          <a:ext cx="2709333" cy="787400"/>
+                        </a:xfrm>
+                        <a:prstGeom prst="rect">
+                          <a:avLst/>
+                        </a:prstGeom>
+                        <a:solidFill>
+                          <a:schemeClr val="lt1"/>
+                        </a:solidFill>
+                        <a:ln w="6350">
+                          <a:solidFill>
+                            <a:prstClr val="black"/>
+                          </a:solidFill>
+                        </a:ln>
+                      </wps:spPr>
+                      <wps:txbx>
+                        <w:txbxContent>
+                          <w:p>
+                            <w:pPr>
+                              <w:rPr>
+                                <w:noProof/>
+                              </w:rPr>
+                            </w:pPr>
+                            <w:r>
+                              <w:rPr>
+                                <w:noProof/>
+                              </w:rPr>
+                              <w:t>Relationship between Dim_</w:t>
+                            </w:r>
+                            <w:r>
+                              <w:rPr>
+                                <w:noProof/>
+                              </w:rPr>
+                              <w:t>Diagnosis</w:t>
+                            </w:r>
+                            <w:r>
+                              <w:rPr>
+                                <w:noProof/>
+                              </w:rPr>
+                              <w:t xml:space="preserve"> and Fact_Encounter is one-to-many because </w:t>
+                            </w:r>
+                            <w:r>
+                              <w:rPr>
+                                <w:noProof/>
+                              </w:rPr>
+                              <w:t>diagnosis profiles are resued aross</w:t>
+                            </w:r>
+                            <w:r>
+                              <w:rPr>
+                                <w:noProof/>
+                              </w:rPr>
+                              <w:t xml:space="preserve"> encounters.</w:t>
+                            </w:r>
+                          </w:p>
+                          <w:p>
+                            <w:pPr>
+                              <w:rPr>
+                                <w:lang w:val="en-US"/>
+                              </w:rPr>
+                            </w:pPr>
+                          </w:p>
+                        </w:txbxContent>
+                      </wps:txbx>
+                      <wps:bodyPr rot="0" spcFirstLastPara="0" vertOverflow="overflow" horzOverflow="overflow" vert="horz" wrap="square" lIns="91440" tIns="45720" rIns="91440" bIns="45720" numCol="1" spcCol="0" rtlCol="0" fromWordArt="0" anchor="t" anchorCtr="0" forceAA="0" compatLnSpc="1">
+                        <a:prstTxWarp prst="textNoShape">
+                          <a:avLst/>
+                        </a:prstTxWarp>
+                        <a:noAutofit/>
+                      </wps:bodyPr>
+                    </wps:wsp>
+                  </a:graphicData>
+                </a:graphic>
+                <wp14:sizeRelH relativeFrom="margin">
+                  <wp14:pctWidth>0</wp14:pctWidth>
+                </wp14:sizeRelH>
+                <wp14:sizeRelV relativeFrom="margin">
+                  <wp14:pctHeight>0</wp14:pctHeight>
+                </wp14:sizeRelV>
+              </wp:anchor>
+            </w:drawing>
+          </mc:Choice>
+          <mc:Fallback>
+            <w:pict>
+              <v:shape w14:anchorId="205D9F91" id="_x0000_s1040" type="#_x0000_t202" style="position:absolute;margin-left:-.65pt;margin-top:15.35pt;width:213.35pt;height:62pt;z-index:251685888;visibility:visible;mso-wrap-style:square;mso-width-percent:0;mso-height-percent:0;mso-wrap-distance-left:9pt;mso-wrap-distance-top:0;mso-wrap-distance-right:9pt;mso-wrap-distance-bottom:0;mso-position-horizontal:absolute;mso-position-horizontal-relative:margin;mso-position-vertical:absolute;mso-position-vertical-relative:text;mso-width-percent:0;mso-height-percent:0;mso-width-relative:margin;mso-height-relative:margin;v-text-anchor:top" o:gfxdata="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" fillcolor="white [3201]" strokeweight=".5pt">
+                <v:textbox>
+                  <w:txbxContent>
+                    <w:p>
+                      <w:pPr>
+                        <w:rPr>
+                          <w:noProof/>
+                        </w:rPr>
+                      </w:pPr>
+                      <w:r>
+                        <w:rPr>
+                          <w:noProof/>
+                        </w:rPr>
+                        <w:t>Relationship between Dim_</w:t>
+                      </w:r>
+                      <w:r>
+                        <w:rPr>
+                          <w:noProof/>
+                        </w:rPr>
+                        <w:t>Diagnosis</w:t>
+                      </w:r>
+                      <w:r>
+                        <w:rPr>
+                          <w:noProof/>
+                        </w:rPr>
+                        <w:t xml:space="preserve"> and Fact_Encounter is one-to-many because </w:t>
+                      </w:r>
+                      <w:r>
+                        <w:rPr>
+                          <w:noProof/>
+                        </w:rPr>
+                        <w:t>diagnosis profiles are resued aross</w:t>
+                      </w:r>
+                      <w:r>
+                        <w:rPr>
+                          <w:noProof/>
+                        </w:rPr>
+                        <w:t xml:space="preserve"> encounters.</w:t>
+                      </w:r>
+                    </w:p>
+                    <w:p>
+                      <w:pPr>
+                        <w:rPr>
+                          <w:lang w:val="en-US"/>
+                        </w:rPr>
+                      </w:pPr>
+                    </w:p>
+                  </w:txbxContent>
+                </v:textbox>
+                <w10:wrap anchorx="margin"/>
+              </v:shape>
+            </w:pict>
+          </mc:Fallback>
+        </mc:AlternateContent>
+      </w:r>
+    </w:p>
+    <w:p>
+      <w:pPr>
+        <w:rPr>
+          <w:noProof/>
+        </w:rPr>
+      </w:pPr>
+    </w:p>
+    <w:p>
+      <w:pPr>
+        <w:rPr>
+          <w:b/>
+          <w:bCs/>
+          <w:noProof/>
+        </w:rPr>
+      </w:pPr>
+    </w:p>
+    <w:p>
+      <w:pPr>
+        <w:rPr>
+          <w:b/>
+          <w:bCs/>
+          <w:noProof/>
+        </w:rPr>
+      </w:pPr>
+    </w:p>
+    <w:p>
+      <w:pPr>
+        <w:rPr>
+          <w:noProof/>
+        </w:rPr>
+      </w:pPr>
+      <w:r>
+        <w:rPr>
+          <w:noProof/>
+        </w:rPr>
+        <w:drawing>
+          <wp:inline distT="0" distB="0" distL="0" distR="0" wp14:anchorId="11E2CCAA" wp14:editId="4A51B70D">
+            <wp:extent cx="2599267" cy="2997200"/>
+            <wp:effectExtent l="0" t="0" r="0" b="0"/>
+            <wp:docPr id="647312313" name="Picture 1"/>
+            <wp:cNvGraphicFramePr>
+              <a:graphicFrameLocks xmlns:a="http://schemas.openxmlformats.org/drawingml/2006/main" noChangeAspect="1"/>
+            </wp:cNvGraphicFramePr>
+            <a:graphic xmlns:a="http://schemas.openxmlformats.org/drawingml/2006/main">
+              <a:graphicData uri="http://schemas.openxmlformats.org/drawingml/2006/picture">
+                <pic:pic xmlns:pic="http://schemas.openxmlformats.org/drawingml/2006/picture">
+                  <pic:nvPicPr>
+                    <pic:cNvPr id="647312313" name=""/>
+                    <pic:cNvPicPr/>
+                  </pic:nvPicPr>
+                  <pic:blipFill rotWithShape="1">
+                    <a:blip r:embed="rId18"/>
+                    <a:srcRect l="53623" t="1313" r="1023" b="5713"/>
+                    <a:stretch/>
+                  </pic:blipFill>
+                  <pic:spPr bwMode="auto">
+                    <a:xfrm>
+                      <a:off x="0" y="0"/>
+                      <a:ext cx="2599440" cy="2997400"/>
+                    </a:xfrm>
+                    <a:prstGeom prst="rect">
+                      <a:avLst/>
+                    </a:prstGeom>
+                    <a:ln>
+                      <a:noFill/>
+                    </a:ln>
+                    <a:extLst>
+                      <a:ext uri="{53640926-AAD7-44D8-BBD7-CCE9431645EC}">
+                        <a14:shadowObscured xmlns:a14="http://schemas.microsoft.com/office/drawing/2010/main"/>
+                      </a:ext>
+                    </a:extLst>
+                  </pic:spPr>
+                </pic:pic>
+              </a:graphicData>
+            </a:graphic>
+          </wp:inline>
+        </w:drawing>
+      </w:r>
+    </w:p>
+    <w:p>
+      <w:pPr>
+        <w:rPr>
+          <w:noProof/>
+        </w:rPr>
+      </w:pPr>
+      <w:r>
+        <w:rPr>
+          <w:noProof/>
+        </w:rPr>
+        <mc:AlternateContent>
+          <mc:Choice Requires="wps">
+            <w:drawing>
+              <wp:anchor distT="0" distB="0" distL="114300" distR="114300" simplePos="0" relativeHeight="251687936" behindDoc="0" locked="0" layoutInCell="1" allowOverlap="1" wp14:anchorId="0873DAA9" wp14:editId="1B6B5FDA">
+                <wp:simplePos x="0" y="0"/>
+                <wp:positionH relativeFrom="margin">
+                  <wp:align>right</wp:align>
+                </wp:positionH>
+                <wp:positionV relativeFrom="paragraph">
+                  <wp:posOffset>92498</wp:posOffset>
+                </wp:positionV>
+                <wp:extent cx="5715000" cy="1295400"/>
+                <wp:effectExtent l="0" t="0" r="19050" b="19050"/>
+                <wp:wrapNone/>
+                <wp:docPr id="624386473" name="Text Box 3"/>
+                <wp:cNvGraphicFramePr/>
+                <a:graphic xmlns:a="http://schemas.openxmlformats.org/drawingml/2006/main">
+                  <a:graphicData uri="http://schemas.microsoft.com/office/word/2010/wordprocessingShape">
+                    <wps:wsp>
+                      <wps:cNvSpPr txBox="1"/>
+                      <wps:spPr>
+                        <a:xfrm>
+                          <a:off x="0" y="0"/>
+                          <a:ext cx="5715000" cy="1295400"/>
+                        </a:xfrm>
+                        <a:prstGeom prst="rect">
+                          <a:avLst/>
+                        </a:prstGeom>
+                        <a:solidFill>
+                          <a:schemeClr val="lt1"/>
+                        </a:solidFill>
+                        <a:ln w="6350">
+                          <a:solidFill>
+                            <a:prstClr val="black"/>
+                          </a:solidFill>
+                        </a:ln>
+                      </wps:spPr>
+                      <wps:txbx>
+                        <w:txbxContent>
+                          <w:p>
+                            <w:pPr>
+                              <w:rPr>
+                                <w:noProof/>
+                                <w:lang w:val="en-US"/>
+                              </w:rPr>
+                            </w:pPr>
+                            <w:r>
+                              <w:rPr>
+                                <w:noProof/>
+                                <w:lang w:val="en-US"/>
+                              </w:rPr>
+                              <w:t xml:space="preserve">‘diabetes_data’ contains multiple medication columns per row whereas ‘Dim_Medication’ contains one medication per row. There grains do no match this can’t relate them directly. To create a relationship between these two tables a bridge table (Brirdge_Medication) was created. </w:t>
+                            </w:r>
+                          </w:p>
+                          <w:p>
+                            <w:pPr>
+                              <w:rPr>
+                                <w:lang w:val="en-US"/>
+                              </w:rPr>
+                            </w:pPr>
+                            <w:r>
+                              <w:rPr>
+                                <w:lang w:val="en-US"/>
+                              </w:rPr>
+                              <w:t xml:space="preserve">Fact_Encounter has a one-to-many relationship with Bridge_Medication (left screenshot). </w:t>
+                            </w:r>
+                            <w:r>
+                              <w:rPr>
+                                <w:lang w:val="en-US"/>
+                              </w:rPr>
+                              <w:t>Dim_Medication has a one-to-many relationship with Bridge_Medication (right screenshot).</w:t>
+                            </w:r>
+                          </w:p>
+                        </w:txbxContent>
+                      </wps:txbx>
+                      <wps:bodyPr rot="0" spcFirstLastPara="0" vertOverflow="overflow" horzOverflow="overflow" vert="horz" wrap="square" lIns="91440" tIns="45720" rIns="91440" bIns="45720" numCol="1" spcCol="0" rtlCol="0" fromWordArt="0" anchor="t" anchorCtr="0" forceAA="0" compatLnSpc="1">
+                        <a:prstTxWarp prst="textNoShape">
+                          <a:avLst/>
+                        </a:prstTxWarp>
+                        <a:noAutofit/>
+                      </wps:bodyPr>
+                    </wps:wsp>
+                  </a:graphicData>
+                </a:graphic>
+                <wp14:sizeRelH relativeFrom="margin">
+                  <wp14:pctWidth>0</wp14:pctWidth>
+                </wp14:sizeRelH>
+                <wp14:sizeRelV relativeFrom="margin">
+                  <wp14:pctHeight>0</wp14:pctHeight>
+                </wp14:sizeRelV>
+              </wp:anchor>
+            </w:drawing>
+          </mc:Choice>
+          <mc:Fallback>
+            <w:pict>
+              <v:shape w14:anchorId="0873DAA9" id="_x0000_s1041" type="#_x0000_t202" style="position:absolute;margin-left:398.8pt;margin-top:7.3pt;width:450pt;height:102pt;z-index:251687936;visibility:visible;mso-wrap-style:square;mso-width-percent:0;mso-height-percent:0;mso-wrap-distance-left:9pt;mso-wrap-distance-top:0;mso-wrap-distance-right:9pt;mso-wrap-distance-bottom:0;mso-position-horizontal:right;mso-position-horizontal-relative:margin;mso-position-vertical:absolute;mso-position-vertical-relative:text;mso-width-percent:0;mso-height-percent:0;mso-width-relative:margin;mso-height-relative:margin;v-text-anchor:top" o:gfxdata="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" fillcolor="white [3201]" strokeweight=".5pt">
+                <v:textbox>
+                  <w:txbxContent>
+                    <w:p>
+                      <w:pPr>
+                        <w:rPr>
+                          <w:noProof/>
+                          <w:lang w:val="en-US"/>
+                        </w:rPr>
+                      </w:pPr>
+                      <w:r>
+                        <w:rPr>
+                          <w:noProof/>
+                          <w:lang w:val="en-US"/>
+                        </w:rPr>
+                        <w:t xml:space="preserve">‘diabetes_data’ contains multiple medication columns per row whereas ‘Dim_Medication’ contains one medication per row. There grains do no match this can’t relate them directly. To create a relationship between these two tables a bridge table (Brirdge_Medication) was created. </w:t>
+                      </w:r>
+                    </w:p>
+                    <w:p>
+                      <w:pPr>
+                        <w:rPr>
+                          <w:lang w:val="en-US"/>
+                        </w:rPr>
+                      </w:pPr>
+                      <w:r>
+                        <w:rPr>
+                          <w:lang w:val="en-US"/>
+                        </w:rPr>
+                        <w:t xml:space="preserve">Fact_Encounter has a one-to-many relationship with Bridge_Medication (left screenshot). </w:t>
+                      </w:r>
+                      <w:r>
+                        <w:rPr>
+                          <w:lang w:val="en-US"/>
+                        </w:rPr>
+                        <w:t>Dim_Medication has a one-to-many relationship with Bridge_Medication (right screenshot).</w:t>
+                      </w:r>
+                    </w:p>
+                  </w:txbxContent>
+                </v:textbox>
+                <w10:wrap anchorx="margin"/>
+              </v:shape>
+            </w:pict>
+          </mc:Fallback>
+        </mc:AlternateContent>
+      </w:r>
+    </w:p>
+    <w:p>
+      <w:pPr>
+        <w:rPr>
+          <w:noProof/>
+        </w:rPr>
+      </w:pPr>
+    </w:p>
+    <w:p>
+      <w:pPr>
+        <w:rPr>
+          <w:noProof/>
+        </w:rPr>
+      </w:pPr>
+    </w:p>
+    <w:p>
+      <w:pPr>
+        <w:rPr>
+          <w:noProof/>
+        </w:rPr>
+      </w:pPr>
+    </w:p>
+    <w:p>
+      <w:pPr>
+        <w:rPr>
+          <w:noProof/>
+        </w:rPr>
+      </w:pPr>
+    </w:p>
+    <w:p>
+      <w:pPr>
+        <w:rPr>
+          <w:noProof/>
+        </w:rPr>
+      </w:pPr>
+      <w:r>
+        <w:rPr>
+          <w:noProof/>
+        </w:rPr>
+        <w:drawing>
+          <wp:inline distT="0" distB="0" distL="0" distR="0" wp14:anchorId="11C33BEA" wp14:editId="3942B56F">
+            <wp:extent cx="2531533" cy="2912533"/>
+            <wp:effectExtent l="0" t="0" r="2540" b="2540"/>
+            <wp:docPr id="1630536562" name="Picture 1"/>
+            <wp:cNvGraphicFramePr>
+              <a:graphicFrameLocks xmlns:a="http://schemas.openxmlformats.org/drawingml/2006/main" noChangeAspect="1"/>
+            </wp:cNvGraphicFramePr>
+            <a:graphic xmlns:a="http://schemas.openxmlformats.org/drawingml/2006/main">
+              <a:graphicData uri="http://schemas.openxmlformats.org/drawingml/2006/picture">
+                <pic:pic xmlns:pic="http://schemas.openxmlformats.org/drawingml/2006/picture">
+                  <pic:nvPicPr>
+                    <pic:cNvPr id="1630536562" name=""/>
+                    <pic:cNvPicPr/>
+                  </pic:nvPicPr>
+                  <pic:blipFill rotWithShape="1">
+                    <a:blip r:embed="rId19"/>
+                    <a:srcRect l="27772" t="1314" r="28056" b="8339"/>
+                    <a:stretch/>
+                  </pic:blipFill>
+                  <pic:spPr bwMode="auto">
+                    <a:xfrm>
+                      <a:off x="0" y="0"/>
+                      <a:ext cx="2531702" cy="2912727"/>
+                    </a:xfrm>
+                    <a:prstGeom prst="rect">
+                      <a:avLst/>
+                    </a:prstGeom>
+                    <a:ln>
+                      <a:noFill/>
+                    </a:ln>
+                    <a:extLst>
+                      <a:ext uri="{53640926-AAD7-44D8-BBD7-CCE9431645EC}">
+                        <a14:shadowObscured xmlns:a14="http://schemas.microsoft.com/office/drawing/2010/main"/>
+                      </a:ext>
+                    </a:extLst>
+                  </pic:spPr>
+                </pic:pic>
+              </a:graphicData>
+            </a:graphic>
+          </wp:inline>
+        </w:drawing>
+      </w:r>
+      <w:r>
+        <w:rPr>
+          <w:noProof/>
+        </w:rPr>
+        <w:t xml:space="preserve">                           </w:t>
+      </w:r>
+      <w:r>
+        <w:rPr>
+          <w:noProof/>
+        </w:rPr>
+        <w:drawing>
+          <wp:inline distT="0" distB="0" distL="0" distR="0" wp14:anchorId="7B3B6CA6" wp14:editId="31C422F4">
+            <wp:extent cx="1465028" cy="2682240"/>
+            <wp:effectExtent l="0" t="0" r="1905" b="3810"/>
+            <wp:docPr id="95544466" name="Picture 1"/>
+            <wp:cNvGraphicFramePr>
+              <a:graphicFrameLocks xmlns:a="http://schemas.openxmlformats.org/drawingml/2006/main" noChangeAspect="1"/>
+            </wp:cNvGraphicFramePr>
+            <a:graphic xmlns:a="http://schemas.openxmlformats.org/drawingml/2006/main">
+              <a:graphicData uri="http://schemas.openxmlformats.org/drawingml/2006/picture">
+                <pic:pic xmlns:pic="http://schemas.openxmlformats.org/drawingml/2006/picture">
+                  <pic:nvPicPr>
+                    <pic:cNvPr id="95544466" name=""/>
+                    <pic:cNvPicPr/>
+                  </pic:nvPicPr>
+                  <pic:blipFill rotWithShape="1">
+                    <a:blip r:embed="rId20"/>
+                    <a:srcRect l="35158" t="-263" r="35146" b="3607"/>
+                    <a:stretch/>
+                  </pic:blipFill>
+                  <pic:spPr bwMode="auto">
+                    <a:xfrm>
+                      <a:off x="0" y="0"/>
+                      <a:ext cx="1476875" cy="2703929"/>
+                    </a:xfrm>
+                    <a:prstGeom prst="rect">
+                      <a:avLst/>
+                    </a:prstGeom>
+                    <a:ln>
+                      <a:noFill/>
+                    </a:ln>
+                    <a:extLst>
+                      <a:ext uri="{53640926-AAD7-44D8-BBD7-CCE9431645EC}">
+                        <a14:shadowObscured xmlns:a14="http://schemas.microsoft.com/office/drawing/2010/main"/>
+                      </a:ext>
+                    </a:extLst>
+                  </pic:spPr>
+                </pic:pic>
+              </a:graphicData>
+            </a:graphic>
+          </wp:inline>
+        </w:drawing>
+      </w:r>
+    </w:p>
+    <w:p>
+      <w:pPr>
+        <w:rPr>
+          <w:b/>
+          <w:bCs/>
+          <w:noProof/>
+        </w:rPr>
+      </w:pPr>
+      <w:r>
+        <w:rPr>
+          <w:b/>
+          <w:bCs/>
+          <w:noProof/>
+        </w:rPr>
+        <w:lastRenderedPageBreak/>
+        <w:t>Model View</w:t>
+      </w:r>
+      <w:r>
+        <w:rPr>
+          <w:b/>
+          <w:bCs/>
+          <w:noProof/>
+        </w:rPr>
+        <w:t xml:space="preserve"> screehshot</w:t>
+      </w:r>
+      <w:r>
+        <w:rPr>
+          <w:b/>
+          <w:bCs/>
+          <w:noProof/>
+        </w:rPr>
+        <w:t>:</w:t>
+      </w:r>
+    </w:p>
+    <w:p>
+      <w:pPr>
+        <w:rPr>
+          <w:noProof/>
+        </w:rPr>
+      </w:pPr>
+      <w:r>
+        <w:rPr>
+          <w:noProof/>
+        </w:rPr>
+        <w:drawing>
+          <wp:inline distT="0" distB="0" distL="0" distR="0" wp14:anchorId="7D71AB4C" wp14:editId="623737D6">
+            <wp:extent cx="5983856" cy="2768600"/>
+            <wp:effectExtent l="0" t="0" r="0" b="0"/>
+            <wp:docPr id="443531601" name="Picture 1"/>
+            <wp:cNvGraphicFramePr>
+              <a:graphicFrameLocks xmlns:a="http://schemas.openxmlformats.org/drawingml/2006/main" noChangeAspect="1"/>
+            </wp:cNvGraphicFramePr>
+            <a:graphic xmlns:a="http://schemas.openxmlformats.org/drawingml/2006/main">
+              <a:graphicData uri="http://schemas.openxmlformats.org/drawingml/2006/picture">
+                <pic:pic xmlns:pic="http://schemas.openxmlformats.org/drawingml/2006/picture">
+                  <pic:nvPicPr>
+                    <pic:cNvPr id="443531601" name=""/>
+                    <pic:cNvPicPr/>
+                  </pic:nvPicPr>
+                  <pic:blipFill rotWithShape="1">
+                    <a:blip r:embed="rId21"/>
+                    <a:srcRect l="1330" t="17334" r="6935" b="10445"/>
+                    <a:stretch/>
+                  </pic:blipFill>
+                  <pic:spPr bwMode="auto">
+                    <a:xfrm>
+                      <a:off x="0" y="0"/>
+                      <a:ext cx="6008382" cy="2779948"/>
+                    </a:xfrm>
+                    <a:prstGeom prst="rect">
+                      <a:avLst/>
+                    </a:prstGeom>
+                    <a:ln>
+                      <a:noFill/>
+                    </a:ln>
+                    <a:extLst>
+                      <a:ext uri="{53640926-AAD7-44D8-BBD7-CCE9431645EC}">
+                        <a14:shadowObscured xmlns:a14="http://schemas.microsoft.com/office/drawing/2010/main"/>
+                      </a:ext>
+                    </a:extLst>
+                  </pic:spPr>
+                </pic:pic>
+              </a:graphicData>
+            </a:graphic>
+          </wp:inline>
+        </w:drawing>
+      </w:r>
     </w:p>
     <w:p>
       <w:pPr>

</xml_diff>